<commit_message>
fix: TPO report fix
</commit_message>
<xml_diff>
--- a/ТПО/Лаб3/Ястребов-Амирханов_Карандашева_ТПО_3.docx
+++ b/ТПО/Лаб3/Ястребов-Амирханов_Карандашева_ТПО_3.docx
@@ -5544,15 +5544,7 @@
                 <w:szCs w:val="24"/>
                 <w:lang w:val="ru-RU"/>
               </w:rPr>
-              <w:t>1234</w:t>
-            </w:r>
-            <w:r>
-              <w:rPr>
-                <w:rFonts w:eastAsia="Times New Roman" w:cs="Times New Roman"/>
-                <w:szCs w:val="24"/>
-                <w:lang w:val="ru-RU"/>
-              </w:rPr>
-              <w:t>)</w:t>
+              <w:t>1234)</w:t>
             </w:r>
             <w:r>
               <w:rPr>
@@ -7484,23 +7476,7 @@
                 <w:szCs w:val="24"/>
                 <w:lang w:val="ru-RU"/>
               </w:rPr>
-              <w:t>уменьшиться</w:t>
-            </w:r>
-            <w:r>
-              <w:rPr>
-                <w:rFonts w:eastAsia="Times New Roman" w:cs="Times New Roman"/>
-                <w:szCs w:val="24"/>
-                <w:lang w:val="ru-RU"/>
-              </w:rPr>
-              <w:t xml:space="preserve"> на один</w:t>
-            </w:r>
-            <w:r>
-              <w:rPr>
-                <w:rFonts w:eastAsia="Times New Roman" w:cs="Times New Roman"/>
-                <w:szCs w:val="24"/>
-                <w:lang w:val="ru-RU"/>
-              </w:rPr>
-              <w:t xml:space="preserve"> (вернется к количеству, которое было в предусловии в </w:t>
+              <w:t xml:space="preserve">уменьшиться на один (вернется к количеству, которое было в предусловии в </w:t>
             </w:r>
             <w:r>
               <w:rPr>
@@ -7585,15 +7561,7 @@
                 <w:szCs w:val="24"/>
                 <w:lang w:val="ru-RU"/>
               </w:rPr>
-              <w:t>НЕ</w:t>
-            </w:r>
-            <w:r>
-              <w:rPr>
-                <w:rFonts w:eastAsia="Times New Roman" w:cs="Times New Roman"/>
-                <w:szCs w:val="24"/>
-                <w:lang w:val="ru-RU"/>
-              </w:rPr>
-              <w:t>авторизованного</w:t>
+              <w:t>НЕавторизованного</w:t>
             </w:r>
             <w:proofErr w:type="spellEnd"/>
             <w:r>
@@ -7635,15 +7603,7 @@
                 <w:szCs w:val="24"/>
                 <w:lang w:val="ru-RU"/>
               </w:rPr>
-              <w:t xml:space="preserve">, </w:t>
-            </w:r>
-            <w:r>
-              <w:rPr>
-                <w:rFonts w:eastAsia="Times New Roman" w:cs="Times New Roman"/>
-                <w:szCs w:val="24"/>
-                <w:lang w:val="ru-RU"/>
-              </w:rPr>
-              <w:t>находится</w:t>
+              <w:t>, находится</w:t>
             </w:r>
             <w:r>
               <w:rPr>
@@ -8057,15 +8017,7 @@
                 <w:szCs w:val="24"/>
                 <w:lang w:val="ru-RU"/>
               </w:rPr>
-              <w:t>*</w:t>
-            </w:r>
-            <w:r>
-              <w:rPr>
-                <w:rFonts w:eastAsia="Times New Roman" w:cs="Times New Roman"/>
-                <w:szCs w:val="24"/>
-                <w:lang w:val="ru-RU"/>
-              </w:rPr>
-              <w:t>)</w:t>
+              <w:t>*)</w:t>
             </w:r>
             <w:r>
               <w:rPr>
@@ -8785,15 +8737,7 @@
                 <w:szCs w:val="24"/>
                 <w:lang w:val="ru-RU"/>
               </w:rPr>
-              <w:t xml:space="preserve">3. </w:t>
-            </w:r>
-            <w:r>
-              <w:rPr>
-                <w:rFonts w:eastAsia="Times New Roman" w:cs="Times New Roman"/>
-                <w:szCs w:val="24"/>
-                <w:lang w:val="ru-RU"/>
-              </w:rPr>
-              <w:t>При нажатии на «</w:t>
+              <w:t>3. При нажатии на «</w:t>
             </w:r>
             <w:hyperlink r:id="rId16" w:anchor="signup" w:history="1">
               <w:r>
@@ -8819,15 +8763,7 @@
                 <w:szCs w:val="24"/>
                 <w:lang w:val="ru-RU"/>
               </w:rPr>
-              <w:t xml:space="preserve">», открывается окно </w:t>
-            </w:r>
-            <w:r>
-              <w:rPr>
-                <w:rFonts w:eastAsia="Times New Roman" w:cs="Times New Roman"/>
-                <w:szCs w:val="24"/>
-                <w:lang w:val="ru-RU"/>
-              </w:rPr>
-              <w:t>входа</w:t>
+              <w:t>», открывается окно входа</w:t>
             </w:r>
           </w:p>
         </w:tc>
@@ -9208,25 +9144,7 @@
                   <w:szCs w:val="24"/>
                   <w:lang w:val="ru-RU"/>
                 </w:rPr>
-                <w:t>ссы</w:t>
-              </w:r>
-              <w:r>
-                <w:rPr>
-                  <w:rStyle w:val="a8"/>
-                  <w:rFonts w:eastAsia="Times New Roman" w:cs="Times New Roman"/>
-                  <w:szCs w:val="24"/>
-                  <w:lang w:val="ru-RU"/>
-                </w:rPr>
-                <w:t>л</w:t>
-              </w:r>
-              <w:r>
-                <w:rPr>
-                  <w:rStyle w:val="a8"/>
-                  <w:rFonts w:eastAsia="Times New Roman" w:cs="Times New Roman"/>
-                  <w:szCs w:val="24"/>
-                  <w:lang w:val="ru-RU"/>
-                </w:rPr>
-                <w:t>ка</w:t>
+                <w:t>ссылка</w:t>
               </w:r>
             </w:hyperlink>
           </w:p>
@@ -9347,15 +9265,7 @@
                 <w:szCs w:val="24"/>
                 <w:lang w:val="ru-RU"/>
               </w:rPr>
-              <w:t xml:space="preserve"> поиска в верхней части страницы.</w:t>
-            </w:r>
-            <w:r>
-              <w:rPr>
-                <w:rFonts w:eastAsia="Times New Roman" w:cs="Times New Roman"/>
-                <w:szCs w:val="24"/>
-                <w:lang w:val="ru-RU"/>
-              </w:rPr>
-              <w:t xml:space="preserve"> </w:t>
+              <w:t xml:space="preserve"> поиска в верхней части страницы. </w:t>
             </w:r>
           </w:p>
           <w:p>
@@ -10438,6 +10348,7 @@
               <w:rPr>
                 <w:rFonts w:eastAsia="Times New Roman" w:cs="Times New Roman"/>
                 <w:szCs w:val="24"/>
+                <w:lang w:val="ru-RU"/>
               </w:rPr>
             </w:pPr>
             <w:r>
@@ -11562,20 +11473,7 @@
                 <w:szCs w:val="24"/>
               </w:rPr>
               <w:br/>
-            </w:r>
-            <w:r>
-              <w:rPr>
-                <w:rFonts w:eastAsia="Times New Roman" w:cs="Times New Roman"/>
-                <w:szCs w:val="24"/>
-              </w:rPr>
-              <w:t xml:space="preserve">email </w:t>
-            </w:r>
-            <w:r>
-              <w:rPr>
-                <w:rFonts w:eastAsia="Times New Roman" w:cs="Times New Roman"/>
-                <w:szCs w:val="24"/>
-              </w:rPr>
-              <w:t>–</w:t>
+              <w:t>email –</w:t>
             </w:r>
           </w:p>
           <w:p>
@@ -11592,14 +11490,7 @@
                 <w:rFonts w:eastAsia="Times New Roman" w:cs="Times New Roman"/>
                 <w:szCs w:val="24"/>
               </w:rPr>
-              <w:t>"</w:t>
-            </w:r>
-            <w:r>
-              <w:rPr>
-                <w:rFonts w:eastAsia="Times New Roman" w:cs="Times New Roman"/>
-                <w:szCs w:val="24"/>
-              </w:rPr>
-              <w:t xml:space="preserve"> </w:t>
+              <w:t xml:space="preserve">" </w:t>
             </w:r>
             <w:r>
               <w:rPr>
@@ -11663,14 +11554,7 @@
                 <w:rFonts w:eastAsia="Times New Roman" w:cs="Times New Roman"/>
                 <w:szCs w:val="24"/>
               </w:rPr>
-              <w:t xml:space="preserve"> </w:t>
-            </w:r>
-            <w:r>
-              <w:rPr>
-                <w:rFonts w:eastAsia="Times New Roman" w:cs="Times New Roman"/>
-                <w:szCs w:val="24"/>
-              </w:rPr>
-              <w:t>–</w:t>
+              <w:t xml:space="preserve"> –</w:t>
             </w:r>
           </w:p>
           <w:p>
@@ -11701,14 +11585,7 @@
                 <w:rFonts w:eastAsia="Times New Roman" w:cs="Times New Roman"/>
                 <w:szCs w:val="24"/>
               </w:rPr>
-              <w:t>1234</w:t>
-            </w:r>
-            <w:r>
-              <w:rPr>
-                <w:rFonts w:eastAsia="Times New Roman" w:cs="Times New Roman"/>
-                <w:szCs w:val="24"/>
-              </w:rPr>
-              <w:t>"</w:t>
+              <w:t>1234"</w:t>
             </w:r>
           </w:p>
         </w:tc>
@@ -11785,6 +11662,7 @@
               <w:rPr>
                 <w:rFonts w:eastAsia="Times New Roman" w:cs="Times New Roman"/>
                 <w:szCs w:val="24"/>
+                <w:lang w:val="ru-RU"/>
               </w:rPr>
             </w:pPr>
             <w:r>
@@ -11799,6 +11677,7 @@
               <w:rPr>
                 <w:rFonts w:eastAsia="Times New Roman" w:cs="Times New Roman"/>
                 <w:szCs w:val="24"/>
+                <w:lang w:val="ru-RU"/>
               </w:rPr>
               <w:t xml:space="preserve"> – </w:t>
             </w:r>
@@ -11810,12 +11689,14 @@
               <w:rPr>
                 <w:rFonts w:eastAsia="Times New Roman" w:cs="Times New Roman"/>
                 <w:szCs w:val="24"/>
+                <w:lang w:val="ru-RU"/>
               </w:rPr>
             </w:pPr>
             <w:r>
               <w:rPr>
                 <w:rFonts w:eastAsia="Times New Roman" w:cs="Times New Roman"/>
                 <w:szCs w:val="24"/>
+                <w:lang w:val="ru-RU"/>
               </w:rPr>
               <w:t>"</w:t>
             </w:r>
@@ -11832,16 +11713,39 @@
               <w:rPr>
                 <w:rFonts w:eastAsia="Times New Roman" w:cs="Times New Roman"/>
                 <w:szCs w:val="24"/>
-              </w:rPr>
-              <w:t>", </w:t>
-            </w:r>
-            <w:r>
-              <w:rPr>
-                <w:rFonts w:eastAsia="Times New Roman" w:cs="Times New Roman"/>
-                <w:szCs w:val="24"/>
+                <w:lang w:val="ru-RU"/>
+              </w:rPr>
+              <w:t>",</w:t>
+            </w:r>
+            <w:r>
+              <w:rPr>
+                <w:rFonts w:eastAsia="Times New Roman" w:cs="Times New Roman"/>
+                <w:szCs w:val="24"/>
+              </w:rPr>
+              <w:t> </w:t>
+            </w:r>
+            <w:r>
+              <w:rPr>
+                <w:rFonts w:eastAsia="Times New Roman" w:cs="Times New Roman"/>
+                <w:szCs w:val="24"/>
+                <w:lang w:val="ru-RU"/>
               </w:rPr>
               <w:br/>
-              <w:t>email –</w:t>
+            </w:r>
+            <w:r>
+              <w:rPr>
+                <w:rFonts w:eastAsia="Times New Roman" w:cs="Times New Roman"/>
+                <w:szCs w:val="24"/>
+              </w:rPr>
+              <w:t>email</w:t>
+            </w:r>
+            <w:r>
+              <w:rPr>
+                <w:rFonts w:eastAsia="Times New Roman" w:cs="Times New Roman"/>
+                <w:szCs w:val="24"/>
+                <w:lang w:val="ru-RU"/>
+              </w:rPr>
+              <w:t xml:space="preserve"> –</w:t>
             </w:r>
           </w:p>
           <w:p>
@@ -11851,18 +11755,15 @@
               <w:rPr>
                 <w:rFonts w:eastAsia="Times New Roman" w:cs="Times New Roman"/>
                 <w:szCs w:val="24"/>
-                <w:lang w:val="ru-RU"/>
               </w:rPr>
             </w:pPr>
             <w:r>
               <w:rPr>
                 <w:rFonts w:eastAsia="Times New Roman" w:cs="Times New Roman"/>
                 <w:szCs w:val="24"/>
-                <w:lang w:val="ru-RU"/>
               </w:rPr>
               <w:t xml:space="preserve">" </w:t>
             </w:r>
-            <w:proofErr w:type="spellStart"/>
             <w:r>
               <w:rPr>
                 <w:rFonts w:eastAsia="Times New Roman" w:cs="Times New Roman"/>
@@ -11870,12 +11771,10 @@
               </w:rPr>
               <w:t>alexandroesiano</w:t>
             </w:r>
-            <w:proofErr w:type="spellEnd"/>
-            <w:r>
-              <w:rPr>
-                <w:rFonts w:eastAsia="Times New Roman" w:cs="Times New Roman"/>
-                <w:szCs w:val="24"/>
-                <w:lang w:val="ru-RU"/>
+            <w:r>
+              <w:rPr>
+                <w:rFonts w:eastAsia="Times New Roman" w:cs="Times New Roman"/>
+                <w:szCs w:val="24"/>
               </w:rPr>
               <w:t>@</w:t>
             </w:r>
@@ -11890,11 +11789,9 @@
               <w:rPr>
                 <w:rFonts w:eastAsia="Times New Roman" w:cs="Times New Roman"/>
                 <w:szCs w:val="24"/>
-                <w:lang w:val="ru-RU"/>
               </w:rPr>
               <w:t>.</w:t>
             </w:r>
-            <w:proofErr w:type="spellStart"/>
             <w:r>
               <w:rPr>
                 <w:rFonts w:eastAsia="Times New Roman" w:cs="Times New Roman"/>
@@ -11902,12 +11799,10 @@
               </w:rPr>
               <w:t>ru</w:t>
             </w:r>
-            <w:proofErr w:type="spellEnd"/>
-            <w:r>
-              <w:rPr>
-                <w:rFonts w:eastAsia="Times New Roman" w:cs="Times New Roman"/>
-                <w:szCs w:val="24"/>
-                <w:lang w:val="ru-RU"/>
+            <w:r>
+              <w:rPr>
+                <w:rFonts w:eastAsia="Times New Roman" w:cs="Times New Roman"/>
+                <w:szCs w:val="24"/>
               </w:rPr>
               <w:t>"</w:t>
             </w:r>
@@ -11922,7 +11817,6 @@
               <w:rPr>
                 <w:rFonts w:eastAsia="Times New Roman" w:cs="Times New Roman"/>
                 <w:szCs w:val="24"/>
-                <w:lang w:val="ru-RU"/>
               </w:rPr>
               <w:br/>
             </w:r>
@@ -11938,7 +11832,6 @@
               <w:rPr>
                 <w:rFonts w:eastAsia="Times New Roman" w:cs="Times New Roman"/>
                 <w:szCs w:val="24"/>
-                <w:lang w:val="ru-RU"/>
               </w:rPr>
               <w:t xml:space="preserve"> –</w:t>
             </w:r>
@@ -11957,7 +11850,6 @@
               <w:rPr>
                 <w:rFonts w:eastAsia="Times New Roman" w:cs="Times New Roman"/>
                 <w:szCs w:val="24"/>
-                <w:lang w:val="ru-RU"/>
               </w:rPr>
               <w:t>"</w:t>
             </w:r>
@@ -11972,7 +11864,6 @@
               <w:rPr>
                 <w:rFonts w:eastAsia="Times New Roman" w:cs="Times New Roman"/>
                 <w:szCs w:val="24"/>
-                <w:lang w:val="ru-RU"/>
               </w:rPr>
               <w:t>1234"</w:t>
             </w:r>
@@ -11980,7 +11871,6 @@
               <w:rPr>
                 <w:rFonts w:eastAsia="Times New Roman" w:cs="Times New Roman"/>
                 <w:szCs w:val="24"/>
-                <w:lang w:val="ru-RU"/>
               </w:rPr>
               <w:br/>
               <w:t xml:space="preserve">4. </w:t>
@@ -12779,7 +12669,15 @@
                 <w:szCs w:val="24"/>
                 <w:lang w:val="ru-RU"/>
               </w:rPr>
-              <w:t>Пользователь не зарегистрирован</w:t>
+              <w:t>1. Пользователь не зарегистрирован.</w:t>
+            </w:r>
+            <w:r>
+              <w:rPr>
+                <w:rFonts w:eastAsia="Times New Roman" w:cs="Times New Roman"/>
+                <w:szCs w:val="24"/>
+                <w:lang w:val="ru-RU"/>
+              </w:rPr>
+              <w:br/>
             </w:r>
           </w:p>
         </w:tc>
@@ -12813,7 +12711,23 @@
                 <w:lang w:val="ru-RU"/>
               </w:rPr>
               <w:br/>
-              <w:t xml:space="preserve">2. Нажать «Регистрация» </w:t>
+              <w:t>2. Нажать «</w:t>
+            </w:r>
+            <w:r>
+              <w:rPr>
+                <w:rFonts w:eastAsia="Times New Roman" w:cs="Times New Roman"/>
+                <w:szCs w:val="24"/>
+                <w:lang w:val="ru-RU"/>
+              </w:rPr>
+              <w:t>Создать аккаунт</w:t>
+            </w:r>
+            <w:r>
+              <w:rPr>
+                <w:rFonts w:eastAsia="Times New Roman" w:cs="Times New Roman"/>
+                <w:szCs w:val="24"/>
+                <w:lang w:val="ru-RU"/>
+              </w:rPr>
+              <w:t xml:space="preserve">» </w:t>
             </w:r>
             <w:r>
               <w:rPr>
@@ -12841,6 +12755,63 @@
                 <w:lang w:val="ru-RU"/>
               </w:rPr>
               <w:t xml:space="preserve"> </w:t>
+            </w:r>
+            <w:r>
+              <w:rPr>
+                <w:rFonts w:eastAsia="Times New Roman" w:cs="Times New Roman"/>
+                <w:szCs w:val="24"/>
+                <w:lang w:val="ru-RU"/>
+              </w:rPr>
+              <w:t>(</w:t>
+            </w:r>
+            <w:proofErr w:type="spellStart"/>
+            <w:r>
+              <w:rPr>
+                <w:rFonts w:eastAsia="Times New Roman" w:cs="Times New Roman"/>
+                <w:szCs w:val="24"/>
+              </w:rPr>
+              <w:t>qwoeuqoiwueoiqwueioqwueoqwuoequwoeiuwoi</w:t>
+            </w:r>
+            <w:proofErr w:type="spellEnd"/>
+            <w:r>
+              <w:rPr>
+                <w:rFonts w:eastAsia="Times New Roman" w:cs="Times New Roman"/>
+                <w:szCs w:val="24"/>
+                <w:lang w:val="ru-RU"/>
+              </w:rPr>
+              <w:t>@</w:t>
+            </w:r>
+            <w:r>
+              <w:rPr>
+                <w:rFonts w:eastAsia="Times New Roman" w:cs="Times New Roman"/>
+                <w:szCs w:val="24"/>
+              </w:rPr>
+              <w:t>mail</w:t>
+            </w:r>
+            <w:r>
+              <w:rPr>
+                <w:rFonts w:eastAsia="Times New Roman" w:cs="Times New Roman"/>
+                <w:szCs w:val="24"/>
+                <w:lang w:val="ru-RU"/>
+              </w:rPr>
+              <w:t>.</w:t>
+            </w:r>
+            <w:proofErr w:type="spellStart"/>
+            <w:r>
+              <w:rPr>
+                <w:rFonts w:eastAsia="Times New Roman" w:cs="Times New Roman"/>
+                <w:szCs w:val="24"/>
+              </w:rPr>
+              <w:t>ru</w:t>
+            </w:r>
+            <w:proofErr w:type="spellEnd"/>
+            <w:r>
+              <w:rPr>
+                <w:rFonts w:eastAsia="Times New Roman" w:cs="Times New Roman"/>
+                <w:szCs w:val="24"/>
+                <w:lang w:val="ru-RU"/>
+              </w:rPr>
+              <w:t>)</w:t>
             </w:r>
             <w:r>
               <w:rPr>
@@ -12883,25 +12854,40 @@
                 <w:szCs w:val="24"/>
                 <w:lang w:val="ru-RU"/>
               </w:rPr>
-              <w:t xml:space="preserve">Отображается ошибка: «Введите корректный </w:t>
-            </w:r>
-            <w:proofErr w:type="spellStart"/>
-            <w:r>
-              <w:rPr>
-                <w:rFonts w:eastAsia="Times New Roman" w:cs="Times New Roman"/>
-                <w:szCs w:val="24"/>
-                <w:lang w:val="ru-RU"/>
-              </w:rPr>
-              <w:t>e-mail</w:t>
-            </w:r>
-            <w:proofErr w:type="spellEnd"/>
-            <w:r>
-              <w:rPr>
-                <w:rFonts w:eastAsia="Times New Roman" w:cs="Times New Roman"/>
-                <w:szCs w:val="24"/>
-                <w:lang w:val="ru-RU"/>
-              </w:rPr>
-              <w:t>»</w:t>
+              <w:t>1. Происходит автоматический вход в систему.</w:t>
+            </w:r>
+            <w:r>
+              <w:rPr>
+                <w:rFonts w:eastAsia="Times New Roman" w:cs="Times New Roman"/>
+                <w:szCs w:val="24"/>
+                <w:lang w:val="ru-RU"/>
+              </w:rPr>
+              <w:br/>
+              <w:t xml:space="preserve">2. </w:t>
+            </w:r>
+            <w:r>
+              <w:rPr>
+                <w:rFonts w:eastAsia="Times New Roman" w:cs="Times New Roman"/>
+                <w:szCs w:val="24"/>
+              </w:rPr>
+              <w:t>URL</w:t>
+            </w:r>
+            <w:r>
+              <w:rPr>
+                <w:rFonts w:eastAsia="Times New Roman" w:cs="Times New Roman"/>
+                <w:szCs w:val="24"/>
+                <w:lang w:val="ru-RU"/>
+              </w:rPr>
+              <w:t xml:space="preserve"> изменяется на главную страницу.</w:t>
+            </w:r>
+            <w:r>
+              <w:rPr>
+                <w:rFonts w:eastAsia="Times New Roman" w:cs="Times New Roman"/>
+                <w:szCs w:val="24"/>
+                <w:lang w:val="ru-RU"/>
+              </w:rPr>
+              <w:br/>
+              <w:t>3. В правом верхнем углу отображается аватар</w:t>
             </w:r>
           </w:p>
         </w:tc>
@@ -12978,7 +12964,16 @@
                 <w:szCs w:val="24"/>
                 <w:lang w:val="ru-RU"/>
               </w:rPr>
-              <w:t>Пользователь не зарегистрирован</w:t>
+              <w:t>1. Пользователь не зарегистрирован.</w:t>
+            </w:r>
+            <w:r>
+              <w:rPr>
+                <w:rFonts w:eastAsia="Times New Roman" w:cs="Times New Roman"/>
+                <w:szCs w:val="24"/>
+                <w:lang w:val="ru-RU"/>
+              </w:rPr>
+              <w:br/>
+              <w:t>2. Форма регистрации открыта.</w:t>
             </w:r>
           </w:p>
         </w:tc>
@@ -13003,7 +12998,37 @@
                 <w:szCs w:val="24"/>
                 <w:lang w:val="ru-RU"/>
               </w:rPr>
-              <w:t xml:space="preserve">1. Открыть сайт </w:t>
+              <w:t xml:space="preserve">1. Оставить все поля ввода (логин, </w:t>
+            </w:r>
+            <w:r>
+              <w:rPr>
+                <w:rFonts w:eastAsia="Times New Roman" w:cs="Times New Roman"/>
+                <w:szCs w:val="24"/>
+              </w:rPr>
+              <w:t>e</w:t>
+            </w:r>
+            <w:r>
+              <w:rPr>
+                <w:rFonts w:eastAsia="Times New Roman" w:cs="Times New Roman"/>
+                <w:szCs w:val="24"/>
+                <w:lang w:val="ru-RU"/>
+              </w:rPr>
+              <w:t>-</w:t>
+            </w:r>
+            <w:r>
+              <w:rPr>
+                <w:rFonts w:eastAsia="Times New Roman" w:cs="Times New Roman"/>
+                <w:szCs w:val="24"/>
+              </w:rPr>
+              <w:t>mail</w:t>
+            </w:r>
+            <w:r>
+              <w:rPr>
+                <w:rFonts w:eastAsia="Times New Roman" w:cs="Times New Roman"/>
+                <w:szCs w:val="24"/>
+                <w:lang w:val="ru-RU"/>
+              </w:rPr>
+              <w:t>, пароль) пустыми.</w:t>
             </w:r>
             <w:r>
               <w:rPr>
@@ -13012,7 +13037,7 @@
                 <w:lang w:val="ru-RU"/>
               </w:rPr>
               <w:br/>
-              <w:t xml:space="preserve">2. Нажать «Регистрация» </w:t>
+              <w:t xml:space="preserve">2. Не ставить галочку согласия с правилами </w:t>
             </w:r>
             <w:r>
               <w:rPr>
@@ -13021,16 +13046,61 @@
                 <w:lang w:val="ru-RU"/>
               </w:rPr>
               <w:br/>
-              <w:t xml:space="preserve">3. Оставить поля пустыми </w:t>
-            </w:r>
-            <w:r>
-              <w:rPr>
-                <w:rFonts w:eastAsia="Times New Roman" w:cs="Times New Roman"/>
-                <w:szCs w:val="24"/>
-                <w:lang w:val="ru-RU"/>
-              </w:rPr>
-              <w:br/>
-              <w:t>4. Нажать «Зарегистрироваться»</w:t>
+            </w:r>
+            <w:r>
+              <w:rPr>
+                <w:rFonts w:eastAsia="Times New Roman" w:cs="Times New Roman"/>
+                <w:szCs w:val="24"/>
+              </w:rPr>
+              <w:t xml:space="preserve">3. </w:t>
+            </w:r>
+            <w:proofErr w:type="spellStart"/>
+            <w:r>
+              <w:rPr>
+                <w:rFonts w:eastAsia="Times New Roman" w:cs="Times New Roman"/>
+                <w:szCs w:val="24"/>
+              </w:rPr>
+              <w:t>Нажать</w:t>
+            </w:r>
+            <w:proofErr w:type="spellEnd"/>
+            <w:r>
+              <w:rPr>
+                <w:rFonts w:eastAsia="Times New Roman" w:cs="Times New Roman"/>
+                <w:szCs w:val="24"/>
+              </w:rPr>
+              <w:t xml:space="preserve"> </w:t>
+            </w:r>
+            <w:proofErr w:type="spellStart"/>
+            <w:r>
+              <w:rPr>
+                <w:rFonts w:eastAsia="Times New Roman" w:cs="Times New Roman"/>
+                <w:szCs w:val="24"/>
+              </w:rPr>
+              <w:t>кнопку</w:t>
+            </w:r>
+            <w:proofErr w:type="spellEnd"/>
+            <w:r>
+              <w:rPr>
+                <w:rFonts w:eastAsia="Times New Roman" w:cs="Times New Roman"/>
+                <w:szCs w:val="24"/>
+              </w:rPr>
+              <w:t xml:space="preserve"> «</w:t>
+            </w:r>
+            <w:proofErr w:type="spellStart"/>
+            <w:r>
+              <w:rPr>
+                <w:rFonts w:eastAsia="Times New Roman" w:cs="Times New Roman"/>
+                <w:szCs w:val="24"/>
+              </w:rPr>
+              <w:t>Зарегистрироваться</w:t>
+            </w:r>
+            <w:proofErr w:type="spellEnd"/>
+            <w:r>
+              <w:rPr>
+                <w:rFonts w:eastAsia="Times New Roman" w:cs="Times New Roman"/>
+                <w:szCs w:val="24"/>
+              </w:rPr>
+              <w:t>».</w:t>
             </w:r>
           </w:p>
         </w:tc>
@@ -13055,7 +13125,40 @@
                 <w:szCs w:val="24"/>
                 <w:lang w:val="ru-RU"/>
               </w:rPr>
-              <w:t>Отображается ошибка: «Заполните обязательные поля»</w:t>
+              <w:t>1. Регистрация</w:t>
+            </w:r>
+            <w:r>
+              <w:rPr>
+                <w:rFonts w:eastAsia="Times New Roman" w:cs="Times New Roman"/>
+                <w:szCs w:val="24"/>
+              </w:rPr>
+              <w:t> </w:t>
+            </w:r>
+            <w:r>
+              <w:rPr>
+                <w:rFonts w:eastAsia="Times New Roman" w:cs="Times New Roman"/>
+                <w:szCs w:val="24"/>
+                <w:lang w:val="ru-RU"/>
+              </w:rPr>
+              <w:t>не выполняется, форма не отправляется.</w:t>
+            </w:r>
+            <w:r>
+              <w:rPr>
+                <w:rFonts w:eastAsia="Times New Roman" w:cs="Times New Roman"/>
+                <w:szCs w:val="24"/>
+                <w:lang w:val="ru-RU"/>
+              </w:rPr>
+              <w:br/>
+              <w:t xml:space="preserve">2. Рядом с каждым пустым полем отображается </w:t>
+            </w:r>
+            <w:r>
+              <w:rPr>
+                <w:rFonts w:eastAsia="Times New Roman" w:cs="Times New Roman"/>
+                <w:szCs w:val="24"/>
+                <w:lang w:val="ru-RU"/>
+              </w:rPr>
+              <w:lastRenderedPageBreak/>
+              <w:t>сообщение об ошибке (например, «Поле обязательно для заполнения»).</w:t>
             </w:r>
           </w:p>
         </w:tc>
@@ -13070,25 +13173,6 @@
     </w:p>
     <w:p>
       <w:pPr>
-        <w:rPr>
-          <w:lang w:val="ru-RU"/>
-        </w:rPr>
-      </w:pPr>
-      <w:r>
-        <w:rPr>
-          <w:lang w:val="ru-RU"/>
-        </w:rPr>
-        <w:t>(возможно, регистрацию выпилим из-за капчи, с входом та же история)</w:t>
-      </w:r>
-      <w:r>
-        <w:rPr>
-          <w:lang w:val="ru-RU"/>
-        </w:rPr>
-        <w:br/>
-      </w:r>
-    </w:p>
-    <w:p>
-      <w:pPr>
         <w:pStyle w:val="1"/>
         <w:rPr>
           <w:lang w:val="ru-RU"/>
@@ -13099,7 +13183,6 @@
         <w:rPr>
           <w:lang w:val="ru-RU"/>
         </w:rPr>
-        <w:lastRenderedPageBreak/>
         <w:t>Процесс тестирования</w:t>
       </w:r>
       <w:bookmarkEnd w:id="20"/>
@@ -13115,7 +13198,6 @@
           <w:lang w:val="ru-RU"/>
         </w:rPr>
         <w:br/>
-        <w:t>Чуть-чуть потупила и пошла спать, но выглядит всё довольно просто</w:t>
       </w:r>
     </w:p>
     <w:sectPr>

</xml_diff>

<commit_message>
fix: 12 13 tests final fix, 8 test not final fix + report fix + 2 test add
</commit_message>
<xml_diff>
--- a/ТПО/Лаб3/Ястребов-Амирханов_Карандашева_ТПО_3.docx
+++ b/ТПО/Лаб3/Ястребов-Амирханов_Карандашева_ТПО_3.docx
@@ -619,7 +619,6 @@
         <w:br/>
         <w:t xml:space="preserve">Выполнили: </w:t>
       </w:r>
-      <w:proofErr w:type="spellStart"/>
       <w:r>
         <w:rPr>
           <w:rFonts w:eastAsia="Times New Roman" w:cs="Times New Roman"/>
@@ -627,17 +626,7 @@
           <w:szCs w:val="28"/>
           <w:lang w:val="ru-RU" w:eastAsia="ru-RU"/>
         </w:rPr>
-        <w:t>Карандашева</w:t>
-      </w:r>
-      <w:proofErr w:type="spellEnd"/>
-      <w:r>
-        <w:rPr>
-          <w:rFonts w:eastAsia="Times New Roman" w:cs="Times New Roman"/>
-          <w:sz w:val="28"/>
-          <w:szCs w:val="28"/>
-          <w:lang w:val="ru-RU" w:eastAsia="ru-RU"/>
-        </w:rPr>
-        <w:t xml:space="preserve"> Анастасия, </w:t>
+        <w:t xml:space="preserve">Карандашева Анастасия, </w:t>
       </w:r>
       <w:r>
         <w:rPr>
@@ -915,7 +904,7 @@
             </w:rPr>
             <w:fldChar w:fldCharType="separate"/>
           </w:r>
-          <w:hyperlink w:anchor="_Toc225997429" w:history="1">
+          <w:hyperlink w:anchor="_Toc226111012" w:history="1">
             <w:r>
               <w:rPr>
                 <w:rStyle w:val="a8"/>
@@ -938,7 +927,7 @@
               <w:rPr>
                 <w:webHidden/>
               </w:rPr>
-              <w:instrText xml:space="preserve"> PAGEREF _Toc225997429 \h </w:instrText>
+              <w:instrText xml:space="preserve"> PAGEREF _Toc226111012 \h </w:instrText>
             </w:r>
             <w:r>
               <w:rPr>
@@ -975,7 +964,7 @@
               <w14:ligatures w14:val="standardContextual"/>
             </w:rPr>
           </w:pPr>
-          <w:hyperlink w:anchor="_Toc225997430" w:history="1">
+          <w:hyperlink w:anchor="_Toc226111013" w:history="1">
             <w:r>
               <w:rPr>
                 <w:rStyle w:val="a8"/>
@@ -998,7 +987,7 @@
               <w:rPr>
                 <w:webHidden/>
               </w:rPr>
-              <w:instrText xml:space="preserve"> PAGEREF _Toc225997430 \h </w:instrText>
+              <w:instrText xml:space="preserve"> PAGEREF _Toc226111013 \h </w:instrText>
             </w:r>
             <w:r>
               <w:rPr>
@@ -1040,7 +1029,7 @@
               <w14:ligatures w14:val="standardContextual"/>
             </w:rPr>
           </w:pPr>
-          <w:hyperlink w:anchor="_Toc225997431" w:history="1">
+          <w:hyperlink w:anchor="_Toc226111014" w:history="1">
             <w:r>
               <w:rPr>
                 <w:rStyle w:val="a8"/>
@@ -1075,7 +1064,7 @@
                 <w:noProof/>
                 <w:webHidden/>
               </w:rPr>
-              <w:instrText xml:space="preserve"> PAGEREF _Toc225997431 \h </w:instrText>
+              <w:instrText xml:space="preserve"> PAGEREF _Toc226111014 \h </w:instrText>
             </w:r>
             <w:r>
               <w:rPr>
@@ -1116,7 +1105,7 @@
               <w14:ligatures w14:val="standardContextual"/>
             </w:rPr>
           </w:pPr>
-          <w:hyperlink w:anchor="_Toc225997432" w:history="1">
+          <w:hyperlink w:anchor="_Toc226111015" w:history="1">
             <w:r>
               <w:rPr>
                 <w:rStyle w:val="a8"/>
@@ -1139,7 +1128,7 @@
               <w:rPr>
                 <w:webHidden/>
               </w:rPr>
-              <w:instrText xml:space="preserve"> PAGEREF _Toc225997432 \h </w:instrText>
+              <w:instrText xml:space="preserve"> PAGEREF _Toc226111015 \h </w:instrText>
             </w:r>
             <w:r>
               <w:rPr>
@@ -1176,7 +1165,7 @@
               <w14:ligatures w14:val="standardContextual"/>
             </w:rPr>
           </w:pPr>
-          <w:hyperlink w:anchor="_Toc225997433" w:history="1">
+          <w:hyperlink w:anchor="_Toc226111016" w:history="1">
             <w:r>
               <w:rPr>
                 <w:rStyle w:val="a8"/>
@@ -1199,7 +1188,7 @@
               <w:rPr>
                 <w:webHidden/>
               </w:rPr>
-              <w:instrText xml:space="preserve"> PAGEREF _Toc225997433 \h </w:instrText>
+              <w:instrText xml:space="preserve"> PAGEREF _Toc226111016 \h </w:instrText>
             </w:r>
             <w:r>
               <w:rPr>
@@ -1241,7 +1230,7 @@
               <w14:ligatures w14:val="standardContextual"/>
             </w:rPr>
           </w:pPr>
-          <w:hyperlink w:anchor="_Toc225997434" w:history="1">
+          <w:hyperlink w:anchor="_Toc226111017" w:history="1">
             <w:r>
               <w:rPr>
                 <w:rStyle w:val="a8"/>
@@ -1269,7 +1258,7 @@
                 <w:noProof/>
                 <w:webHidden/>
               </w:rPr>
-              <w:instrText xml:space="preserve"> PAGEREF _Toc225997434 \h </w:instrText>
+              <w:instrText xml:space="preserve"> PAGEREF _Toc226111017 \h </w:instrText>
             </w:r>
             <w:r>
               <w:rPr>
@@ -1315,7 +1304,7 @@
               <w14:ligatures w14:val="standardContextual"/>
             </w:rPr>
           </w:pPr>
-          <w:hyperlink w:anchor="_Toc225997435" w:history="1">
+          <w:hyperlink w:anchor="_Toc226111018" w:history="1">
             <w:r>
               <w:rPr>
                 <w:rStyle w:val="a8"/>
@@ -1343,7 +1332,7 @@
                 <w:noProof/>
                 <w:webHidden/>
               </w:rPr>
-              <w:instrText xml:space="preserve"> PAGEREF _Toc225997435 \h </w:instrText>
+              <w:instrText xml:space="preserve"> PAGEREF _Toc226111018 \h </w:instrText>
             </w:r>
             <w:r>
               <w:rPr>
@@ -1389,7 +1378,7 @@
               <w14:ligatures w14:val="standardContextual"/>
             </w:rPr>
           </w:pPr>
-          <w:hyperlink w:anchor="_Toc225997436" w:history="1">
+          <w:hyperlink w:anchor="_Toc226111019" w:history="1">
             <w:r>
               <w:rPr>
                 <w:rStyle w:val="a8"/>
@@ -1417,7 +1406,7 @@
                 <w:noProof/>
                 <w:webHidden/>
               </w:rPr>
-              <w:instrText xml:space="preserve"> PAGEREF _Toc225997436 \h </w:instrText>
+              <w:instrText xml:space="preserve"> PAGEREF _Toc226111019 \h </w:instrText>
             </w:r>
             <w:r>
               <w:rPr>
@@ -1463,7 +1452,7 @@
               <w14:ligatures w14:val="standardContextual"/>
             </w:rPr>
           </w:pPr>
-          <w:hyperlink w:anchor="_Toc225997437" w:history="1">
+          <w:hyperlink w:anchor="_Toc226111020" w:history="1">
             <w:r>
               <w:rPr>
                 <w:rStyle w:val="a8"/>
@@ -1491,7 +1480,7 @@
                 <w:noProof/>
                 <w:webHidden/>
               </w:rPr>
-              <w:instrText xml:space="preserve"> PAGEREF _Toc225997437 \h </w:instrText>
+              <w:instrText xml:space="preserve"> PAGEREF _Toc226111020 \h </w:instrText>
             </w:r>
             <w:r>
               <w:rPr>
@@ -1537,7 +1526,7 @@
               <w14:ligatures w14:val="standardContextual"/>
             </w:rPr>
           </w:pPr>
-          <w:hyperlink w:anchor="_Toc225997438" w:history="1">
+          <w:hyperlink w:anchor="_Toc226111021" w:history="1">
             <w:r>
               <w:rPr>
                 <w:rStyle w:val="a8"/>
@@ -1565,7 +1554,7 @@
                 <w:noProof/>
                 <w:webHidden/>
               </w:rPr>
-              <w:instrText xml:space="preserve"> PAGEREF _Toc225997438 \h </w:instrText>
+              <w:instrText xml:space="preserve"> PAGEREF _Toc226111021 \h </w:instrText>
             </w:r>
             <w:r>
               <w:rPr>
@@ -1611,7 +1600,7 @@
               <w14:ligatures w14:val="standardContextual"/>
             </w:rPr>
           </w:pPr>
-          <w:hyperlink w:anchor="_Toc225997439" w:history="1">
+          <w:hyperlink w:anchor="_Toc226111022" w:history="1">
             <w:r>
               <w:rPr>
                 <w:rStyle w:val="a8"/>
@@ -1639,7 +1628,7 @@
                 <w:noProof/>
                 <w:webHidden/>
               </w:rPr>
-              <w:instrText xml:space="preserve"> PAGEREF _Toc225997439 \h </w:instrText>
+              <w:instrText xml:space="preserve"> PAGEREF _Toc226111022 \h </w:instrText>
             </w:r>
             <w:r>
               <w:rPr>
@@ -1685,7 +1674,7 @@
               <w14:ligatures w14:val="standardContextual"/>
             </w:rPr>
           </w:pPr>
-          <w:hyperlink w:anchor="_Toc225997440" w:history="1">
+          <w:hyperlink w:anchor="_Toc226111023" w:history="1">
             <w:r>
               <w:rPr>
                 <w:rStyle w:val="a8"/>
@@ -1713,7 +1702,7 @@
                 <w:noProof/>
                 <w:webHidden/>
               </w:rPr>
-              <w:instrText xml:space="preserve"> PAGEREF _Toc225997440 \h </w:instrText>
+              <w:instrText xml:space="preserve"> PAGEREF _Toc226111023 \h </w:instrText>
             </w:r>
             <w:r>
               <w:rPr>
@@ -1754,7 +1743,7 @@
               <w14:ligatures w14:val="standardContextual"/>
             </w:rPr>
           </w:pPr>
-          <w:hyperlink w:anchor="_Toc225997441" w:history="1">
+          <w:hyperlink w:anchor="_Toc226111024" w:history="1">
             <w:r>
               <w:rPr>
                 <w:rStyle w:val="a8"/>
@@ -1777,7 +1766,7 @@
               <w:rPr>
                 <w:webHidden/>
               </w:rPr>
-              <w:instrText xml:space="preserve"> PAGEREF _Toc225997441 \h </w:instrText>
+              <w:instrText xml:space="preserve"> PAGEREF _Toc226111024 \h </w:instrText>
             </w:r>
             <w:r>
               <w:rPr>
@@ -1819,7 +1808,7 @@
               <w14:ligatures w14:val="standardContextual"/>
             </w:rPr>
           </w:pPr>
-          <w:hyperlink w:anchor="_Toc225997442" w:history="1">
+          <w:hyperlink w:anchor="_Toc226111025" w:history="1">
             <w:r>
               <w:rPr>
                 <w:rStyle w:val="a8"/>
@@ -1847,7 +1836,7 @@
                 <w:noProof/>
                 <w:webHidden/>
               </w:rPr>
-              <w:instrText xml:space="preserve"> PAGEREF _Toc225997442 \h </w:instrText>
+              <w:instrText xml:space="preserve"> PAGEREF _Toc226111025 \h </w:instrText>
             </w:r>
             <w:r>
               <w:rPr>
@@ -1893,7 +1882,7 @@
               <w14:ligatures w14:val="standardContextual"/>
             </w:rPr>
           </w:pPr>
-          <w:hyperlink w:anchor="_Toc225997443" w:history="1">
+          <w:hyperlink w:anchor="_Toc226111026" w:history="1">
             <w:r>
               <w:rPr>
                 <w:rStyle w:val="a8"/>
@@ -1921,7 +1910,7 @@
                 <w:noProof/>
                 <w:webHidden/>
               </w:rPr>
-              <w:instrText xml:space="preserve"> PAGEREF _Toc225997443 \h </w:instrText>
+              <w:instrText xml:space="preserve"> PAGEREF _Toc226111026 \h </w:instrText>
             </w:r>
             <w:r>
               <w:rPr>
@@ -1967,7 +1956,7 @@
               <w14:ligatures w14:val="standardContextual"/>
             </w:rPr>
           </w:pPr>
-          <w:hyperlink w:anchor="_Toc225997444" w:history="1">
+          <w:hyperlink w:anchor="_Toc226111027" w:history="1">
             <w:r>
               <w:rPr>
                 <w:rStyle w:val="a8"/>
@@ -1995,7 +1984,7 @@
                 <w:noProof/>
                 <w:webHidden/>
               </w:rPr>
-              <w:instrText xml:space="preserve"> PAGEREF _Toc225997444 \h </w:instrText>
+              <w:instrText xml:space="preserve"> PAGEREF _Toc226111027 \h </w:instrText>
             </w:r>
             <w:r>
               <w:rPr>
@@ -2041,7 +2030,7 @@
               <w14:ligatures w14:val="standardContextual"/>
             </w:rPr>
           </w:pPr>
-          <w:hyperlink w:anchor="_Toc225997445" w:history="1">
+          <w:hyperlink w:anchor="_Toc226111028" w:history="1">
             <w:r>
               <w:rPr>
                 <w:rStyle w:val="a8"/>
@@ -2069,7 +2058,7 @@
                 <w:noProof/>
                 <w:webHidden/>
               </w:rPr>
-              <w:instrText xml:space="preserve"> PAGEREF _Toc225997445 \h </w:instrText>
+              <w:instrText xml:space="preserve"> PAGEREF _Toc226111028 \h </w:instrText>
             </w:r>
             <w:r>
               <w:rPr>
@@ -2115,7 +2104,7 @@
               <w14:ligatures w14:val="standardContextual"/>
             </w:rPr>
           </w:pPr>
-          <w:hyperlink w:anchor="_Toc225997446" w:history="1">
+          <w:hyperlink w:anchor="_Toc226111029" w:history="1">
             <w:r>
               <w:rPr>
                 <w:rStyle w:val="a8"/>
@@ -2143,7 +2132,7 @@
                 <w:noProof/>
                 <w:webHidden/>
               </w:rPr>
-              <w:instrText xml:space="preserve"> PAGEREF _Toc225997446 \h </w:instrText>
+              <w:instrText xml:space="preserve"> PAGEREF _Toc226111029 \h </w:instrText>
             </w:r>
             <w:r>
               <w:rPr>
@@ -2189,7 +2178,7 @@
               <w14:ligatures w14:val="standardContextual"/>
             </w:rPr>
           </w:pPr>
-          <w:hyperlink w:anchor="_Toc225997447" w:history="1">
+          <w:hyperlink w:anchor="_Toc226111030" w:history="1">
             <w:r>
               <w:rPr>
                 <w:rStyle w:val="a8"/>
@@ -2217,7 +2206,7 @@
                 <w:noProof/>
                 <w:webHidden/>
               </w:rPr>
-              <w:instrText xml:space="preserve"> PAGEREF _Toc225997447 \h </w:instrText>
+              <w:instrText xml:space="preserve"> PAGEREF _Toc226111030 \h </w:instrText>
             </w:r>
             <w:r>
               <w:rPr>
@@ -2237,7 +2226,7 @@
                 <w:noProof/>
                 <w:webHidden/>
               </w:rPr>
-              <w:t>8</w:t>
+              <w:t>9</w:t>
             </w:r>
             <w:r>
               <w:rPr>
@@ -2263,7 +2252,7 @@
               <w14:ligatures w14:val="standardContextual"/>
             </w:rPr>
           </w:pPr>
-          <w:hyperlink w:anchor="_Toc225997448" w:history="1">
+          <w:hyperlink w:anchor="_Toc226111031" w:history="1">
             <w:r>
               <w:rPr>
                 <w:rStyle w:val="a8"/>
@@ -2291,7 +2280,7 @@
                 <w:noProof/>
                 <w:webHidden/>
               </w:rPr>
-              <w:instrText xml:space="preserve"> PAGEREF _Toc225997448 \h </w:instrText>
+              <w:instrText xml:space="preserve"> PAGEREF _Toc226111031 \h </w:instrText>
             </w:r>
             <w:r>
               <w:rPr>
@@ -2311,7 +2300,7 @@
                 <w:noProof/>
                 <w:webHidden/>
               </w:rPr>
-              <w:t>8</w:t>
+              <w:t>9</w:t>
             </w:r>
             <w:r>
               <w:rPr>
@@ -2332,7 +2321,7 @@
               <w14:ligatures w14:val="standardContextual"/>
             </w:rPr>
           </w:pPr>
-          <w:hyperlink w:anchor="_Toc225997449" w:history="1">
+          <w:hyperlink w:anchor="_Toc226111032" w:history="1">
             <w:r>
               <w:rPr>
                 <w:rStyle w:val="a8"/>
@@ -2355,7 +2344,7 @@
               <w:rPr>
                 <w:webHidden/>
               </w:rPr>
-              <w:instrText xml:space="preserve"> PAGEREF _Toc225997449 \h </w:instrText>
+              <w:instrText xml:space="preserve"> PAGEREF _Toc226111032 \h </w:instrText>
             </w:r>
             <w:r>
               <w:rPr>
@@ -2372,7 +2361,67 @@
               <w:rPr>
                 <w:webHidden/>
               </w:rPr>
-              <w:t>9</w:t>
+              <w:t>12</w:t>
+            </w:r>
+            <w:r>
+              <w:rPr>
+                <w:webHidden/>
+              </w:rPr>
+              <w:fldChar w:fldCharType="end"/>
+            </w:r>
+          </w:hyperlink>
+        </w:p>
+        <w:p>
+          <w:pPr>
+            <w:pStyle w:val="11"/>
+            <w:rPr>
+              <w:rFonts w:asciiTheme="minorHAnsi" w:eastAsiaTheme="minorEastAsia" w:hAnsiTheme="minorHAnsi" w:cstheme="minorBidi"/>
+              <w:kern w:val="2"/>
+              <w:lang w:eastAsia="ru-RU"/>
+              <w14:ligatures w14:val="standardContextual"/>
+            </w:rPr>
+          </w:pPr>
+          <w:hyperlink w:anchor="_Toc226111033" w:history="1">
+            <w:r>
+              <w:rPr>
+                <w:rStyle w:val="a8"/>
+              </w:rPr>
+              <w:t>Вывод</w:t>
+            </w:r>
+            <w:r>
+              <w:rPr>
+                <w:webHidden/>
+              </w:rPr>
+              <w:tab/>
+            </w:r>
+            <w:r>
+              <w:rPr>
+                <w:webHidden/>
+              </w:rPr>
+              <w:fldChar w:fldCharType="begin"/>
+            </w:r>
+            <w:r>
+              <w:rPr>
+                <w:webHidden/>
+              </w:rPr>
+              <w:instrText xml:space="preserve"> PAGEREF _Toc226111033 \h </w:instrText>
+            </w:r>
+            <w:r>
+              <w:rPr>
+                <w:webHidden/>
+              </w:rPr>
+            </w:r>
+            <w:r>
+              <w:rPr>
+                <w:webHidden/>
+              </w:rPr>
+              <w:fldChar w:fldCharType="separate"/>
+            </w:r>
+            <w:r>
+              <w:rPr>
+                <w:webHidden/>
+              </w:rPr>
+              <w:t>24</w:t>
             </w:r>
             <w:r>
               <w:rPr>
@@ -2427,7 +2476,7 @@
           <w:lang w:val="ru-RU"/>
         </w:rPr>
       </w:pPr>
-      <w:bookmarkStart w:id="0" w:name="_Toc225997429"/>
+      <w:bookmarkStart w:id="0" w:name="_Toc226111012"/>
       <w:r>
         <w:rPr>
           <w:rFonts w:cs="Times New Roman"/>
@@ -2701,7 +2750,7 @@
           <w:lang w:val="ru-RU"/>
         </w:rPr>
       </w:pPr>
-      <w:bookmarkStart w:id="1" w:name="_Toc225997430"/>
+      <w:bookmarkStart w:id="1" w:name="_Toc226111013"/>
       <w:r>
         <w:rPr>
           <w:lang w:val="ru-RU"/>
@@ -3354,19 +3403,17 @@
           <w:lang w:val="ru-RU"/>
         </w:rPr>
       </w:pPr>
-      <w:bookmarkStart w:id="2" w:name="_Toc225997431"/>
+      <w:bookmarkStart w:id="2" w:name="_Toc226111014"/>
       <w:r>
         <w:rPr>
           <w:lang w:val="ru-RU"/>
         </w:rPr>
         <w:t xml:space="preserve">Общий список функций </w:t>
       </w:r>
-      <w:proofErr w:type="spellStart"/>
       <w:r>
         <w:t>pikabu</w:t>
       </w:r>
       <w:bookmarkEnd w:id="2"/>
-      <w:proofErr w:type="spellEnd"/>
     </w:p>
     <w:p>
       <w:pPr>
@@ -3848,7 +3895,7 @@
           <w:lang w:val="ru-RU"/>
         </w:rPr>
       </w:pPr>
-      <w:bookmarkStart w:id="3" w:name="_Toc225997432"/>
+      <w:bookmarkStart w:id="3" w:name="_Toc226111015"/>
       <w:r>
         <w:lastRenderedPageBreak/>
         <w:t xml:space="preserve">Use-case </w:t>
@@ -3960,21 +4007,13 @@
           <w:lang w:val="ru-RU"/>
         </w:rPr>
       </w:pPr>
-      <w:bookmarkStart w:id="4" w:name="_Toc225997433"/>
-      <w:proofErr w:type="spellStart"/>
+      <w:bookmarkStart w:id="4" w:name="_Toc226111016"/>
       <w:r>
         <w:rPr>
           <w:lang w:val="ru-RU"/>
         </w:rPr>
         <w:lastRenderedPageBreak/>
-        <w:t>CheckList</w:t>
-      </w:r>
-      <w:proofErr w:type="spellEnd"/>
-      <w:r>
-        <w:rPr>
-          <w:lang w:val="ru-RU"/>
-        </w:rPr>
-        <w:t xml:space="preserve"> тестового покрытия</w:t>
+        <w:t>CheckList тестового покрытия</w:t>
       </w:r>
       <w:bookmarkEnd w:id="4"/>
     </w:p>
@@ -3985,7 +4024,7 @@
           <w:lang w:val="ru-RU"/>
         </w:rPr>
       </w:pPr>
-      <w:bookmarkStart w:id="5" w:name="_Toc225997434"/>
+      <w:bookmarkStart w:id="5" w:name="_Toc226111017"/>
       <w:r>
         <w:rPr>
           <w:lang w:val="ru-RU"/>
@@ -4183,7 +4222,7 @@
           <w:lang w:val="ru-RU"/>
         </w:rPr>
       </w:pPr>
-      <w:bookmarkStart w:id="6" w:name="_Toc225997435"/>
+      <w:bookmarkStart w:id="6" w:name="_Toc226111018"/>
       <w:r>
         <w:rPr>
           <w:lang w:val="ru-RU"/>
@@ -4330,7 +4369,7 @@
           <w:lang w:val="ru-RU"/>
         </w:rPr>
       </w:pPr>
-      <w:bookmarkStart w:id="7" w:name="_Toc225997436"/>
+      <w:bookmarkStart w:id="7" w:name="_Toc226111019"/>
       <w:r>
         <w:rPr>
           <w:lang w:val="ru-RU"/>
@@ -4444,7 +4483,7 @@
           <w:lang w:val="ru-RU"/>
         </w:rPr>
       </w:pPr>
-      <w:bookmarkStart w:id="8" w:name="_Toc225997437"/>
+      <w:bookmarkStart w:id="8" w:name="_Toc226111020"/>
       <w:r>
         <w:rPr>
           <w:lang w:val="ru-RU"/>
@@ -4599,7 +4638,7 @@
           <w:lang w:val="ru-RU"/>
         </w:rPr>
       </w:pPr>
-      <w:bookmarkStart w:id="9" w:name="_Toc225997438"/>
+      <w:bookmarkStart w:id="9" w:name="_Toc226111021"/>
       <w:r>
         <w:rPr>
           <w:lang w:val="ru-RU"/>
@@ -4746,7 +4785,7 @@
           <w:lang w:val="ru-RU"/>
         </w:rPr>
       </w:pPr>
-      <w:bookmarkStart w:id="10" w:name="_Toc225997439"/>
+      <w:bookmarkStart w:id="10" w:name="_Toc226111022"/>
       <w:r>
         <w:rPr>
           <w:lang w:val="ru-RU"/>
@@ -4827,7 +4866,7 @@
           <w:lang w:val="ru-RU"/>
         </w:rPr>
       </w:pPr>
-      <w:bookmarkStart w:id="11" w:name="_Toc225997440"/>
+      <w:bookmarkStart w:id="11" w:name="_Toc226111023"/>
       <w:r>
         <w:rPr>
           <w:lang w:val="ru-RU"/>
@@ -4963,7 +5002,7 @@
           <w:lang w:val="ru-RU"/>
         </w:rPr>
       </w:pPr>
-      <w:bookmarkStart w:id="12" w:name="_Toc225997441"/>
+      <w:bookmarkStart w:id="12" w:name="_Toc226111024"/>
       <w:r>
         <w:rPr>
           <w:lang w:val="ru-RU"/>
@@ -4986,7 +5025,7 @@
           <w:lang w:val="ru-RU"/>
         </w:rPr>
       </w:pPr>
-      <w:bookmarkStart w:id="13" w:name="_Toc225997442"/>
+      <w:bookmarkStart w:id="13" w:name="_Toc226111025"/>
       <w:r>
         <w:rPr>
           <w:lang w:val="ru-RU"/>
@@ -6341,7 +6380,7 @@
           <w:lang w:val="ru-RU"/>
         </w:rPr>
       </w:pPr>
-      <w:bookmarkStart w:id="14" w:name="_Toc225997443"/>
+      <w:bookmarkStart w:id="14" w:name="_Toc226111026"/>
       <w:r>
         <w:rPr>
           <w:lang w:val="ru-RU"/>
@@ -6899,7 +6938,7 @@
           <w:lang w:val="ru-RU"/>
         </w:rPr>
       </w:pPr>
-      <w:bookmarkStart w:id="15" w:name="_Toc225997444"/>
+      <w:bookmarkStart w:id="15" w:name="_Toc226111027"/>
       <w:r>
         <w:rPr>
           <w:lang w:val="ru-RU"/>
@@ -7713,7 +7752,7 @@
           <w:lang w:val="ru-RU"/>
         </w:rPr>
       </w:pPr>
-      <w:bookmarkStart w:id="16" w:name="_Toc225997445"/>
+      <w:bookmarkStart w:id="16" w:name="_Toc226111028"/>
       <w:r>
         <w:rPr>
           <w:lang w:val="ru-RU"/>
@@ -8783,7 +8822,7 @@
           <w:lang w:val="ru-RU"/>
         </w:rPr>
       </w:pPr>
-      <w:bookmarkStart w:id="17" w:name="_Toc225997446"/>
+      <w:bookmarkStart w:id="17" w:name="_Toc226111029"/>
       <w:r>
         <w:rPr>
           <w:lang w:val="ru-RU"/>
@@ -10070,7 +10109,7 @@
           <w:lang w:val="ru-RU"/>
         </w:rPr>
       </w:pPr>
-      <w:bookmarkStart w:id="18" w:name="_Toc225997447"/>
+      <w:bookmarkStart w:id="18" w:name="_Toc226111030"/>
       <w:r>
         <w:rPr>
           <w:lang w:val="ru-RU"/>
@@ -11131,7 +11170,6 @@
           <w:lang w:val="ru-RU"/>
         </w:rPr>
       </w:pPr>
-      <w:bookmarkStart w:id="19" w:name="_Toc225997448"/>
       <w:r>
         <w:rPr>
           <w:lang w:val="ru-RU"/>
@@ -11144,6 +11182,7 @@
         </w:rPr>
         <w:br/>
       </w:r>
+      <w:bookmarkStart w:id="19" w:name="_Toc226111031"/>
       <w:r>
         <w:rPr>
           <w:lang w:val="ru-RU"/>
@@ -13051,6 +13090,7 @@
               <w:rPr>
                 <w:rFonts w:eastAsia="Times New Roman" w:cs="Times New Roman"/>
                 <w:szCs w:val="24"/>
+                <w:lang w:val="ru-RU"/>
               </w:rPr>
               <w:t xml:space="preserve">3. </w:t>
             </w:r>
@@ -13163,6 +13203,572 @@
           </w:p>
         </w:tc>
       </w:tr>
+      <w:tr>
+        <w:tc>
+          <w:tcPr>
+            <w:tcW w:w="993" w:type="dxa"/>
+          </w:tcPr>
+          <w:p>
+            <w:pPr>
+              <w:suppressAutoHyphens w:val="0"/>
+              <w:spacing w:line="240" w:lineRule="auto"/>
+              <w:rPr>
+                <w:rFonts w:eastAsia="Times New Roman" w:cs="Times New Roman"/>
+                <w:szCs w:val="24"/>
+              </w:rPr>
+            </w:pPr>
+            <w:r>
+              <w:rPr>
+                <w:rFonts w:eastAsia="Times New Roman" w:cs="Times New Roman"/>
+                <w:szCs w:val="24"/>
+                <w:lang w:val="ru-RU"/>
+              </w:rPr>
+              <w:lastRenderedPageBreak/>
+              <w:t>TC-1</w:t>
+            </w:r>
+            <w:r>
+              <w:rPr>
+                <w:rFonts w:eastAsia="Times New Roman" w:cs="Times New Roman"/>
+                <w:szCs w:val="24"/>
+              </w:rPr>
+              <w:t>8</w:t>
+            </w:r>
+          </w:p>
+        </w:tc>
+        <w:tc>
+          <w:tcPr>
+            <w:tcW w:w="1659" w:type="dxa"/>
+          </w:tcPr>
+          <w:p>
+            <w:pPr>
+              <w:suppressAutoHyphens w:val="0"/>
+              <w:spacing w:line="240" w:lineRule="auto"/>
+              <w:rPr>
+                <w:rFonts w:eastAsia="Times New Roman" w:cs="Times New Roman"/>
+                <w:szCs w:val="24"/>
+              </w:rPr>
+            </w:pPr>
+            <w:r>
+              <w:rPr>
+                <w:rFonts w:eastAsia="Times New Roman" w:cs="Times New Roman"/>
+                <w:szCs w:val="24"/>
+                <w:lang w:val="ru-RU"/>
+              </w:rPr>
+              <w:t xml:space="preserve">Регистрация с существующим </w:t>
+            </w:r>
+            <w:r>
+              <w:rPr>
+                <w:rFonts w:eastAsia="Times New Roman" w:cs="Times New Roman"/>
+                <w:szCs w:val="24"/>
+              </w:rPr>
+              <w:t>email</w:t>
+            </w:r>
+          </w:p>
+        </w:tc>
+        <w:tc>
+          <w:tcPr>
+            <w:tcW w:w="3161" w:type="dxa"/>
+          </w:tcPr>
+          <w:p>
+            <w:pPr>
+              <w:suppressAutoHyphens w:val="0"/>
+              <w:spacing w:line="240" w:lineRule="auto"/>
+              <w:rPr>
+                <w:rFonts w:eastAsia="Times New Roman" w:cs="Times New Roman"/>
+                <w:szCs w:val="24"/>
+                <w:lang w:val="ru-RU"/>
+              </w:rPr>
+            </w:pPr>
+            <w:r>
+              <w:rPr>
+                <w:rFonts w:eastAsia="Times New Roman" w:cs="Times New Roman"/>
+                <w:szCs w:val="24"/>
+                <w:lang w:val="ru-RU"/>
+              </w:rPr>
+              <w:t>1. Пользователь не зарегистрирован.</w:t>
+            </w:r>
+            <w:r>
+              <w:rPr>
+                <w:rFonts w:eastAsia="Times New Roman" w:cs="Times New Roman"/>
+                <w:szCs w:val="24"/>
+                <w:lang w:val="ru-RU"/>
+              </w:rPr>
+              <w:br/>
+              <w:t xml:space="preserve">2. Известен </w:t>
+            </w:r>
+            <w:r>
+              <w:rPr>
+                <w:rFonts w:eastAsia="Times New Roman" w:cs="Times New Roman"/>
+                <w:szCs w:val="24"/>
+              </w:rPr>
+              <w:t>email</w:t>
+            </w:r>
+            <w:r>
+              <w:rPr>
+                <w:rFonts w:eastAsia="Times New Roman" w:cs="Times New Roman"/>
+                <w:szCs w:val="24"/>
+                <w:lang w:val="ru-RU"/>
+              </w:rPr>
+              <w:t xml:space="preserve"> уже существующего пользователя</w:t>
+            </w:r>
+            <w:r>
+              <w:rPr>
+                <w:rFonts w:eastAsia="Times New Roman" w:cs="Times New Roman"/>
+                <w:szCs w:val="24"/>
+                <w:lang w:val="ru-RU"/>
+              </w:rPr>
+              <w:t xml:space="preserve"> (</w:t>
+            </w:r>
+            <w:proofErr w:type="spellStart"/>
+            <w:r>
+              <w:rPr>
+                <w:rFonts w:eastAsia="Times New Roman" w:cs="Times New Roman"/>
+                <w:szCs w:val="24"/>
+              </w:rPr>
+              <w:t>alexandroesiano</w:t>
+            </w:r>
+            <w:proofErr w:type="spellEnd"/>
+            <w:r>
+              <w:rPr>
+                <w:rFonts w:eastAsia="Times New Roman" w:cs="Times New Roman"/>
+                <w:szCs w:val="24"/>
+                <w:lang w:val="ru-RU"/>
+              </w:rPr>
+              <w:t>@</w:t>
+            </w:r>
+            <w:r>
+              <w:rPr>
+                <w:rFonts w:eastAsia="Times New Roman" w:cs="Times New Roman"/>
+                <w:szCs w:val="24"/>
+              </w:rPr>
+              <w:t>mail</w:t>
+            </w:r>
+            <w:r>
+              <w:rPr>
+                <w:rFonts w:eastAsia="Times New Roman" w:cs="Times New Roman"/>
+                <w:szCs w:val="24"/>
+                <w:lang w:val="ru-RU"/>
+              </w:rPr>
+              <w:t>.</w:t>
+            </w:r>
+            <w:proofErr w:type="spellStart"/>
+            <w:r>
+              <w:rPr>
+                <w:rFonts w:eastAsia="Times New Roman" w:cs="Times New Roman"/>
+                <w:szCs w:val="24"/>
+              </w:rPr>
+              <w:t>ru</w:t>
+            </w:r>
+            <w:proofErr w:type="spellEnd"/>
+            <w:r>
+              <w:rPr>
+                <w:rFonts w:eastAsia="Times New Roman" w:cs="Times New Roman"/>
+                <w:szCs w:val="24"/>
+                <w:lang w:val="ru-RU"/>
+              </w:rPr>
+              <w:t>)</w:t>
+            </w:r>
+            <w:r>
+              <w:rPr>
+                <w:rFonts w:eastAsia="Times New Roman" w:cs="Times New Roman"/>
+                <w:szCs w:val="24"/>
+                <w:lang w:val="ru-RU"/>
+              </w:rPr>
+              <w:br/>
+              <w:t>3. Все остальные поля (</w:t>
+            </w:r>
+            <w:r>
+              <w:rPr>
+                <w:rFonts w:eastAsia="Times New Roman" w:cs="Times New Roman"/>
+                <w:szCs w:val="24"/>
+                <w:lang w:val="ru-RU"/>
+              </w:rPr>
+              <w:t>логин</w:t>
+            </w:r>
+            <w:r>
+              <w:rPr>
+                <w:rFonts w:eastAsia="Times New Roman" w:cs="Times New Roman"/>
+                <w:szCs w:val="24"/>
+                <w:lang w:val="ru-RU"/>
+              </w:rPr>
+              <w:t>, пароль) — валидные и свободные.</w:t>
+            </w:r>
+          </w:p>
+        </w:tc>
+        <w:tc>
+          <w:tcPr>
+            <w:tcW w:w="3260" w:type="dxa"/>
+          </w:tcPr>
+          <w:p>
+            <w:pPr>
+              <w:suppressAutoHyphens w:val="0"/>
+              <w:spacing w:line="240" w:lineRule="auto"/>
+              <w:rPr>
+                <w:rFonts w:eastAsia="Times New Roman" w:cs="Times New Roman"/>
+                <w:szCs w:val="24"/>
+                <w:lang w:val="ru-RU"/>
+              </w:rPr>
+            </w:pPr>
+            <w:r>
+              <w:rPr>
+                <w:rFonts w:eastAsia="Times New Roman" w:cs="Times New Roman"/>
+                <w:szCs w:val="24"/>
+                <w:lang w:val="ru-RU"/>
+              </w:rPr>
+              <w:t>1. Открыть сайт</w:t>
+            </w:r>
+            <w:r>
+              <w:rPr>
+                <w:rFonts w:eastAsia="Times New Roman" w:cs="Times New Roman"/>
+                <w:szCs w:val="24"/>
+              </w:rPr>
+              <w:t> </w:t>
+            </w:r>
+            <w:proofErr w:type="spellStart"/>
+            <w:r>
+              <w:rPr>
+                <w:rFonts w:eastAsia="Times New Roman" w:cs="Times New Roman"/>
+                <w:szCs w:val="24"/>
+              </w:rPr>
+              <w:t>P</w:t>
+            </w:r>
+            <w:r>
+              <w:rPr>
+                <w:rFonts w:eastAsia="Times New Roman" w:cs="Times New Roman"/>
+                <w:szCs w:val="24"/>
+              </w:rPr>
+              <w:t>ikabu</w:t>
+            </w:r>
+            <w:proofErr w:type="spellEnd"/>
+            <w:r>
+              <w:rPr>
+                <w:rFonts w:eastAsia="Times New Roman" w:cs="Times New Roman"/>
+                <w:szCs w:val="24"/>
+                <w:lang w:val="ru-RU"/>
+              </w:rPr>
+              <w:t>.</w:t>
+            </w:r>
+            <w:proofErr w:type="spellStart"/>
+            <w:r>
+              <w:rPr>
+                <w:rFonts w:eastAsia="Times New Roman" w:cs="Times New Roman"/>
+                <w:szCs w:val="24"/>
+              </w:rPr>
+              <w:t>ru</w:t>
+            </w:r>
+            <w:proofErr w:type="spellEnd"/>
+            <w:r>
+              <w:rPr>
+                <w:rFonts w:eastAsia="Times New Roman" w:cs="Times New Roman"/>
+                <w:szCs w:val="24"/>
+                <w:lang w:val="ru-RU"/>
+              </w:rPr>
+              <w:t>.</w:t>
+            </w:r>
+            <w:r>
+              <w:rPr>
+                <w:rFonts w:eastAsia="Times New Roman" w:cs="Times New Roman"/>
+                <w:szCs w:val="24"/>
+                <w:lang w:val="ru-RU"/>
+              </w:rPr>
+              <w:br/>
+              <w:t>2. Нажать кнопку «</w:t>
+            </w:r>
+            <w:r>
+              <w:rPr>
+                <w:rFonts w:eastAsia="Times New Roman" w:cs="Times New Roman"/>
+                <w:szCs w:val="24"/>
+                <w:lang w:val="ru-RU"/>
+              </w:rPr>
+              <w:t>Создать аккаунт</w:t>
+            </w:r>
+            <w:r>
+              <w:rPr>
+                <w:rFonts w:eastAsia="Times New Roman" w:cs="Times New Roman"/>
+                <w:szCs w:val="24"/>
+                <w:lang w:val="ru-RU"/>
+              </w:rPr>
+              <w:t>».</w:t>
+            </w:r>
+            <w:r>
+              <w:rPr>
+                <w:rFonts w:eastAsia="Times New Roman" w:cs="Times New Roman"/>
+                <w:szCs w:val="24"/>
+                <w:lang w:val="ru-RU"/>
+              </w:rPr>
+              <w:br/>
+              <w:t xml:space="preserve">3. Ввести существующий </w:t>
+            </w:r>
+            <w:r>
+              <w:rPr>
+                <w:rFonts w:eastAsia="Times New Roman" w:cs="Times New Roman"/>
+                <w:szCs w:val="24"/>
+              </w:rPr>
+              <w:t>email</w:t>
+            </w:r>
+            <w:r>
+              <w:rPr>
+                <w:rFonts w:eastAsia="Times New Roman" w:cs="Times New Roman"/>
+                <w:szCs w:val="24"/>
+              </w:rPr>
+              <w:t> </w:t>
+            </w:r>
+            <w:proofErr w:type="spellStart"/>
+            <w:r>
+              <w:rPr>
+                <w:rFonts w:eastAsia="Times New Roman" w:cs="Times New Roman"/>
+                <w:szCs w:val="24"/>
+              </w:rPr>
+              <w:t>alexandroesiano</w:t>
+            </w:r>
+            <w:proofErr w:type="spellEnd"/>
+            <w:r>
+              <w:rPr>
+                <w:rFonts w:eastAsia="Times New Roman" w:cs="Times New Roman"/>
+                <w:szCs w:val="24"/>
+                <w:lang w:val="ru-RU"/>
+              </w:rPr>
+              <w:t>@</w:t>
+            </w:r>
+            <w:r>
+              <w:rPr>
+                <w:rFonts w:eastAsia="Times New Roman" w:cs="Times New Roman"/>
+                <w:szCs w:val="24"/>
+              </w:rPr>
+              <w:t>mail</w:t>
+            </w:r>
+            <w:r>
+              <w:rPr>
+                <w:rFonts w:eastAsia="Times New Roman" w:cs="Times New Roman"/>
+                <w:szCs w:val="24"/>
+                <w:lang w:val="ru-RU"/>
+              </w:rPr>
+              <w:t>.</w:t>
+            </w:r>
+            <w:proofErr w:type="spellStart"/>
+            <w:r>
+              <w:rPr>
+                <w:rFonts w:eastAsia="Times New Roman" w:cs="Times New Roman"/>
+                <w:szCs w:val="24"/>
+              </w:rPr>
+              <w:t>ru</w:t>
+            </w:r>
+            <w:proofErr w:type="spellEnd"/>
+            <w:r>
+              <w:rPr>
+                <w:rFonts w:eastAsia="Times New Roman" w:cs="Times New Roman"/>
+                <w:szCs w:val="24"/>
+                <w:lang w:val="ru-RU"/>
+              </w:rPr>
+              <w:t>.</w:t>
+            </w:r>
+            <w:r>
+              <w:rPr>
+                <w:rFonts w:eastAsia="Times New Roman" w:cs="Times New Roman"/>
+                <w:szCs w:val="24"/>
+                <w:lang w:val="ru-RU"/>
+              </w:rPr>
+              <w:br/>
+              <w:t>4. Ввести валидный и свободный</w:t>
+            </w:r>
+            <w:r>
+              <w:rPr>
+                <w:rFonts w:eastAsia="Times New Roman" w:cs="Times New Roman"/>
+                <w:szCs w:val="24"/>
+                <w:lang w:val="ru-RU"/>
+              </w:rPr>
+              <w:t xml:space="preserve"> логин</w:t>
+            </w:r>
+            <w:r>
+              <w:rPr>
+                <w:rFonts w:eastAsia="Times New Roman" w:cs="Times New Roman"/>
+                <w:szCs w:val="24"/>
+                <w:lang w:val="ru-RU"/>
+              </w:rPr>
+              <w:t>.</w:t>
+            </w:r>
+            <w:r>
+              <w:rPr>
+                <w:rFonts w:eastAsia="Times New Roman" w:cs="Times New Roman"/>
+                <w:szCs w:val="24"/>
+                <w:lang w:val="ru-RU"/>
+              </w:rPr>
+              <w:br/>
+              <w:t>5. Ввести валидный пароль.</w:t>
+            </w:r>
+            <w:r>
+              <w:rPr>
+                <w:rFonts w:eastAsia="Times New Roman" w:cs="Times New Roman"/>
+                <w:szCs w:val="24"/>
+                <w:lang w:val="ru-RU"/>
+              </w:rPr>
+              <w:br/>
+            </w:r>
+            <w:r>
+              <w:rPr>
+                <w:rFonts w:eastAsia="Times New Roman" w:cs="Times New Roman"/>
+                <w:szCs w:val="24"/>
+                <w:lang w:val="ru-RU"/>
+              </w:rPr>
+              <w:t>6. Подтвердить согласие с правилами.</w:t>
+            </w:r>
+            <w:r>
+              <w:rPr>
+                <w:rFonts w:eastAsia="Times New Roman" w:cs="Times New Roman"/>
+                <w:szCs w:val="24"/>
+                <w:lang w:val="ru-RU"/>
+              </w:rPr>
+              <w:br/>
+              <w:t>7. Нажать кнопку «Зарегистрироваться».</w:t>
+            </w:r>
+          </w:p>
+        </w:tc>
+        <w:tc>
+          <w:tcPr>
+            <w:tcW w:w="2268" w:type="dxa"/>
+          </w:tcPr>
+          <w:p>
+            <w:pPr>
+              <w:suppressAutoHyphens w:val="0"/>
+              <w:spacing w:line="240" w:lineRule="auto"/>
+              <w:rPr>
+                <w:rFonts w:eastAsia="Times New Roman" w:cs="Times New Roman"/>
+                <w:szCs w:val="24"/>
+                <w:lang w:val="ru-RU"/>
+              </w:rPr>
+            </w:pPr>
+            <w:r>
+              <w:rPr>
+                <w:rFonts w:eastAsia="Times New Roman" w:cs="Times New Roman"/>
+                <w:szCs w:val="24"/>
+                <w:lang w:val="ru-RU"/>
+              </w:rPr>
+              <w:t>1. Регистрация</w:t>
+            </w:r>
+            <w:r>
+              <w:rPr>
+                <w:rFonts w:eastAsia="Times New Roman" w:cs="Times New Roman"/>
+                <w:szCs w:val="24"/>
+              </w:rPr>
+              <w:t> </w:t>
+            </w:r>
+            <w:r>
+              <w:rPr>
+                <w:rFonts w:eastAsia="Times New Roman" w:cs="Times New Roman"/>
+                <w:szCs w:val="24"/>
+                <w:lang w:val="ru-RU"/>
+              </w:rPr>
+              <w:t>не выполняется, пользователь остается на странице/в окне регистрации.</w:t>
+            </w:r>
+            <w:r>
+              <w:rPr>
+                <w:rFonts w:eastAsia="Times New Roman" w:cs="Times New Roman"/>
+                <w:szCs w:val="24"/>
+                <w:lang w:val="ru-RU"/>
+              </w:rPr>
+              <w:br/>
+              <w:t>2. Рядом с полем «</w:t>
+            </w:r>
+            <w:r>
+              <w:rPr>
+                <w:rFonts w:eastAsia="Times New Roman" w:cs="Times New Roman"/>
+                <w:szCs w:val="24"/>
+              </w:rPr>
+              <w:t>Email</w:t>
+            </w:r>
+            <w:r>
+              <w:rPr>
+                <w:rFonts w:eastAsia="Times New Roman" w:cs="Times New Roman"/>
+                <w:szCs w:val="24"/>
+                <w:lang w:val="ru-RU"/>
+              </w:rPr>
+              <w:t>» отображается сообщение об ошибке:</w:t>
+            </w:r>
+            <w:r>
+              <w:rPr>
+                <w:rFonts w:eastAsia="Times New Roman" w:cs="Times New Roman"/>
+                <w:szCs w:val="24"/>
+              </w:rPr>
+              <w:t> </w:t>
+            </w:r>
+            <w:r>
+              <w:rPr>
+                <w:rFonts w:eastAsia="Times New Roman" w:cs="Times New Roman"/>
+                <w:b/>
+                <w:bCs/>
+                <w:szCs w:val="24"/>
+                <w:lang w:val="ru-RU"/>
+              </w:rPr>
+              <w:t>«</w:t>
+            </w:r>
+            <w:r>
+              <w:rPr>
+                <w:rFonts w:eastAsia="Times New Roman" w:cs="Times New Roman"/>
+                <w:szCs w:val="24"/>
+                <w:lang w:val="ru-RU"/>
+              </w:rPr>
+              <w:t>Пользователь с таким логином уже существует»</w:t>
+            </w:r>
+            <w:r>
+              <w:rPr>
+                <w:rFonts w:eastAsia="Times New Roman" w:cs="Times New Roman"/>
+                <w:szCs w:val="24"/>
+              </w:rPr>
+              <w:t> </w:t>
+            </w:r>
+          </w:p>
+          <w:p>
+            <w:pPr>
+              <w:suppressAutoHyphens w:val="0"/>
+              <w:spacing w:line="240" w:lineRule="auto"/>
+              <w:rPr>
+                <w:rFonts w:eastAsia="Times New Roman" w:cs="Times New Roman"/>
+                <w:szCs w:val="24"/>
+                <w:lang w:val="ru-RU"/>
+              </w:rPr>
+            </w:pPr>
+            <w:r>
+              <w:rPr>
+                <w:rFonts w:eastAsia="Times New Roman" w:cs="Times New Roman"/>
+                <w:szCs w:val="24"/>
+                <w:lang w:val="ru-RU"/>
+              </w:rPr>
+              <w:t>3. Все остальные поля (</w:t>
+            </w:r>
+            <w:r>
+              <w:rPr>
+                <w:rFonts w:eastAsia="Times New Roman" w:cs="Times New Roman"/>
+                <w:szCs w:val="24"/>
+                <w:lang w:val="ru-RU"/>
+              </w:rPr>
+              <w:t>логин</w:t>
+            </w:r>
+            <w:r>
+              <w:rPr>
+                <w:rFonts w:eastAsia="Times New Roman" w:cs="Times New Roman"/>
+                <w:szCs w:val="24"/>
+                <w:lang w:val="ru-RU"/>
+              </w:rPr>
+              <w:t>, пароль)</w:t>
+            </w:r>
+            <w:r>
+              <w:rPr>
+                <w:rFonts w:eastAsia="Times New Roman" w:cs="Times New Roman"/>
+                <w:szCs w:val="24"/>
+              </w:rPr>
+              <w:t> </w:t>
+            </w:r>
+            <w:r>
+              <w:rPr>
+                <w:rFonts w:eastAsia="Times New Roman" w:cs="Times New Roman"/>
+                <w:szCs w:val="24"/>
+                <w:lang w:val="ru-RU"/>
+              </w:rPr>
+              <w:t>сохранили введенные значения.</w:t>
+            </w:r>
+          </w:p>
+        </w:tc>
+      </w:tr>
     </w:tbl>
     <w:p>
       <w:pPr>
@@ -13173,16 +13779,37 @@
     </w:p>
     <w:p>
       <w:pPr>
+        <w:suppressAutoHyphens w:val="0"/>
+        <w:spacing w:line="259" w:lineRule="auto"/>
+        <w:rPr>
+          <w:rFonts w:eastAsiaTheme="majorEastAsia" w:cstheme="majorBidi"/>
+          <w:b/>
+          <w:color w:val="000000" w:themeColor="text1"/>
+          <w:sz w:val="36"/>
+          <w:szCs w:val="32"/>
+          <w:lang w:val="ru-RU"/>
+        </w:rPr>
+      </w:pPr>
+      <w:r>
+        <w:rPr>
+          <w:lang w:val="ru-RU"/>
+        </w:rPr>
+        <w:br w:type="page"/>
+      </w:r>
+    </w:p>
+    <w:p>
+      <w:pPr>
         <w:pStyle w:val="1"/>
         <w:rPr>
           <w:lang w:val="ru-RU"/>
         </w:rPr>
       </w:pPr>
-      <w:bookmarkStart w:id="20" w:name="_Toc225997449"/>
-      <w:r>
-        <w:rPr>
-          <w:lang w:val="ru-RU"/>
-        </w:rPr>
+      <w:bookmarkStart w:id="20" w:name="_Toc226111032"/>
+      <w:r>
+        <w:rPr>
+          <w:lang w:val="ru-RU"/>
+        </w:rPr>
+        <w:lastRenderedPageBreak/>
         <w:t>Процесс тестирования</w:t>
       </w:r>
       <w:bookmarkEnd w:id="20"/>
@@ -13199,6 +13826,2092 @@
         </w:rPr>
         <w:br/>
       </w:r>
+      <w:r>
+        <w:rPr>
+          <w:lang w:val="ru-RU"/>
+        </w:rPr>
+        <w:t>Код</w:t>
+      </w:r>
+      <w:r>
+        <w:rPr>
+          <w:lang w:val="ru-RU"/>
+        </w:rPr>
+        <w:t xml:space="preserve">: </w:t>
+      </w:r>
+      <w:r>
+        <w:rPr>
+          <w:lang w:val="ru-RU"/>
+        </w:rPr>
+        <w:t xml:space="preserve"> </w:t>
+      </w:r>
+      <w:hyperlink r:id="rId20" w:history="1">
+        <w:r>
+          <w:rPr>
+            <w:rStyle w:val="a8"/>
+            <w:lang w:val="ru-RU"/>
+          </w:rPr>
+          <w:t>https://github.com/AlexandroLe/ITMO/tree/master/ТПО/Лаб3/selenium-project</w:t>
+        </w:r>
+      </w:hyperlink>
+      <w:r>
+        <w:rPr>
+          <w:lang w:val="ru-RU"/>
+        </w:rPr>
+        <w:t xml:space="preserve"> </w:t>
+      </w:r>
+    </w:p>
+    <w:p>
+      <w:pPr>
+        <w:rPr>
+          <w:lang w:val="ru-RU"/>
+        </w:rPr>
+      </w:pPr>
+      <w:r>
+        <w:rPr>
+          <w:noProof/>
+          <w:lang w:val="ru-RU"/>
+        </w:rPr>
+        <w:drawing>
+          <wp:inline distT="0" distB="0" distL="0" distR="0" wp14:anchorId="191965E7" wp14:editId="7E671A84">
+            <wp:extent cx="5540220" cy="1104996"/>
+            <wp:effectExtent l="0" t="0" r="3810" b="0"/>
+            <wp:docPr id="25" name="Рисунок 25"/>
+            <wp:cNvGraphicFramePr>
+              <a:graphicFrameLocks xmlns:a="http://schemas.openxmlformats.org/drawingml/2006/main" noChangeAspect="1"/>
+            </wp:cNvGraphicFramePr>
+            <a:graphic xmlns:a="http://schemas.openxmlformats.org/drawingml/2006/main">
+              <a:graphicData uri="http://schemas.openxmlformats.org/drawingml/2006/picture">
+                <pic:pic xmlns:pic="http://schemas.openxmlformats.org/drawingml/2006/picture">
+                  <pic:nvPicPr>
+                    <pic:cNvPr id="1" name=""/>
+                    <pic:cNvPicPr/>
+                  </pic:nvPicPr>
+                  <pic:blipFill>
+                    <a:blip r:embed="rId21"/>
+                    <a:stretch>
+                      <a:fillRect/>
+                    </a:stretch>
+                  </pic:blipFill>
+                  <pic:spPr>
+                    <a:xfrm>
+                      <a:off x="0" y="0"/>
+                      <a:ext cx="5540220" cy="1104996"/>
+                    </a:xfrm>
+                    <a:prstGeom prst="rect">
+                      <a:avLst/>
+                    </a:prstGeom>
+                  </pic:spPr>
+                </pic:pic>
+              </a:graphicData>
+            </a:graphic>
+          </wp:inline>
+        </w:drawing>
+      </w:r>
+    </w:p>
+    <w:p>
+      <w:r>
+        <w:t>TC_01</w:t>
+      </w:r>
+    </w:p>
+    <w:p>
+      <w:r>
+        <w:drawing>
+          <wp:inline distT="0" distB="0" distL="0" distR="0" wp14:anchorId="1B52A662" wp14:editId="0589FE61">
+            <wp:extent cx="6120130" cy="2490470"/>
+            <wp:effectExtent l="0" t="0" r="0" b="5080"/>
+            <wp:docPr id="36" name="Рисунок 36"/>
+            <wp:cNvGraphicFramePr>
+              <a:graphicFrameLocks xmlns:a="http://schemas.openxmlformats.org/drawingml/2006/main" noChangeAspect="1"/>
+            </wp:cNvGraphicFramePr>
+            <a:graphic xmlns:a="http://schemas.openxmlformats.org/drawingml/2006/main">
+              <a:graphicData uri="http://schemas.openxmlformats.org/drawingml/2006/picture">
+                <pic:pic xmlns:pic="http://schemas.openxmlformats.org/drawingml/2006/picture">
+                  <pic:nvPicPr>
+                    <pic:cNvPr id="1" name=""/>
+                    <pic:cNvPicPr/>
+                  </pic:nvPicPr>
+                  <pic:blipFill>
+                    <a:blip r:embed="rId22"/>
+                    <a:stretch>
+                      <a:fillRect/>
+                    </a:stretch>
+                  </pic:blipFill>
+                  <pic:spPr>
+                    <a:xfrm>
+                      <a:off x="0" y="0"/>
+                      <a:ext cx="6120130" cy="2490470"/>
+                    </a:xfrm>
+                    <a:prstGeom prst="rect">
+                      <a:avLst/>
+                    </a:prstGeom>
+                  </pic:spPr>
+                </pic:pic>
+              </a:graphicData>
+            </a:graphic>
+          </wp:inline>
+        </w:drawing>
+      </w:r>
+    </w:p>
+    <w:p>
+      <w:r>
+        <w:drawing>
+          <wp:inline distT="0" distB="0" distL="0" distR="0" wp14:anchorId="4A324109" wp14:editId="1F004072">
+            <wp:extent cx="6120130" cy="2546350"/>
+            <wp:effectExtent l="0" t="0" r="0" b="6350"/>
+            <wp:docPr id="37" name="Рисунок 37"/>
+            <wp:cNvGraphicFramePr>
+              <a:graphicFrameLocks xmlns:a="http://schemas.openxmlformats.org/drawingml/2006/main" noChangeAspect="1"/>
+            </wp:cNvGraphicFramePr>
+            <a:graphic xmlns:a="http://schemas.openxmlformats.org/drawingml/2006/main">
+              <a:graphicData uri="http://schemas.openxmlformats.org/drawingml/2006/picture">
+                <pic:pic xmlns:pic="http://schemas.openxmlformats.org/drawingml/2006/picture">
+                  <pic:nvPicPr>
+                    <pic:cNvPr id="1" name=""/>
+                    <pic:cNvPicPr/>
+                  </pic:nvPicPr>
+                  <pic:blipFill>
+                    <a:blip r:embed="rId23"/>
+                    <a:stretch>
+                      <a:fillRect/>
+                    </a:stretch>
+                  </pic:blipFill>
+                  <pic:spPr>
+                    <a:xfrm>
+                      <a:off x="0" y="0"/>
+                      <a:ext cx="6120130" cy="2546350"/>
+                    </a:xfrm>
+                    <a:prstGeom prst="rect">
+                      <a:avLst/>
+                    </a:prstGeom>
+                  </pic:spPr>
+                </pic:pic>
+              </a:graphicData>
+            </a:graphic>
+          </wp:inline>
+        </w:drawing>
+      </w:r>
+    </w:p>
+    <w:p/>
+    <w:p/>
+    <w:p/>
+    <w:p/>
+    <w:p/>
+    <w:p/>
+    <w:p/>
+    <w:p>
+      <w:r>
+        <w:t>TC_02</w:t>
+      </w:r>
+    </w:p>
+    <w:p>
+      <w:r>
+        <w:drawing>
+          <wp:inline distT="0" distB="0" distL="0" distR="0" wp14:anchorId="16C74E94" wp14:editId="266F9644">
+            <wp:extent cx="6120130" cy="2560320"/>
+            <wp:effectExtent l="0" t="0" r="0" b="0"/>
+            <wp:docPr id="26" name="Рисунок 26"/>
+            <wp:cNvGraphicFramePr>
+              <a:graphicFrameLocks xmlns:a="http://schemas.openxmlformats.org/drawingml/2006/main" noChangeAspect="1"/>
+            </wp:cNvGraphicFramePr>
+            <a:graphic xmlns:a="http://schemas.openxmlformats.org/drawingml/2006/main">
+              <a:graphicData uri="http://schemas.openxmlformats.org/drawingml/2006/picture">
+                <pic:pic xmlns:pic="http://schemas.openxmlformats.org/drawingml/2006/picture">
+                  <pic:nvPicPr>
+                    <pic:cNvPr id="1" name=""/>
+                    <pic:cNvPicPr/>
+                  </pic:nvPicPr>
+                  <pic:blipFill>
+                    <a:blip r:embed="rId24"/>
+                    <a:stretch>
+                      <a:fillRect/>
+                    </a:stretch>
+                  </pic:blipFill>
+                  <pic:spPr>
+                    <a:xfrm>
+                      <a:off x="0" y="0"/>
+                      <a:ext cx="6120130" cy="2560320"/>
+                    </a:xfrm>
+                    <a:prstGeom prst="rect">
+                      <a:avLst/>
+                    </a:prstGeom>
+                  </pic:spPr>
+                </pic:pic>
+              </a:graphicData>
+            </a:graphic>
+          </wp:inline>
+        </w:drawing>
+      </w:r>
+    </w:p>
+    <w:p>
+      <w:r>
+        <w:drawing>
+          <wp:inline distT="0" distB="0" distL="0" distR="0" wp14:anchorId="4FF28181" wp14:editId="7D086664">
+            <wp:extent cx="6120130" cy="2393315"/>
+            <wp:effectExtent l="0" t="0" r="0" b="6985"/>
+            <wp:docPr id="31" name="Рисунок 31"/>
+            <wp:cNvGraphicFramePr>
+              <a:graphicFrameLocks xmlns:a="http://schemas.openxmlformats.org/drawingml/2006/main" noChangeAspect="1"/>
+            </wp:cNvGraphicFramePr>
+            <a:graphic xmlns:a="http://schemas.openxmlformats.org/drawingml/2006/main">
+              <a:graphicData uri="http://schemas.openxmlformats.org/drawingml/2006/picture">
+                <pic:pic xmlns:pic="http://schemas.openxmlformats.org/drawingml/2006/picture">
+                  <pic:nvPicPr>
+                    <pic:cNvPr id="1" name=""/>
+                    <pic:cNvPicPr/>
+                  </pic:nvPicPr>
+                  <pic:blipFill>
+                    <a:blip r:embed="rId25"/>
+                    <a:stretch>
+                      <a:fillRect/>
+                    </a:stretch>
+                  </pic:blipFill>
+                  <pic:spPr>
+                    <a:xfrm>
+                      <a:off x="0" y="0"/>
+                      <a:ext cx="6120130" cy="2393315"/>
+                    </a:xfrm>
+                    <a:prstGeom prst="rect">
+                      <a:avLst/>
+                    </a:prstGeom>
+                  </pic:spPr>
+                </pic:pic>
+              </a:graphicData>
+            </a:graphic>
+          </wp:inline>
+        </w:drawing>
+      </w:r>
+    </w:p>
+    <w:p>
+      <w:pPr>
+        <w:rPr>
+          <w:lang w:val="ru-RU"/>
+        </w:rPr>
+      </w:pPr>
+    </w:p>
+    <w:p>
+      <w:r>
+        <w:t>TC_03</w:t>
+      </w:r>
+    </w:p>
+    <w:p>
+      <w:r>
+        <w:rPr>
+          <w:noProof/>
+        </w:rPr>
+        <w:drawing>
+          <wp:inline distT="0" distB="0" distL="0" distR="0" wp14:anchorId="6601A630" wp14:editId="3CEFB6F2">
+            <wp:extent cx="6120130" cy="2223770"/>
+            <wp:effectExtent l="0" t="0" r="0" b="5080"/>
+            <wp:docPr id="7" name="Рисунок 7"/>
+            <wp:cNvGraphicFramePr>
+              <a:graphicFrameLocks xmlns:a="http://schemas.openxmlformats.org/drawingml/2006/main" noChangeAspect="1"/>
+            </wp:cNvGraphicFramePr>
+            <a:graphic xmlns:a="http://schemas.openxmlformats.org/drawingml/2006/main">
+              <a:graphicData uri="http://schemas.openxmlformats.org/drawingml/2006/picture">
+                <pic:pic xmlns:pic="http://schemas.openxmlformats.org/drawingml/2006/picture">
+                  <pic:nvPicPr>
+                    <pic:cNvPr id="1" name=""/>
+                    <pic:cNvPicPr/>
+                  </pic:nvPicPr>
+                  <pic:blipFill>
+                    <a:blip r:embed="rId26"/>
+                    <a:stretch>
+                      <a:fillRect/>
+                    </a:stretch>
+                  </pic:blipFill>
+                  <pic:spPr>
+                    <a:xfrm>
+                      <a:off x="0" y="0"/>
+                      <a:ext cx="6120130" cy="2223770"/>
+                    </a:xfrm>
+                    <a:prstGeom prst="rect">
+                      <a:avLst/>
+                    </a:prstGeom>
+                  </pic:spPr>
+                </pic:pic>
+              </a:graphicData>
+            </a:graphic>
+          </wp:inline>
+        </w:drawing>
+      </w:r>
+    </w:p>
+    <w:p>
+      <w:r>
+        <w:rPr>
+          <w:noProof/>
+        </w:rPr>
+        <w:lastRenderedPageBreak/>
+        <w:drawing>
+          <wp:inline distT="0" distB="0" distL="0" distR="0" wp14:anchorId="34714914" wp14:editId="56320795">
+            <wp:extent cx="6120130" cy="1632585"/>
+            <wp:effectExtent l="0" t="0" r="0" b="5715"/>
+            <wp:docPr id="6" name="Рисунок 6"/>
+            <wp:cNvGraphicFramePr>
+              <a:graphicFrameLocks xmlns:a="http://schemas.openxmlformats.org/drawingml/2006/main" noChangeAspect="1"/>
+            </wp:cNvGraphicFramePr>
+            <a:graphic xmlns:a="http://schemas.openxmlformats.org/drawingml/2006/main">
+              <a:graphicData uri="http://schemas.openxmlformats.org/drawingml/2006/picture">
+                <pic:pic xmlns:pic="http://schemas.openxmlformats.org/drawingml/2006/picture">
+                  <pic:nvPicPr>
+                    <pic:cNvPr id="1" name=""/>
+                    <pic:cNvPicPr/>
+                  </pic:nvPicPr>
+                  <pic:blipFill>
+                    <a:blip r:embed="rId27"/>
+                    <a:stretch>
+                      <a:fillRect/>
+                    </a:stretch>
+                  </pic:blipFill>
+                  <pic:spPr>
+                    <a:xfrm>
+                      <a:off x="0" y="0"/>
+                      <a:ext cx="6120130" cy="1632585"/>
+                    </a:xfrm>
+                    <a:prstGeom prst="rect">
+                      <a:avLst/>
+                    </a:prstGeom>
+                  </pic:spPr>
+                </pic:pic>
+              </a:graphicData>
+            </a:graphic>
+          </wp:inline>
+        </w:drawing>
+      </w:r>
+    </w:p>
+    <w:p>
+      <w:r>
+        <w:t>TC_04</w:t>
+      </w:r>
+    </w:p>
+    <w:p>
+      <w:pPr>
+        <w:rPr>
+          <w:lang w:val="ru-RU"/>
+        </w:rPr>
+      </w:pPr>
+      <w:r>
+        <w:rPr>
+          <w:noProof/>
+          <w:lang w:val="ru-RU"/>
+        </w:rPr>
+        <w:drawing>
+          <wp:inline distT="0" distB="0" distL="0" distR="0" wp14:anchorId="75C531D2" wp14:editId="44A45A0D">
+            <wp:extent cx="6120130" cy="2396490"/>
+            <wp:effectExtent l="0" t="0" r="0" b="3810"/>
+            <wp:docPr id="4" name="Рисунок 4"/>
+            <wp:cNvGraphicFramePr>
+              <a:graphicFrameLocks xmlns:a="http://schemas.openxmlformats.org/drawingml/2006/main" noChangeAspect="1"/>
+            </wp:cNvGraphicFramePr>
+            <a:graphic xmlns:a="http://schemas.openxmlformats.org/drawingml/2006/main">
+              <a:graphicData uri="http://schemas.openxmlformats.org/drawingml/2006/picture">
+                <pic:pic xmlns:pic="http://schemas.openxmlformats.org/drawingml/2006/picture">
+                  <pic:nvPicPr>
+                    <pic:cNvPr id="1" name=""/>
+                    <pic:cNvPicPr/>
+                  </pic:nvPicPr>
+                  <pic:blipFill>
+                    <a:blip r:embed="rId28"/>
+                    <a:stretch>
+                      <a:fillRect/>
+                    </a:stretch>
+                  </pic:blipFill>
+                  <pic:spPr>
+                    <a:xfrm>
+                      <a:off x="0" y="0"/>
+                      <a:ext cx="6120130" cy="2396490"/>
+                    </a:xfrm>
+                    <a:prstGeom prst="rect">
+                      <a:avLst/>
+                    </a:prstGeom>
+                  </pic:spPr>
+                </pic:pic>
+              </a:graphicData>
+            </a:graphic>
+          </wp:inline>
+        </w:drawing>
+      </w:r>
+    </w:p>
+    <w:p>
+      <w:pPr>
+        <w:rPr>
+          <w:lang w:val="ru-RU"/>
+        </w:rPr>
+      </w:pPr>
+      <w:r>
+        <w:rPr>
+          <w:noProof/>
+          <w:lang w:val="ru-RU"/>
+        </w:rPr>
+        <w:drawing>
+          <wp:inline distT="0" distB="0" distL="0" distR="0" wp14:anchorId="2A9EDAE1" wp14:editId="3949DEE9">
+            <wp:extent cx="6120130" cy="1736090"/>
+            <wp:effectExtent l="0" t="0" r="0" b="0"/>
+            <wp:docPr id="5" name="Рисунок 5"/>
+            <wp:cNvGraphicFramePr>
+              <a:graphicFrameLocks xmlns:a="http://schemas.openxmlformats.org/drawingml/2006/main" noChangeAspect="1"/>
+            </wp:cNvGraphicFramePr>
+            <a:graphic xmlns:a="http://schemas.openxmlformats.org/drawingml/2006/main">
+              <a:graphicData uri="http://schemas.openxmlformats.org/drawingml/2006/picture">
+                <pic:pic xmlns:pic="http://schemas.openxmlformats.org/drawingml/2006/picture">
+                  <pic:nvPicPr>
+                    <pic:cNvPr id="1" name=""/>
+                    <pic:cNvPicPr/>
+                  </pic:nvPicPr>
+                  <pic:blipFill>
+                    <a:blip r:embed="rId29"/>
+                    <a:stretch>
+                      <a:fillRect/>
+                    </a:stretch>
+                  </pic:blipFill>
+                  <pic:spPr>
+                    <a:xfrm>
+                      <a:off x="0" y="0"/>
+                      <a:ext cx="6120130" cy="1736090"/>
+                    </a:xfrm>
+                    <a:prstGeom prst="rect">
+                      <a:avLst/>
+                    </a:prstGeom>
+                  </pic:spPr>
+                </pic:pic>
+              </a:graphicData>
+            </a:graphic>
+          </wp:inline>
+        </w:drawing>
+      </w:r>
+    </w:p>
+    <w:p>
+      <w:pPr>
+        <w:suppressAutoHyphens w:val="0"/>
+        <w:spacing w:line="259" w:lineRule="auto"/>
+      </w:pPr>
+      <w:r>
+        <w:br w:type="page"/>
+      </w:r>
+    </w:p>
+    <w:p>
+      <w:r>
+        <w:lastRenderedPageBreak/>
+        <w:t>TC_05</w:t>
+      </w:r>
+    </w:p>
+    <w:p>
+      <w:pPr>
+        <w:rPr>
+          <w:lang w:val="ru-RU"/>
+        </w:rPr>
+      </w:pPr>
+      <w:r>
+        <w:rPr>
+          <w:noProof/>
+          <w:lang w:val="ru-RU"/>
+        </w:rPr>
+        <w:drawing>
+          <wp:inline distT="0" distB="0" distL="0" distR="0" wp14:anchorId="0F1D2E2E" wp14:editId="62722D7C">
+            <wp:extent cx="6120130" cy="2748280"/>
+            <wp:effectExtent l="0" t="0" r="0" b="0"/>
+            <wp:docPr id="3" name="Рисунок 3"/>
+            <wp:cNvGraphicFramePr>
+              <a:graphicFrameLocks xmlns:a="http://schemas.openxmlformats.org/drawingml/2006/main" noChangeAspect="1"/>
+            </wp:cNvGraphicFramePr>
+            <a:graphic xmlns:a="http://schemas.openxmlformats.org/drawingml/2006/main">
+              <a:graphicData uri="http://schemas.openxmlformats.org/drawingml/2006/picture">
+                <pic:pic xmlns:pic="http://schemas.openxmlformats.org/drawingml/2006/picture">
+                  <pic:nvPicPr>
+                    <pic:cNvPr id="1" name=""/>
+                    <pic:cNvPicPr/>
+                  </pic:nvPicPr>
+                  <pic:blipFill>
+                    <a:blip r:embed="rId30"/>
+                    <a:stretch>
+                      <a:fillRect/>
+                    </a:stretch>
+                  </pic:blipFill>
+                  <pic:spPr>
+                    <a:xfrm>
+                      <a:off x="0" y="0"/>
+                      <a:ext cx="6120130" cy="2748280"/>
+                    </a:xfrm>
+                    <a:prstGeom prst="rect">
+                      <a:avLst/>
+                    </a:prstGeom>
+                  </pic:spPr>
+                </pic:pic>
+              </a:graphicData>
+            </a:graphic>
+          </wp:inline>
+        </w:drawing>
+      </w:r>
+    </w:p>
+    <w:p>
+      <w:pPr>
+        <w:rPr>
+          <w:lang w:val="ru-RU"/>
+        </w:rPr>
+      </w:pPr>
+      <w:r>
+        <w:rPr>
+          <w:lang w:val="ru-RU"/>
+        </w:rPr>
+        <w:br/>
+      </w:r>
+      <w:r>
+        <w:rPr>
+          <w:noProof/>
+          <w:lang w:val="ru-RU"/>
+        </w:rPr>
+        <w:drawing>
+          <wp:inline distT="0" distB="0" distL="0" distR="0" wp14:anchorId="508922A5" wp14:editId="1100CF8D">
+            <wp:extent cx="6120130" cy="2241550"/>
+            <wp:effectExtent l="0" t="0" r="0" b="6350"/>
+            <wp:docPr id="2" name="Рисунок 2"/>
+            <wp:cNvGraphicFramePr>
+              <a:graphicFrameLocks xmlns:a="http://schemas.openxmlformats.org/drawingml/2006/main" noChangeAspect="1"/>
+            </wp:cNvGraphicFramePr>
+            <a:graphic xmlns:a="http://schemas.openxmlformats.org/drawingml/2006/main">
+              <a:graphicData uri="http://schemas.openxmlformats.org/drawingml/2006/picture">
+                <pic:pic xmlns:pic="http://schemas.openxmlformats.org/drawingml/2006/picture">
+                  <pic:nvPicPr>
+                    <pic:cNvPr id="1" name=""/>
+                    <pic:cNvPicPr/>
+                  </pic:nvPicPr>
+                  <pic:blipFill>
+                    <a:blip r:embed="rId31"/>
+                    <a:stretch>
+                      <a:fillRect/>
+                    </a:stretch>
+                  </pic:blipFill>
+                  <pic:spPr>
+                    <a:xfrm>
+                      <a:off x="0" y="0"/>
+                      <a:ext cx="6120130" cy="2241550"/>
+                    </a:xfrm>
+                    <a:prstGeom prst="rect">
+                      <a:avLst/>
+                    </a:prstGeom>
+                  </pic:spPr>
+                </pic:pic>
+              </a:graphicData>
+            </a:graphic>
+          </wp:inline>
+        </w:drawing>
+      </w:r>
+    </w:p>
+    <w:p>
+      <w:r>
+        <w:t>TC_06</w:t>
+      </w:r>
+    </w:p>
+    <w:p>
+      <w:r>
+        <w:rPr>
+          <w:noProof/>
+        </w:rPr>
+        <w:drawing>
+          <wp:inline distT="0" distB="0" distL="0" distR="0" wp14:anchorId="01BE4D1F" wp14:editId="5B3FF898">
+            <wp:extent cx="6120130" cy="2519680"/>
+            <wp:effectExtent l="0" t="0" r="0" b="0"/>
+            <wp:docPr id="27" name="Рисунок 27"/>
+            <wp:cNvGraphicFramePr>
+              <a:graphicFrameLocks xmlns:a="http://schemas.openxmlformats.org/drawingml/2006/main" noChangeAspect="1"/>
+            </wp:cNvGraphicFramePr>
+            <a:graphic xmlns:a="http://schemas.openxmlformats.org/drawingml/2006/main">
+              <a:graphicData uri="http://schemas.openxmlformats.org/drawingml/2006/picture">
+                <pic:pic xmlns:pic="http://schemas.openxmlformats.org/drawingml/2006/picture">
+                  <pic:nvPicPr>
+                    <pic:cNvPr id="27" name="Рисунок 27"/>
+                    <pic:cNvPicPr/>
+                  </pic:nvPicPr>
+                  <pic:blipFill>
+                    <a:blip r:embed="rId32">
+                      <a:extLst>
+                        <a:ext uri="{28A0092B-C50C-407E-A947-70E740481C1C}">
+                          <a14:useLocalDpi xmlns:a14="http://schemas.microsoft.com/office/drawing/2010/main" val="0"/>
+                        </a:ext>
+                      </a:extLst>
+                    </a:blip>
+                    <a:stretch>
+                      <a:fillRect/>
+                    </a:stretch>
+                  </pic:blipFill>
+                  <pic:spPr>
+                    <a:xfrm>
+                      <a:off x="0" y="0"/>
+                      <a:ext cx="6120130" cy="2519680"/>
+                    </a:xfrm>
+                    <a:prstGeom prst="rect">
+                      <a:avLst/>
+                    </a:prstGeom>
+                  </pic:spPr>
+                </pic:pic>
+              </a:graphicData>
+            </a:graphic>
+          </wp:inline>
+        </w:drawing>
+      </w:r>
+    </w:p>
+    <w:p>
+      <w:r>
+        <w:rPr>
+          <w:noProof/>
+        </w:rPr>
+        <w:lastRenderedPageBreak/>
+        <w:drawing>
+          <wp:inline distT="0" distB="0" distL="0" distR="0" wp14:anchorId="01964231" wp14:editId="5ED9763C">
+            <wp:extent cx="6120130" cy="2486025"/>
+            <wp:effectExtent l="0" t="0" r="0" b="9525"/>
+            <wp:docPr id="28" name="Рисунок 28"/>
+            <wp:cNvGraphicFramePr>
+              <a:graphicFrameLocks xmlns:a="http://schemas.openxmlformats.org/drawingml/2006/main" noChangeAspect="1"/>
+            </wp:cNvGraphicFramePr>
+            <a:graphic xmlns:a="http://schemas.openxmlformats.org/drawingml/2006/main">
+              <a:graphicData uri="http://schemas.openxmlformats.org/drawingml/2006/picture">
+                <pic:pic xmlns:pic="http://schemas.openxmlformats.org/drawingml/2006/picture">
+                  <pic:nvPicPr>
+                    <pic:cNvPr id="28" name="Рисунок 28"/>
+                    <pic:cNvPicPr/>
+                  </pic:nvPicPr>
+                  <pic:blipFill>
+                    <a:blip r:embed="rId33">
+                      <a:extLst>
+                        <a:ext uri="{28A0092B-C50C-407E-A947-70E740481C1C}">
+                          <a14:useLocalDpi xmlns:a14="http://schemas.microsoft.com/office/drawing/2010/main" val="0"/>
+                        </a:ext>
+                      </a:extLst>
+                    </a:blip>
+                    <a:stretch>
+                      <a:fillRect/>
+                    </a:stretch>
+                  </pic:blipFill>
+                  <pic:spPr>
+                    <a:xfrm>
+                      <a:off x="0" y="0"/>
+                      <a:ext cx="6120130" cy="2486025"/>
+                    </a:xfrm>
+                    <a:prstGeom prst="rect">
+                      <a:avLst/>
+                    </a:prstGeom>
+                  </pic:spPr>
+                </pic:pic>
+              </a:graphicData>
+            </a:graphic>
+          </wp:inline>
+        </w:drawing>
+      </w:r>
+    </w:p>
+    <w:p>
+      <w:r>
+        <w:t>Tc_06A</w:t>
+      </w:r>
+    </w:p>
+    <w:p>
+      <w:pPr>
+        <w:rPr>
+          <w:lang w:val="ru-RU"/>
+        </w:rPr>
+      </w:pPr>
+      <w:r>
+        <w:rPr>
+          <w:noProof/>
+          <w:lang w:val="ru-RU"/>
+        </w:rPr>
+        <w:drawing>
+          <wp:inline distT="0" distB="0" distL="0" distR="0" wp14:anchorId="733D3AFC" wp14:editId="074F5435">
+            <wp:extent cx="6120130" cy="2548255"/>
+            <wp:effectExtent l="0" t="0" r="0" b="4445"/>
+            <wp:docPr id="29" name="Рисунок 29"/>
+            <wp:cNvGraphicFramePr>
+              <a:graphicFrameLocks xmlns:a="http://schemas.openxmlformats.org/drawingml/2006/main" noChangeAspect="1"/>
+            </wp:cNvGraphicFramePr>
+            <a:graphic xmlns:a="http://schemas.openxmlformats.org/drawingml/2006/main">
+              <a:graphicData uri="http://schemas.openxmlformats.org/drawingml/2006/picture">
+                <pic:pic xmlns:pic="http://schemas.openxmlformats.org/drawingml/2006/picture">
+                  <pic:nvPicPr>
+                    <pic:cNvPr id="29" name="Рисунок 29"/>
+                    <pic:cNvPicPr/>
+                  </pic:nvPicPr>
+                  <pic:blipFill>
+                    <a:blip r:embed="rId34">
+                      <a:extLst>
+                        <a:ext uri="{28A0092B-C50C-407E-A947-70E740481C1C}">
+                          <a14:useLocalDpi xmlns:a14="http://schemas.microsoft.com/office/drawing/2010/main" val="0"/>
+                        </a:ext>
+                      </a:extLst>
+                    </a:blip>
+                    <a:stretch>
+                      <a:fillRect/>
+                    </a:stretch>
+                  </pic:blipFill>
+                  <pic:spPr>
+                    <a:xfrm>
+                      <a:off x="0" y="0"/>
+                      <a:ext cx="6120130" cy="2548255"/>
+                    </a:xfrm>
+                    <a:prstGeom prst="rect">
+                      <a:avLst/>
+                    </a:prstGeom>
+                  </pic:spPr>
+                </pic:pic>
+              </a:graphicData>
+            </a:graphic>
+          </wp:inline>
+        </w:drawing>
+      </w:r>
+    </w:p>
+    <w:p>
+      <w:pPr>
+        <w:rPr>
+          <w:lang w:val="ru-RU"/>
+        </w:rPr>
+      </w:pPr>
+      <w:r>
+        <w:rPr>
+          <w:noProof/>
+          <w:lang w:val="ru-RU"/>
+        </w:rPr>
+        <w:drawing>
+          <wp:inline distT="0" distB="0" distL="0" distR="0" wp14:anchorId="342427E8" wp14:editId="3A2237DC">
+            <wp:extent cx="6120130" cy="2510155"/>
+            <wp:effectExtent l="0" t="0" r="0" b="4445"/>
+            <wp:docPr id="30" name="Рисунок 30"/>
+            <wp:cNvGraphicFramePr>
+              <a:graphicFrameLocks xmlns:a="http://schemas.openxmlformats.org/drawingml/2006/main" noChangeAspect="1"/>
+            </wp:cNvGraphicFramePr>
+            <a:graphic xmlns:a="http://schemas.openxmlformats.org/drawingml/2006/main">
+              <a:graphicData uri="http://schemas.openxmlformats.org/drawingml/2006/picture">
+                <pic:pic xmlns:pic="http://schemas.openxmlformats.org/drawingml/2006/picture">
+                  <pic:nvPicPr>
+                    <pic:cNvPr id="30" name="Рисунок 30"/>
+                    <pic:cNvPicPr/>
+                  </pic:nvPicPr>
+                  <pic:blipFill>
+                    <a:blip r:embed="rId35">
+                      <a:extLst>
+                        <a:ext uri="{28A0092B-C50C-407E-A947-70E740481C1C}">
+                          <a14:useLocalDpi xmlns:a14="http://schemas.microsoft.com/office/drawing/2010/main" val="0"/>
+                        </a:ext>
+                      </a:extLst>
+                    </a:blip>
+                    <a:stretch>
+                      <a:fillRect/>
+                    </a:stretch>
+                  </pic:blipFill>
+                  <pic:spPr>
+                    <a:xfrm>
+                      <a:off x="0" y="0"/>
+                      <a:ext cx="6120130" cy="2510155"/>
+                    </a:xfrm>
+                    <a:prstGeom prst="rect">
+                      <a:avLst/>
+                    </a:prstGeom>
+                  </pic:spPr>
+                </pic:pic>
+              </a:graphicData>
+            </a:graphic>
+          </wp:inline>
+        </w:drawing>
+      </w:r>
+    </w:p>
+    <w:p>
+      <w:pPr>
+        <w:suppressAutoHyphens w:val="0"/>
+        <w:spacing w:line="259" w:lineRule="auto"/>
+      </w:pPr>
+      <w:r>
+        <w:br w:type="page"/>
+      </w:r>
+    </w:p>
+    <w:p>
+      <w:r>
+        <w:lastRenderedPageBreak/>
+        <w:t>TC_07</w:t>
+      </w:r>
+    </w:p>
+    <w:p>
+      <w:pPr>
+        <w:rPr>
+          <w:lang w:val="ru-RU"/>
+        </w:rPr>
+      </w:pPr>
+      <w:r>
+        <w:rPr>
+          <w:noProof/>
+        </w:rPr>
+        <w:drawing>
+          <wp:inline distT="0" distB="0" distL="0" distR="0" wp14:anchorId="1EE4220A" wp14:editId="40FAEE33">
+            <wp:extent cx="6120130" cy="2247900"/>
+            <wp:effectExtent l="0" t="0" r="0" b="0"/>
+            <wp:docPr id="10" name="Рисунок 10"/>
+            <wp:cNvGraphicFramePr>
+              <a:graphicFrameLocks xmlns:a="http://schemas.openxmlformats.org/drawingml/2006/main" noChangeAspect="1"/>
+            </wp:cNvGraphicFramePr>
+            <a:graphic xmlns:a="http://schemas.openxmlformats.org/drawingml/2006/main">
+              <a:graphicData uri="http://schemas.openxmlformats.org/drawingml/2006/picture">
+                <pic:pic xmlns:pic="http://schemas.openxmlformats.org/drawingml/2006/picture">
+                  <pic:nvPicPr>
+                    <pic:cNvPr id="1" name=""/>
+                    <pic:cNvPicPr/>
+                  </pic:nvPicPr>
+                  <pic:blipFill>
+                    <a:blip r:embed="rId36"/>
+                    <a:stretch>
+                      <a:fillRect/>
+                    </a:stretch>
+                  </pic:blipFill>
+                  <pic:spPr>
+                    <a:xfrm>
+                      <a:off x="0" y="0"/>
+                      <a:ext cx="6120130" cy="2247900"/>
+                    </a:xfrm>
+                    <a:prstGeom prst="rect">
+                      <a:avLst/>
+                    </a:prstGeom>
+                  </pic:spPr>
+                </pic:pic>
+              </a:graphicData>
+            </a:graphic>
+          </wp:inline>
+        </w:drawing>
+      </w:r>
+    </w:p>
+    <w:p>
+      <w:r>
+        <w:rPr>
+          <w:noProof/>
+        </w:rPr>
+        <w:drawing>
+          <wp:inline distT="0" distB="0" distL="0" distR="0" wp14:anchorId="6EA291EF" wp14:editId="021A2DCA">
+            <wp:extent cx="6120130" cy="1642110"/>
+            <wp:effectExtent l="0" t="0" r="0" b="0"/>
+            <wp:docPr id="9" name="Рисунок 9"/>
+            <wp:cNvGraphicFramePr>
+              <a:graphicFrameLocks xmlns:a="http://schemas.openxmlformats.org/drawingml/2006/main" noChangeAspect="1"/>
+            </wp:cNvGraphicFramePr>
+            <a:graphic xmlns:a="http://schemas.openxmlformats.org/drawingml/2006/main">
+              <a:graphicData uri="http://schemas.openxmlformats.org/drawingml/2006/picture">
+                <pic:pic xmlns:pic="http://schemas.openxmlformats.org/drawingml/2006/picture">
+                  <pic:nvPicPr>
+                    <pic:cNvPr id="1" name=""/>
+                    <pic:cNvPicPr/>
+                  </pic:nvPicPr>
+                  <pic:blipFill>
+                    <a:blip r:embed="rId37"/>
+                    <a:stretch>
+                      <a:fillRect/>
+                    </a:stretch>
+                  </pic:blipFill>
+                  <pic:spPr>
+                    <a:xfrm>
+                      <a:off x="0" y="0"/>
+                      <a:ext cx="6120130" cy="1642110"/>
+                    </a:xfrm>
+                    <a:prstGeom prst="rect">
+                      <a:avLst/>
+                    </a:prstGeom>
+                  </pic:spPr>
+                </pic:pic>
+              </a:graphicData>
+            </a:graphic>
+          </wp:inline>
+        </w:drawing>
+      </w:r>
+    </w:p>
+    <w:p>
+      <w:pPr>
+        <w:rPr>
+          <w:lang w:val="ru-RU"/>
+        </w:rPr>
+      </w:pPr>
+      <w:r>
+        <w:t>TC_0</w:t>
+      </w:r>
+      <w:r>
+        <w:rPr>
+          <w:lang w:val="ru-RU"/>
+        </w:rPr>
+        <w:t>8</w:t>
+      </w:r>
+    </w:p>
+    <w:p>
+      <w:pPr>
+        <w:rPr>
+          <w:lang w:val="ru-RU"/>
+        </w:rPr>
+      </w:pPr>
+      <w:r>
+        <w:drawing>
+          <wp:inline distT="0" distB="0" distL="0" distR="0" wp14:anchorId="09A0596C" wp14:editId="00C1E4FF">
+            <wp:extent cx="6120130" cy="2510155"/>
+            <wp:effectExtent l="0" t="0" r="0" b="4445"/>
+            <wp:docPr id="34" name="Рисунок 34"/>
+            <wp:cNvGraphicFramePr>
+              <a:graphicFrameLocks xmlns:a="http://schemas.openxmlformats.org/drawingml/2006/main" noChangeAspect="1"/>
+            </wp:cNvGraphicFramePr>
+            <a:graphic xmlns:a="http://schemas.openxmlformats.org/drawingml/2006/main">
+              <a:graphicData uri="http://schemas.openxmlformats.org/drawingml/2006/picture">
+                <pic:pic xmlns:pic="http://schemas.openxmlformats.org/drawingml/2006/picture">
+                  <pic:nvPicPr>
+                    <pic:cNvPr id="1" name=""/>
+                    <pic:cNvPicPr/>
+                  </pic:nvPicPr>
+                  <pic:blipFill>
+                    <a:blip r:embed="rId38"/>
+                    <a:stretch>
+                      <a:fillRect/>
+                    </a:stretch>
+                  </pic:blipFill>
+                  <pic:spPr>
+                    <a:xfrm>
+                      <a:off x="0" y="0"/>
+                      <a:ext cx="6120130" cy="2510155"/>
+                    </a:xfrm>
+                    <a:prstGeom prst="rect">
+                      <a:avLst/>
+                    </a:prstGeom>
+                  </pic:spPr>
+                </pic:pic>
+              </a:graphicData>
+            </a:graphic>
+          </wp:inline>
+        </w:drawing>
+      </w:r>
+    </w:p>
+    <w:p>
+      <w:pPr>
+        <w:rPr>
+          <w:lang w:val="ru-RU"/>
+        </w:rPr>
+      </w:pPr>
+      <w:r>
+        <w:rPr>
+          <w:lang w:val="ru-RU"/>
+        </w:rPr>
+        <w:lastRenderedPageBreak/>
+        <w:drawing>
+          <wp:inline distT="0" distB="0" distL="0" distR="0" wp14:anchorId="0F1B1B83" wp14:editId="77789D2F">
+            <wp:extent cx="6120130" cy="2504440"/>
+            <wp:effectExtent l="0" t="0" r="0" b="0"/>
+            <wp:docPr id="35" name="Рисунок 35"/>
+            <wp:cNvGraphicFramePr>
+              <a:graphicFrameLocks xmlns:a="http://schemas.openxmlformats.org/drawingml/2006/main" noChangeAspect="1"/>
+            </wp:cNvGraphicFramePr>
+            <a:graphic xmlns:a="http://schemas.openxmlformats.org/drawingml/2006/main">
+              <a:graphicData uri="http://schemas.openxmlformats.org/drawingml/2006/picture">
+                <pic:pic xmlns:pic="http://schemas.openxmlformats.org/drawingml/2006/picture">
+                  <pic:nvPicPr>
+                    <pic:cNvPr id="1" name=""/>
+                    <pic:cNvPicPr/>
+                  </pic:nvPicPr>
+                  <pic:blipFill>
+                    <a:blip r:embed="rId39"/>
+                    <a:stretch>
+                      <a:fillRect/>
+                    </a:stretch>
+                  </pic:blipFill>
+                  <pic:spPr>
+                    <a:xfrm>
+                      <a:off x="0" y="0"/>
+                      <a:ext cx="6120130" cy="2504440"/>
+                    </a:xfrm>
+                    <a:prstGeom prst="rect">
+                      <a:avLst/>
+                    </a:prstGeom>
+                  </pic:spPr>
+                </pic:pic>
+              </a:graphicData>
+            </a:graphic>
+          </wp:inline>
+        </w:drawing>
+      </w:r>
+    </w:p>
+    <w:p>
+      <w:r>
+        <w:t>TC_09</w:t>
+      </w:r>
+    </w:p>
+    <w:p>
+      <w:r>
+        <w:rPr>
+          <w:noProof/>
+        </w:rPr>
+        <w:drawing>
+          <wp:inline distT="0" distB="0" distL="0" distR="0" wp14:anchorId="768552FC" wp14:editId="25B80301">
+            <wp:extent cx="6120130" cy="2217420"/>
+            <wp:effectExtent l="0" t="0" r="0" b="0"/>
+            <wp:docPr id="11" name="Рисунок 11"/>
+            <wp:cNvGraphicFramePr>
+              <a:graphicFrameLocks xmlns:a="http://schemas.openxmlformats.org/drawingml/2006/main" noChangeAspect="1"/>
+            </wp:cNvGraphicFramePr>
+            <a:graphic xmlns:a="http://schemas.openxmlformats.org/drawingml/2006/main">
+              <a:graphicData uri="http://schemas.openxmlformats.org/drawingml/2006/picture">
+                <pic:pic xmlns:pic="http://schemas.openxmlformats.org/drawingml/2006/picture">
+                  <pic:nvPicPr>
+                    <pic:cNvPr id="1" name=""/>
+                    <pic:cNvPicPr/>
+                  </pic:nvPicPr>
+                  <pic:blipFill>
+                    <a:blip r:embed="rId40"/>
+                    <a:stretch>
+                      <a:fillRect/>
+                    </a:stretch>
+                  </pic:blipFill>
+                  <pic:spPr>
+                    <a:xfrm>
+                      <a:off x="0" y="0"/>
+                      <a:ext cx="6120130" cy="2217420"/>
+                    </a:xfrm>
+                    <a:prstGeom prst="rect">
+                      <a:avLst/>
+                    </a:prstGeom>
+                  </pic:spPr>
+                </pic:pic>
+              </a:graphicData>
+            </a:graphic>
+          </wp:inline>
+        </w:drawing>
+      </w:r>
+    </w:p>
+    <w:p>
+      <w:r>
+        <w:rPr>
+          <w:noProof/>
+        </w:rPr>
+        <w:drawing>
+          <wp:inline distT="0" distB="0" distL="0" distR="0" wp14:anchorId="57E8F982" wp14:editId="52DD7046">
+            <wp:extent cx="6120130" cy="1607185"/>
+            <wp:effectExtent l="0" t="0" r="0" b="0"/>
+            <wp:docPr id="13" name="Рисунок 13"/>
+            <wp:cNvGraphicFramePr>
+              <a:graphicFrameLocks xmlns:a="http://schemas.openxmlformats.org/drawingml/2006/main" noChangeAspect="1"/>
+            </wp:cNvGraphicFramePr>
+            <a:graphic xmlns:a="http://schemas.openxmlformats.org/drawingml/2006/main">
+              <a:graphicData uri="http://schemas.openxmlformats.org/drawingml/2006/picture">
+                <pic:pic xmlns:pic="http://schemas.openxmlformats.org/drawingml/2006/picture">
+                  <pic:nvPicPr>
+                    <pic:cNvPr id="1" name=""/>
+                    <pic:cNvPicPr/>
+                  </pic:nvPicPr>
+                  <pic:blipFill>
+                    <a:blip r:embed="rId41"/>
+                    <a:stretch>
+                      <a:fillRect/>
+                    </a:stretch>
+                  </pic:blipFill>
+                  <pic:spPr>
+                    <a:xfrm>
+                      <a:off x="0" y="0"/>
+                      <a:ext cx="6120130" cy="1607185"/>
+                    </a:xfrm>
+                    <a:prstGeom prst="rect">
+                      <a:avLst/>
+                    </a:prstGeom>
+                  </pic:spPr>
+                </pic:pic>
+              </a:graphicData>
+            </a:graphic>
+          </wp:inline>
+        </w:drawing>
+      </w:r>
+    </w:p>
+    <w:p>
+      <w:pPr>
+        <w:suppressAutoHyphens w:val="0"/>
+        <w:spacing w:line="259" w:lineRule="auto"/>
+      </w:pPr>
+      <w:r>
+        <w:br w:type="page"/>
+      </w:r>
+    </w:p>
+    <w:p>
+      <w:r>
+        <w:lastRenderedPageBreak/>
+        <w:t>TC_10</w:t>
+      </w:r>
+    </w:p>
+    <w:p>
+      <w:r>
+        <w:rPr>
+          <w:noProof/>
+        </w:rPr>
+        <w:drawing>
+          <wp:inline distT="0" distB="0" distL="0" distR="0" wp14:anchorId="4A7352D1" wp14:editId="7270E608">
+            <wp:extent cx="6120130" cy="2131695"/>
+            <wp:effectExtent l="0" t="0" r="0" b="1905"/>
+            <wp:docPr id="12" name="Рисунок 12"/>
+            <wp:cNvGraphicFramePr>
+              <a:graphicFrameLocks xmlns:a="http://schemas.openxmlformats.org/drawingml/2006/main" noChangeAspect="1"/>
+            </wp:cNvGraphicFramePr>
+            <a:graphic xmlns:a="http://schemas.openxmlformats.org/drawingml/2006/main">
+              <a:graphicData uri="http://schemas.openxmlformats.org/drawingml/2006/picture">
+                <pic:pic xmlns:pic="http://schemas.openxmlformats.org/drawingml/2006/picture">
+                  <pic:nvPicPr>
+                    <pic:cNvPr id="1" name=""/>
+                    <pic:cNvPicPr/>
+                  </pic:nvPicPr>
+                  <pic:blipFill>
+                    <a:blip r:embed="rId42"/>
+                    <a:stretch>
+                      <a:fillRect/>
+                    </a:stretch>
+                  </pic:blipFill>
+                  <pic:spPr>
+                    <a:xfrm>
+                      <a:off x="0" y="0"/>
+                      <a:ext cx="6120130" cy="2131695"/>
+                    </a:xfrm>
+                    <a:prstGeom prst="rect">
+                      <a:avLst/>
+                    </a:prstGeom>
+                  </pic:spPr>
+                </pic:pic>
+              </a:graphicData>
+            </a:graphic>
+          </wp:inline>
+        </w:drawing>
+      </w:r>
+    </w:p>
+    <w:p>
+      <w:r>
+        <w:rPr>
+          <w:noProof/>
+        </w:rPr>
+        <w:drawing>
+          <wp:inline distT="0" distB="0" distL="0" distR="0" wp14:anchorId="16E60564" wp14:editId="291133A9">
+            <wp:extent cx="6120130" cy="1556385"/>
+            <wp:effectExtent l="0" t="0" r="0" b="5715"/>
+            <wp:docPr id="14" name="Рисунок 14"/>
+            <wp:cNvGraphicFramePr>
+              <a:graphicFrameLocks xmlns:a="http://schemas.openxmlformats.org/drawingml/2006/main" noChangeAspect="1"/>
+            </wp:cNvGraphicFramePr>
+            <a:graphic xmlns:a="http://schemas.openxmlformats.org/drawingml/2006/main">
+              <a:graphicData uri="http://schemas.openxmlformats.org/drawingml/2006/picture">
+                <pic:pic xmlns:pic="http://schemas.openxmlformats.org/drawingml/2006/picture">
+                  <pic:nvPicPr>
+                    <pic:cNvPr id="1" name=""/>
+                    <pic:cNvPicPr/>
+                  </pic:nvPicPr>
+                  <pic:blipFill>
+                    <a:blip r:embed="rId43"/>
+                    <a:stretch>
+                      <a:fillRect/>
+                    </a:stretch>
+                  </pic:blipFill>
+                  <pic:spPr>
+                    <a:xfrm>
+                      <a:off x="0" y="0"/>
+                      <a:ext cx="6120130" cy="1556385"/>
+                    </a:xfrm>
+                    <a:prstGeom prst="rect">
+                      <a:avLst/>
+                    </a:prstGeom>
+                  </pic:spPr>
+                </pic:pic>
+              </a:graphicData>
+            </a:graphic>
+          </wp:inline>
+        </w:drawing>
+      </w:r>
+    </w:p>
+    <w:p/>
+    <w:p>
+      <w:r>
+        <w:t>TC_11</w:t>
+      </w:r>
+    </w:p>
+    <w:p>
+      <w:r>
+        <w:rPr>
+          <w:noProof/>
+        </w:rPr>
+        <w:drawing>
+          <wp:inline distT="0" distB="0" distL="0" distR="0" wp14:anchorId="6426A8F2" wp14:editId="42371A4E">
+            <wp:extent cx="6120130" cy="2175510"/>
+            <wp:effectExtent l="0" t="0" r="0" b="0"/>
+            <wp:docPr id="15" name="Рисунок 15"/>
+            <wp:cNvGraphicFramePr>
+              <a:graphicFrameLocks xmlns:a="http://schemas.openxmlformats.org/drawingml/2006/main" noChangeAspect="1"/>
+            </wp:cNvGraphicFramePr>
+            <a:graphic xmlns:a="http://schemas.openxmlformats.org/drawingml/2006/main">
+              <a:graphicData uri="http://schemas.openxmlformats.org/drawingml/2006/picture">
+                <pic:pic xmlns:pic="http://schemas.openxmlformats.org/drawingml/2006/picture">
+                  <pic:nvPicPr>
+                    <pic:cNvPr id="1" name=""/>
+                    <pic:cNvPicPr/>
+                  </pic:nvPicPr>
+                  <pic:blipFill>
+                    <a:blip r:embed="rId44"/>
+                    <a:stretch>
+                      <a:fillRect/>
+                    </a:stretch>
+                  </pic:blipFill>
+                  <pic:spPr>
+                    <a:xfrm>
+                      <a:off x="0" y="0"/>
+                      <a:ext cx="6120130" cy="2175510"/>
+                    </a:xfrm>
+                    <a:prstGeom prst="rect">
+                      <a:avLst/>
+                    </a:prstGeom>
+                  </pic:spPr>
+                </pic:pic>
+              </a:graphicData>
+            </a:graphic>
+          </wp:inline>
+        </w:drawing>
+      </w:r>
+    </w:p>
+    <w:p>
+      <w:r>
+        <w:rPr>
+          <w:noProof/>
+        </w:rPr>
+        <w:drawing>
+          <wp:inline distT="0" distB="0" distL="0" distR="0" wp14:anchorId="228DEC61" wp14:editId="5012B150">
+            <wp:extent cx="6120130" cy="1574165"/>
+            <wp:effectExtent l="0" t="0" r="0" b="6985"/>
+            <wp:docPr id="16" name="Рисунок 16"/>
+            <wp:cNvGraphicFramePr>
+              <a:graphicFrameLocks xmlns:a="http://schemas.openxmlformats.org/drawingml/2006/main" noChangeAspect="1"/>
+            </wp:cNvGraphicFramePr>
+            <a:graphic xmlns:a="http://schemas.openxmlformats.org/drawingml/2006/main">
+              <a:graphicData uri="http://schemas.openxmlformats.org/drawingml/2006/picture">
+                <pic:pic xmlns:pic="http://schemas.openxmlformats.org/drawingml/2006/picture">
+                  <pic:nvPicPr>
+                    <pic:cNvPr id="1" name=""/>
+                    <pic:cNvPicPr/>
+                  </pic:nvPicPr>
+                  <pic:blipFill>
+                    <a:blip r:embed="rId45"/>
+                    <a:stretch>
+                      <a:fillRect/>
+                    </a:stretch>
+                  </pic:blipFill>
+                  <pic:spPr>
+                    <a:xfrm>
+                      <a:off x="0" y="0"/>
+                      <a:ext cx="6120130" cy="1574165"/>
+                    </a:xfrm>
+                    <a:prstGeom prst="rect">
+                      <a:avLst/>
+                    </a:prstGeom>
+                  </pic:spPr>
+                </pic:pic>
+              </a:graphicData>
+            </a:graphic>
+          </wp:inline>
+        </w:drawing>
+      </w:r>
+    </w:p>
+    <w:p/>
+    <w:p>
+      <w:pPr>
+        <w:suppressAutoHyphens w:val="0"/>
+        <w:spacing w:line="259" w:lineRule="auto"/>
+      </w:pPr>
+      <w:r>
+        <w:br w:type="page"/>
+      </w:r>
+    </w:p>
+    <w:p>
+      <w:r>
+        <w:lastRenderedPageBreak/>
+        <w:t>TC_12</w:t>
+      </w:r>
+    </w:p>
+    <w:p>
+      <w:pPr>
+        <w:rPr>
+          <w:lang w:val="ru-RU"/>
+        </w:rPr>
+      </w:pPr>
+      <w:r>
+        <w:rPr>
+          <w:noProof/>
+        </w:rPr>
+        <w:drawing>
+          <wp:inline distT="0" distB="0" distL="0" distR="0" wp14:anchorId="66710E4C" wp14:editId="262BEA6A">
+            <wp:extent cx="6120130" cy="2357120"/>
+            <wp:effectExtent l="0" t="0" r="0" b="5080"/>
+            <wp:docPr id="32" name="Рисунок 32"/>
+            <wp:cNvGraphicFramePr>
+              <a:graphicFrameLocks xmlns:a="http://schemas.openxmlformats.org/drawingml/2006/main" noChangeAspect="1"/>
+            </wp:cNvGraphicFramePr>
+            <a:graphic xmlns:a="http://schemas.openxmlformats.org/drawingml/2006/main">
+              <a:graphicData uri="http://schemas.openxmlformats.org/drawingml/2006/picture">
+                <pic:pic xmlns:pic="http://schemas.openxmlformats.org/drawingml/2006/picture">
+                  <pic:nvPicPr>
+                    <pic:cNvPr id="32" name="Рисунок 32"/>
+                    <pic:cNvPicPr/>
+                  </pic:nvPicPr>
+                  <pic:blipFill>
+                    <a:blip r:embed="rId46">
+                      <a:extLst>
+                        <a:ext uri="{28A0092B-C50C-407E-A947-70E740481C1C}">
+                          <a14:useLocalDpi xmlns:a14="http://schemas.microsoft.com/office/drawing/2010/main" val="0"/>
+                        </a:ext>
+                      </a:extLst>
+                    </a:blip>
+                    <a:stretch>
+                      <a:fillRect/>
+                    </a:stretch>
+                  </pic:blipFill>
+                  <pic:spPr>
+                    <a:xfrm>
+                      <a:off x="0" y="0"/>
+                      <a:ext cx="6120130" cy="2357120"/>
+                    </a:xfrm>
+                    <a:prstGeom prst="rect">
+                      <a:avLst/>
+                    </a:prstGeom>
+                  </pic:spPr>
+                </pic:pic>
+              </a:graphicData>
+            </a:graphic>
+          </wp:inline>
+        </w:drawing>
+      </w:r>
+    </w:p>
+    <w:p>
+      <w:pPr>
+        <w:rPr>
+          <w:lang w:val="ru-RU"/>
+        </w:rPr>
+      </w:pPr>
+      <w:r>
+        <w:rPr>
+          <w:lang w:val="ru-RU"/>
+        </w:rPr>
+        <w:drawing>
+          <wp:inline distT="0" distB="0" distL="0" distR="0" wp14:anchorId="38C1D26D" wp14:editId="7C44E99B">
+            <wp:extent cx="6120130" cy="2348230"/>
+            <wp:effectExtent l="0" t="0" r="0" b="0"/>
+            <wp:docPr id="38" name="Рисунок 38"/>
+            <wp:cNvGraphicFramePr>
+              <a:graphicFrameLocks xmlns:a="http://schemas.openxmlformats.org/drawingml/2006/main" noChangeAspect="1"/>
+            </wp:cNvGraphicFramePr>
+            <a:graphic xmlns:a="http://schemas.openxmlformats.org/drawingml/2006/main">
+              <a:graphicData uri="http://schemas.openxmlformats.org/drawingml/2006/picture">
+                <pic:pic xmlns:pic="http://schemas.openxmlformats.org/drawingml/2006/picture">
+                  <pic:nvPicPr>
+                    <pic:cNvPr id="1" name=""/>
+                    <pic:cNvPicPr/>
+                  </pic:nvPicPr>
+                  <pic:blipFill>
+                    <a:blip r:embed="rId47"/>
+                    <a:stretch>
+                      <a:fillRect/>
+                    </a:stretch>
+                  </pic:blipFill>
+                  <pic:spPr>
+                    <a:xfrm>
+                      <a:off x="0" y="0"/>
+                      <a:ext cx="6120130" cy="2348230"/>
+                    </a:xfrm>
+                    <a:prstGeom prst="rect">
+                      <a:avLst/>
+                    </a:prstGeom>
+                  </pic:spPr>
+                </pic:pic>
+              </a:graphicData>
+            </a:graphic>
+          </wp:inline>
+        </w:drawing>
+      </w:r>
+    </w:p>
+    <w:p>
+      <w:r>
+        <w:t>TC_13</w:t>
+      </w:r>
+    </w:p>
+    <w:p>
+      <w:r>
+        <w:drawing>
+          <wp:inline distT="0" distB="0" distL="0" distR="0" wp14:anchorId="61ABD675" wp14:editId="3008A165">
+            <wp:extent cx="6120130" cy="2510155"/>
+            <wp:effectExtent l="0" t="0" r="0" b="4445"/>
+            <wp:docPr id="39" name="Рисунок 39"/>
+            <wp:cNvGraphicFramePr>
+              <a:graphicFrameLocks xmlns:a="http://schemas.openxmlformats.org/drawingml/2006/main" noChangeAspect="1"/>
+            </wp:cNvGraphicFramePr>
+            <a:graphic xmlns:a="http://schemas.openxmlformats.org/drawingml/2006/main">
+              <a:graphicData uri="http://schemas.openxmlformats.org/drawingml/2006/picture">
+                <pic:pic xmlns:pic="http://schemas.openxmlformats.org/drawingml/2006/picture">
+                  <pic:nvPicPr>
+                    <pic:cNvPr id="1" name=""/>
+                    <pic:cNvPicPr/>
+                  </pic:nvPicPr>
+                  <pic:blipFill>
+                    <a:blip r:embed="rId48"/>
+                    <a:stretch>
+                      <a:fillRect/>
+                    </a:stretch>
+                  </pic:blipFill>
+                  <pic:spPr>
+                    <a:xfrm>
+                      <a:off x="0" y="0"/>
+                      <a:ext cx="6120130" cy="2510155"/>
+                    </a:xfrm>
+                    <a:prstGeom prst="rect">
+                      <a:avLst/>
+                    </a:prstGeom>
+                  </pic:spPr>
+                </pic:pic>
+              </a:graphicData>
+            </a:graphic>
+          </wp:inline>
+        </w:drawing>
+      </w:r>
+    </w:p>
+    <w:p>
+      <w:r>
+        <w:lastRenderedPageBreak/>
+        <w:drawing>
+          <wp:inline distT="0" distB="0" distL="0" distR="0" wp14:anchorId="53615914" wp14:editId="1D7E6ECB">
+            <wp:extent cx="6120130" cy="2421255"/>
+            <wp:effectExtent l="0" t="0" r="0" b="0"/>
+            <wp:docPr id="40" name="Рисунок 40"/>
+            <wp:cNvGraphicFramePr>
+              <a:graphicFrameLocks xmlns:a="http://schemas.openxmlformats.org/drawingml/2006/main" noChangeAspect="1"/>
+            </wp:cNvGraphicFramePr>
+            <a:graphic xmlns:a="http://schemas.openxmlformats.org/drawingml/2006/main">
+              <a:graphicData uri="http://schemas.openxmlformats.org/drawingml/2006/picture">
+                <pic:pic xmlns:pic="http://schemas.openxmlformats.org/drawingml/2006/picture">
+                  <pic:nvPicPr>
+                    <pic:cNvPr id="1" name=""/>
+                    <pic:cNvPicPr/>
+                  </pic:nvPicPr>
+                  <pic:blipFill>
+                    <a:blip r:embed="rId49"/>
+                    <a:stretch>
+                      <a:fillRect/>
+                    </a:stretch>
+                  </pic:blipFill>
+                  <pic:spPr>
+                    <a:xfrm>
+                      <a:off x="0" y="0"/>
+                      <a:ext cx="6120130" cy="2421255"/>
+                    </a:xfrm>
+                    <a:prstGeom prst="rect">
+                      <a:avLst/>
+                    </a:prstGeom>
+                  </pic:spPr>
+                </pic:pic>
+              </a:graphicData>
+            </a:graphic>
+          </wp:inline>
+        </w:drawing>
+      </w:r>
+    </w:p>
+    <w:p/>
+    <w:p>
+      <w:r>
+        <w:t>TC_15</w:t>
+      </w:r>
+    </w:p>
+    <w:p>
+      <w:r>
+        <w:rPr>
+          <w:noProof/>
+        </w:rPr>
+        <w:drawing>
+          <wp:inline distT="0" distB="0" distL="0" distR="0" wp14:anchorId="45205AA0" wp14:editId="574F25A0">
+            <wp:extent cx="6120130" cy="2129790"/>
+            <wp:effectExtent l="0" t="0" r="0" b="3810"/>
+            <wp:docPr id="17" name="Рисунок 17"/>
+            <wp:cNvGraphicFramePr>
+              <a:graphicFrameLocks xmlns:a="http://schemas.openxmlformats.org/drawingml/2006/main" noChangeAspect="1"/>
+            </wp:cNvGraphicFramePr>
+            <a:graphic xmlns:a="http://schemas.openxmlformats.org/drawingml/2006/main">
+              <a:graphicData uri="http://schemas.openxmlformats.org/drawingml/2006/picture">
+                <pic:pic xmlns:pic="http://schemas.openxmlformats.org/drawingml/2006/picture">
+                  <pic:nvPicPr>
+                    <pic:cNvPr id="1" name=""/>
+                    <pic:cNvPicPr/>
+                  </pic:nvPicPr>
+                  <pic:blipFill>
+                    <a:blip r:embed="rId50"/>
+                    <a:stretch>
+                      <a:fillRect/>
+                    </a:stretch>
+                  </pic:blipFill>
+                  <pic:spPr>
+                    <a:xfrm>
+                      <a:off x="0" y="0"/>
+                      <a:ext cx="6120130" cy="2129790"/>
+                    </a:xfrm>
+                    <a:prstGeom prst="rect">
+                      <a:avLst/>
+                    </a:prstGeom>
+                  </pic:spPr>
+                </pic:pic>
+              </a:graphicData>
+            </a:graphic>
+          </wp:inline>
+        </w:drawing>
+      </w:r>
+    </w:p>
+    <w:p>
+      <w:r>
+        <w:rPr>
+          <w:noProof/>
+        </w:rPr>
+        <w:drawing>
+          <wp:inline distT="0" distB="0" distL="0" distR="0" wp14:anchorId="10234B05" wp14:editId="7BF9B38F">
+            <wp:extent cx="6120130" cy="1584325"/>
+            <wp:effectExtent l="0" t="0" r="0" b="0"/>
+            <wp:docPr id="18" name="Рисунок 18"/>
+            <wp:cNvGraphicFramePr>
+              <a:graphicFrameLocks xmlns:a="http://schemas.openxmlformats.org/drawingml/2006/main" noChangeAspect="1"/>
+            </wp:cNvGraphicFramePr>
+            <a:graphic xmlns:a="http://schemas.openxmlformats.org/drawingml/2006/main">
+              <a:graphicData uri="http://schemas.openxmlformats.org/drawingml/2006/picture">
+                <pic:pic xmlns:pic="http://schemas.openxmlformats.org/drawingml/2006/picture">
+                  <pic:nvPicPr>
+                    <pic:cNvPr id="1" name=""/>
+                    <pic:cNvPicPr/>
+                  </pic:nvPicPr>
+                  <pic:blipFill>
+                    <a:blip r:embed="rId51"/>
+                    <a:stretch>
+                      <a:fillRect/>
+                    </a:stretch>
+                  </pic:blipFill>
+                  <pic:spPr>
+                    <a:xfrm>
+                      <a:off x="0" y="0"/>
+                      <a:ext cx="6120130" cy="1584325"/>
+                    </a:xfrm>
+                    <a:prstGeom prst="rect">
+                      <a:avLst/>
+                    </a:prstGeom>
+                  </pic:spPr>
+                </pic:pic>
+              </a:graphicData>
+            </a:graphic>
+          </wp:inline>
+        </w:drawing>
+      </w:r>
+    </w:p>
+    <w:p>
+      <w:pPr>
+        <w:suppressAutoHyphens w:val="0"/>
+        <w:spacing w:line="259" w:lineRule="auto"/>
+      </w:pPr>
+      <w:r>
+        <w:br w:type="page"/>
+      </w:r>
+    </w:p>
+    <w:p>
+      <w:r>
+        <w:lastRenderedPageBreak/>
+        <w:t>TC_16</w:t>
+      </w:r>
+    </w:p>
+    <w:p>
+      <w:r>
+        <w:rPr>
+          <w:noProof/>
+        </w:rPr>
+        <w:drawing>
+          <wp:inline distT="0" distB="0" distL="0" distR="0" wp14:anchorId="20978DA4" wp14:editId="627199A0">
+            <wp:extent cx="6120130" cy="2155190"/>
+            <wp:effectExtent l="0" t="0" r="0" b="0"/>
+            <wp:docPr id="19" name="Рисунок 19"/>
+            <wp:cNvGraphicFramePr>
+              <a:graphicFrameLocks xmlns:a="http://schemas.openxmlformats.org/drawingml/2006/main" noChangeAspect="1"/>
+            </wp:cNvGraphicFramePr>
+            <a:graphic xmlns:a="http://schemas.openxmlformats.org/drawingml/2006/main">
+              <a:graphicData uri="http://schemas.openxmlformats.org/drawingml/2006/picture">
+                <pic:pic xmlns:pic="http://schemas.openxmlformats.org/drawingml/2006/picture">
+                  <pic:nvPicPr>
+                    <pic:cNvPr id="1" name=""/>
+                    <pic:cNvPicPr/>
+                  </pic:nvPicPr>
+                  <pic:blipFill>
+                    <a:blip r:embed="rId52"/>
+                    <a:stretch>
+                      <a:fillRect/>
+                    </a:stretch>
+                  </pic:blipFill>
+                  <pic:spPr>
+                    <a:xfrm>
+                      <a:off x="0" y="0"/>
+                      <a:ext cx="6120130" cy="2155190"/>
+                    </a:xfrm>
+                    <a:prstGeom prst="rect">
+                      <a:avLst/>
+                    </a:prstGeom>
+                  </pic:spPr>
+                </pic:pic>
+              </a:graphicData>
+            </a:graphic>
+          </wp:inline>
+        </w:drawing>
+      </w:r>
+    </w:p>
+    <w:p>
+      <w:r>
+        <w:rPr>
+          <w:noProof/>
+        </w:rPr>
+        <w:drawing>
+          <wp:inline distT="0" distB="0" distL="0" distR="0" wp14:anchorId="39368029" wp14:editId="2778681D">
+            <wp:extent cx="6120130" cy="1570355"/>
+            <wp:effectExtent l="0" t="0" r="0" b="0"/>
+            <wp:docPr id="20" name="Рисунок 20"/>
+            <wp:cNvGraphicFramePr>
+              <a:graphicFrameLocks xmlns:a="http://schemas.openxmlformats.org/drawingml/2006/main" noChangeAspect="1"/>
+            </wp:cNvGraphicFramePr>
+            <a:graphic xmlns:a="http://schemas.openxmlformats.org/drawingml/2006/main">
+              <a:graphicData uri="http://schemas.openxmlformats.org/drawingml/2006/picture">
+                <pic:pic xmlns:pic="http://schemas.openxmlformats.org/drawingml/2006/picture">
+                  <pic:nvPicPr>
+                    <pic:cNvPr id="1" name=""/>
+                    <pic:cNvPicPr/>
+                  </pic:nvPicPr>
+                  <pic:blipFill>
+                    <a:blip r:embed="rId53"/>
+                    <a:stretch>
+                      <a:fillRect/>
+                    </a:stretch>
+                  </pic:blipFill>
+                  <pic:spPr>
+                    <a:xfrm>
+                      <a:off x="0" y="0"/>
+                      <a:ext cx="6120130" cy="1570355"/>
+                    </a:xfrm>
+                    <a:prstGeom prst="rect">
+                      <a:avLst/>
+                    </a:prstGeom>
+                  </pic:spPr>
+                </pic:pic>
+              </a:graphicData>
+            </a:graphic>
+          </wp:inline>
+        </w:drawing>
+      </w:r>
+    </w:p>
+    <w:p/>
+    <w:p>
+      <w:r>
+        <w:t>TC_17</w:t>
+      </w:r>
+    </w:p>
+    <w:p>
+      <w:r>
+        <w:rPr>
+          <w:noProof/>
+        </w:rPr>
+        <w:drawing>
+          <wp:inline distT="0" distB="0" distL="0" distR="0" wp14:anchorId="6A6935EF" wp14:editId="4E4ED42B">
+            <wp:extent cx="6120130" cy="2138045"/>
+            <wp:effectExtent l="0" t="0" r="0" b="0"/>
+            <wp:docPr id="21" name="Рисунок 21"/>
+            <wp:cNvGraphicFramePr>
+              <a:graphicFrameLocks xmlns:a="http://schemas.openxmlformats.org/drawingml/2006/main" noChangeAspect="1"/>
+            </wp:cNvGraphicFramePr>
+            <a:graphic xmlns:a="http://schemas.openxmlformats.org/drawingml/2006/main">
+              <a:graphicData uri="http://schemas.openxmlformats.org/drawingml/2006/picture">
+                <pic:pic xmlns:pic="http://schemas.openxmlformats.org/drawingml/2006/picture">
+                  <pic:nvPicPr>
+                    <pic:cNvPr id="1" name=""/>
+                    <pic:cNvPicPr/>
+                  </pic:nvPicPr>
+                  <pic:blipFill>
+                    <a:blip r:embed="rId54"/>
+                    <a:stretch>
+                      <a:fillRect/>
+                    </a:stretch>
+                  </pic:blipFill>
+                  <pic:spPr>
+                    <a:xfrm>
+                      <a:off x="0" y="0"/>
+                      <a:ext cx="6120130" cy="2138045"/>
+                    </a:xfrm>
+                    <a:prstGeom prst="rect">
+                      <a:avLst/>
+                    </a:prstGeom>
+                  </pic:spPr>
+                </pic:pic>
+              </a:graphicData>
+            </a:graphic>
+          </wp:inline>
+        </w:drawing>
+      </w:r>
+    </w:p>
+    <w:p>
+      <w:r>
+        <w:rPr>
+          <w:noProof/>
+        </w:rPr>
+        <w:drawing>
+          <wp:inline distT="0" distB="0" distL="0" distR="0" wp14:anchorId="6F29F516" wp14:editId="0DA54134">
+            <wp:extent cx="6120130" cy="1525905"/>
+            <wp:effectExtent l="0" t="0" r="0" b="0"/>
+            <wp:docPr id="22" name="Рисунок 22"/>
+            <wp:cNvGraphicFramePr>
+              <a:graphicFrameLocks xmlns:a="http://schemas.openxmlformats.org/drawingml/2006/main" noChangeAspect="1"/>
+            </wp:cNvGraphicFramePr>
+            <a:graphic xmlns:a="http://schemas.openxmlformats.org/drawingml/2006/main">
+              <a:graphicData uri="http://schemas.openxmlformats.org/drawingml/2006/picture">
+                <pic:pic xmlns:pic="http://schemas.openxmlformats.org/drawingml/2006/picture">
+                  <pic:nvPicPr>
+                    <pic:cNvPr id="1" name=""/>
+                    <pic:cNvPicPr/>
+                  </pic:nvPicPr>
+                  <pic:blipFill>
+                    <a:blip r:embed="rId55"/>
+                    <a:stretch>
+                      <a:fillRect/>
+                    </a:stretch>
+                  </pic:blipFill>
+                  <pic:spPr>
+                    <a:xfrm>
+                      <a:off x="0" y="0"/>
+                      <a:ext cx="6120130" cy="1525905"/>
+                    </a:xfrm>
+                    <a:prstGeom prst="rect">
+                      <a:avLst/>
+                    </a:prstGeom>
+                  </pic:spPr>
+                </pic:pic>
+              </a:graphicData>
+            </a:graphic>
+          </wp:inline>
+        </w:drawing>
+      </w:r>
+    </w:p>
+    <w:p/>
+    <w:p>
+      <w:r>
+        <w:t>TC_18</w:t>
+      </w:r>
+    </w:p>
+    <w:p>
+      <w:r>
+        <w:rPr>
+          <w:noProof/>
+        </w:rPr>
+        <w:lastRenderedPageBreak/>
+        <w:drawing>
+          <wp:inline distT="0" distB="0" distL="0" distR="0" wp14:anchorId="6A3EBFFF" wp14:editId="313927D3">
+            <wp:extent cx="6120130" cy="2254885"/>
+            <wp:effectExtent l="0" t="0" r="0" b="0"/>
+            <wp:docPr id="23" name="Рисунок 23"/>
+            <wp:cNvGraphicFramePr>
+              <a:graphicFrameLocks xmlns:a="http://schemas.openxmlformats.org/drawingml/2006/main" noChangeAspect="1"/>
+            </wp:cNvGraphicFramePr>
+            <a:graphic xmlns:a="http://schemas.openxmlformats.org/drawingml/2006/main">
+              <a:graphicData uri="http://schemas.openxmlformats.org/drawingml/2006/picture">
+                <pic:pic xmlns:pic="http://schemas.openxmlformats.org/drawingml/2006/picture">
+                  <pic:nvPicPr>
+                    <pic:cNvPr id="1" name=""/>
+                    <pic:cNvPicPr/>
+                  </pic:nvPicPr>
+                  <pic:blipFill>
+                    <a:blip r:embed="rId56"/>
+                    <a:stretch>
+                      <a:fillRect/>
+                    </a:stretch>
+                  </pic:blipFill>
+                  <pic:spPr>
+                    <a:xfrm>
+                      <a:off x="0" y="0"/>
+                      <a:ext cx="6120130" cy="2254885"/>
+                    </a:xfrm>
+                    <a:prstGeom prst="rect">
+                      <a:avLst/>
+                    </a:prstGeom>
+                  </pic:spPr>
+                </pic:pic>
+              </a:graphicData>
+            </a:graphic>
+          </wp:inline>
+        </w:drawing>
+      </w:r>
+    </w:p>
+    <w:p>
+      <w:pPr>
+        <w:rPr>
+          <w:lang w:val="ru-RU"/>
+        </w:rPr>
+      </w:pPr>
+      <w:r>
+        <w:rPr>
+          <w:noProof/>
+        </w:rPr>
+        <w:drawing>
+          <wp:inline distT="0" distB="0" distL="0" distR="0" wp14:anchorId="00A552E8" wp14:editId="454F340D">
+            <wp:extent cx="6120130" cy="1642110"/>
+            <wp:effectExtent l="0" t="0" r="0" b="0"/>
+            <wp:docPr id="24" name="Рисунок 24"/>
+            <wp:cNvGraphicFramePr>
+              <a:graphicFrameLocks xmlns:a="http://schemas.openxmlformats.org/drawingml/2006/main" noChangeAspect="1"/>
+            </wp:cNvGraphicFramePr>
+            <a:graphic xmlns:a="http://schemas.openxmlformats.org/drawingml/2006/main">
+              <a:graphicData uri="http://schemas.openxmlformats.org/drawingml/2006/picture">
+                <pic:pic xmlns:pic="http://schemas.openxmlformats.org/drawingml/2006/picture">
+                  <pic:nvPicPr>
+                    <pic:cNvPr id="1" name=""/>
+                    <pic:cNvPicPr/>
+                  </pic:nvPicPr>
+                  <pic:blipFill>
+                    <a:blip r:embed="rId57"/>
+                    <a:stretch>
+                      <a:fillRect/>
+                    </a:stretch>
+                  </pic:blipFill>
+                  <pic:spPr>
+                    <a:xfrm>
+                      <a:off x="0" y="0"/>
+                      <a:ext cx="6120130" cy="1642110"/>
+                    </a:xfrm>
+                    <a:prstGeom prst="rect">
+                      <a:avLst/>
+                    </a:prstGeom>
+                  </pic:spPr>
+                </pic:pic>
+              </a:graphicData>
+            </a:graphic>
+          </wp:inline>
+        </w:drawing>
+      </w:r>
+    </w:p>
+    <w:p>
+      <w:pPr>
+        <w:rPr>
+          <w:lang w:val="ru-RU"/>
+        </w:rPr>
+      </w:pPr>
+    </w:p>
+    <w:p>
+      <w:pPr>
+        <w:suppressAutoHyphens w:val="0"/>
+        <w:spacing w:line="259" w:lineRule="auto"/>
+        <w:rPr>
+          <w:rFonts w:eastAsiaTheme="majorEastAsia" w:cstheme="majorBidi"/>
+          <w:b/>
+          <w:color w:val="000000" w:themeColor="text1"/>
+          <w:sz w:val="36"/>
+          <w:szCs w:val="32"/>
+          <w:lang w:val="ru-RU"/>
+        </w:rPr>
+      </w:pPr>
+      <w:r>
+        <w:rPr>
+          <w:lang w:val="ru-RU"/>
+        </w:rPr>
+        <w:br w:type="page"/>
+      </w:r>
+    </w:p>
+    <w:p>
+      <w:pPr>
+        <w:pStyle w:val="1"/>
+        <w:rPr>
+          <w:lang w:val="ru-RU"/>
+        </w:rPr>
+      </w:pPr>
+      <w:bookmarkStart w:id="21" w:name="_Toc226111033"/>
+      <w:r>
+        <w:rPr>
+          <w:lang w:val="ru-RU"/>
+        </w:rPr>
+        <w:lastRenderedPageBreak/>
+        <w:t>Вывод</w:t>
+      </w:r>
+      <w:bookmarkEnd w:id="21"/>
+    </w:p>
+    <w:p>
+      <w:pPr>
+        <w:rPr>
+          <w:lang w:val="ru-RU"/>
+        </w:rPr>
+      </w:pPr>
+      <w:r>
+        <w:rPr>
+          <w:lang w:val="ru-RU"/>
+        </w:rPr>
+        <w:t xml:space="preserve">В ходе выполнения лабораторной работы были разработаны автоматизированные UI-тесты с использованием </w:t>
+      </w:r>
+      <w:proofErr w:type="spellStart"/>
+      <w:r>
+        <w:rPr>
+          <w:lang w:val="ru-RU"/>
+        </w:rPr>
+        <w:t>Selenium</w:t>
+      </w:r>
+      <w:proofErr w:type="spellEnd"/>
+      <w:r>
+        <w:rPr>
+          <w:lang w:val="ru-RU"/>
+        </w:rPr>
+        <w:t xml:space="preserve"> </w:t>
+      </w:r>
+      <w:proofErr w:type="spellStart"/>
+      <w:r>
+        <w:rPr>
+          <w:lang w:val="ru-RU"/>
+        </w:rPr>
+        <w:t>WebDriver</w:t>
+      </w:r>
+      <w:proofErr w:type="spellEnd"/>
+      <w:r>
+        <w:rPr>
+          <w:lang w:val="ru-RU"/>
+        </w:rPr>
+        <w:t xml:space="preserve"> и </w:t>
+      </w:r>
+      <w:proofErr w:type="spellStart"/>
+      <w:r>
+        <w:rPr>
+          <w:lang w:val="ru-RU"/>
+        </w:rPr>
+        <w:t>JUnit</w:t>
+      </w:r>
+      <w:proofErr w:type="spellEnd"/>
+      <w:r>
+        <w:rPr>
+          <w:lang w:val="ru-RU"/>
+        </w:rPr>
+        <w:t xml:space="preserve"> 5. Были реализованы как позитивные, так и негативные сценарии, включая авторизацию пользователя, создание поста и добавление комментариев.</w:t>
+      </w:r>
+    </w:p>
+    <w:p>
+      <w:pPr>
+        <w:rPr>
+          <w:lang w:val="ru-RU"/>
+        </w:rPr>
+      </w:pPr>
+      <w:r>
+        <w:rPr>
+          <w:lang w:val="ru-RU"/>
+        </w:rPr>
+        <w:t xml:space="preserve">В процессе работы были изучены особенности взаимодействия с динамическими веб-интерфейсами, в частности с элементами, имеющими изменяющиеся классы и </w:t>
+      </w:r>
+      <w:proofErr w:type="spellStart"/>
+      <w:r>
+        <w:rPr>
+          <w:lang w:val="ru-RU"/>
+        </w:rPr>
+        <w:t>contenteditable</w:t>
+      </w:r>
+      <w:proofErr w:type="spellEnd"/>
+      <w:r>
+        <w:rPr>
+          <w:lang w:val="ru-RU"/>
+        </w:rPr>
+        <w:t>-редакторами. Особое внимание было уделено корректному выбору локаторов (</w:t>
+      </w:r>
+      <w:proofErr w:type="spellStart"/>
+      <w:r>
+        <w:rPr>
+          <w:lang w:val="ru-RU"/>
+        </w:rPr>
+        <w:t>XPath</w:t>
+      </w:r>
+      <w:proofErr w:type="spellEnd"/>
+      <w:r>
+        <w:rPr>
+          <w:lang w:val="ru-RU"/>
+        </w:rPr>
+        <w:t>) и использованию явных ожиданий (</w:t>
+      </w:r>
+      <w:proofErr w:type="spellStart"/>
+      <w:r>
+        <w:rPr>
+          <w:lang w:val="ru-RU"/>
+        </w:rPr>
+        <w:t>WebDriverWait</w:t>
+      </w:r>
+      <w:proofErr w:type="spellEnd"/>
+      <w:r>
+        <w:rPr>
+          <w:lang w:val="ru-RU"/>
+        </w:rPr>
+        <w:t>) для повышения стабильности тестов.</w:t>
+      </w:r>
+    </w:p>
+    <w:p>
+      <w:pPr>
+        <w:rPr>
+          <w:lang w:val="ru-RU"/>
+        </w:rPr>
+      </w:pPr>
+      <w:r>
+        <w:rPr>
+          <w:lang w:val="ru-RU"/>
+        </w:rPr>
+        <w:t>Также были выявлены различия в поведении браузеров (</w:t>
+      </w:r>
+      <w:proofErr w:type="spellStart"/>
+      <w:r>
+        <w:rPr>
+          <w:lang w:val="ru-RU"/>
+        </w:rPr>
+        <w:t>Chrome</w:t>
+      </w:r>
+      <w:proofErr w:type="spellEnd"/>
+      <w:r>
+        <w:rPr>
+          <w:lang w:val="ru-RU"/>
+        </w:rPr>
+        <w:t xml:space="preserve"> и Firefox), что потребовало адаптации кода (например, использование </w:t>
+      </w:r>
+      <w:proofErr w:type="spellStart"/>
+      <w:proofErr w:type="gramStart"/>
+      <w:r>
+        <w:rPr>
+          <w:lang w:val="ru-RU"/>
+        </w:rPr>
+        <w:t>activeElement</w:t>
+      </w:r>
+      <w:proofErr w:type="spellEnd"/>
+      <w:r>
+        <w:rPr>
+          <w:lang w:val="ru-RU"/>
+        </w:rPr>
+        <w:t>(</w:t>
+      </w:r>
+      <w:proofErr w:type="gramEnd"/>
+      <w:r>
+        <w:rPr>
+          <w:lang w:val="ru-RU"/>
+        </w:rPr>
+        <w:t>) для ввода текста). В результате были получены устойчивые тесты, корректно работающие в разных браузерах.</w:t>
+      </w:r>
+    </w:p>
+    <w:p>
+      <w:pPr>
+        <w:rPr>
+          <w:lang w:val="ru-RU"/>
+        </w:rPr>
+      </w:pPr>
+      <w:r>
+        <w:rPr>
+          <w:lang w:val="ru-RU"/>
+        </w:rPr>
+        <w:t xml:space="preserve">Таким образом, в ходе лабораторной работы были приобретены практические навыки автоматизации тестирования веб-приложений и работы с инструментами </w:t>
+      </w:r>
+      <w:proofErr w:type="spellStart"/>
+      <w:r>
+        <w:rPr>
+          <w:lang w:val="ru-RU"/>
+        </w:rPr>
+        <w:t>Selenium</w:t>
+      </w:r>
+      <w:proofErr w:type="spellEnd"/>
+      <w:r>
+        <w:rPr>
+          <w:lang w:val="ru-RU"/>
+        </w:rPr>
+        <w:t>.</w:t>
+      </w:r>
+    </w:p>
+    <w:p>
+      <w:pPr>
+        <w:rPr>
+          <w:lang w:val="ru-RU"/>
+        </w:rPr>
+      </w:pPr>
     </w:p>
     <w:sectPr>
       <w:pgSz w:w="11906" w:h="16838"/>
@@ -17904,115 +20617,115 @@
       </w:rPr>
     </w:lvl>
   </w:abstractNum>
-  <w:num w:numId="1" w16cid:durableId="1345939113">
+  <w:num w:numId="1" w16cid:durableId="1370649420">
     <w:abstractNumId w:val="35"/>
   </w:num>
-  <w:num w:numId="2" w16cid:durableId="2012829798">
+  <w:num w:numId="2" w16cid:durableId="1468468338">
     <w:abstractNumId w:val="32"/>
   </w:num>
-  <w:num w:numId="3" w16cid:durableId="484780862">
+  <w:num w:numId="3" w16cid:durableId="892161195">
     <w:abstractNumId w:val="27"/>
   </w:num>
-  <w:num w:numId="4" w16cid:durableId="2055739531">
+  <w:num w:numId="4" w16cid:durableId="71633267">
     <w:abstractNumId w:val="29"/>
   </w:num>
-  <w:num w:numId="5" w16cid:durableId="653148024">
+  <w:num w:numId="5" w16cid:durableId="1461266186">
     <w:abstractNumId w:val="19"/>
   </w:num>
-  <w:num w:numId="6" w16cid:durableId="1006787784">
+  <w:num w:numId="6" w16cid:durableId="932058023">
     <w:abstractNumId w:val="22"/>
   </w:num>
-  <w:num w:numId="7" w16cid:durableId="899749261">
+  <w:num w:numId="7" w16cid:durableId="765081955">
     <w:abstractNumId w:val="26"/>
   </w:num>
-  <w:num w:numId="8" w16cid:durableId="188951599">
+  <w:num w:numId="8" w16cid:durableId="1384479789">
     <w:abstractNumId w:val="3"/>
   </w:num>
-  <w:num w:numId="9" w16cid:durableId="1712916259">
+  <w:num w:numId="9" w16cid:durableId="1736317952">
     <w:abstractNumId w:val="20"/>
   </w:num>
-  <w:num w:numId="10" w16cid:durableId="1047265914">
+  <w:num w:numId="10" w16cid:durableId="1854877845">
     <w:abstractNumId w:val="16"/>
   </w:num>
-  <w:num w:numId="11" w16cid:durableId="1895653438">
+  <w:num w:numId="11" w16cid:durableId="1302223281">
     <w:abstractNumId w:val="1"/>
   </w:num>
-  <w:num w:numId="12" w16cid:durableId="1396245564">
+  <w:num w:numId="12" w16cid:durableId="662005879">
     <w:abstractNumId w:val="14"/>
   </w:num>
-  <w:num w:numId="13" w16cid:durableId="971833904">
+  <w:num w:numId="13" w16cid:durableId="1524203035">
     <w:abstractNumId w:val="6"/>
   </w:num>
-  <w:num w:numId="14" w16cid:durableId="129329721">
+  <w:num w:numId="14" w16cid:durableId="1219516294">
     <w:abstractNumId w:val="31"/>
   </w:num>
-  <w:num w:numId="15" w16cid:durableId="2056545661">
+  <w:num w:numId="15" w16cid:durableId="570894611">
     <w:abstractNumId w:val="8"/>
   </w:num>
-  <w:num w:numId="16" w16cid:durableId="1095977641">
+  <w:num w:numId="16" w16cid:durableId="1162115943">
     <w:abstractNumId w:val="25"/>
   </w:num>
-  <w:num w:numId="17" w16cid:durableId="827743948">
+  <w:num w:numId="17" w16cid:durableId="294988150">
     <w:abstractNumId w:val="36"/>
   </w:num>
-  <w:num w:numId="18" w16cid:durableId="428694056">
+  <w:num w:numId="18" w16cid:durableId="929238260">
     <w:abstractNumId w:val="5"/>
   </w:num>
-  <w:num w:numId="19" w16cid:durableId="927079141">
+  <w:num w:numId="19" w16cid:durableId="890264277">
     <w:abstractNumId w:val="2"/>
   </w:num>
-  <w:num w:numId="20" w16cid:durableId="175656603">
+  <w:num w:numId="20" w16cid:durableId="26225609">
     <w:abstractNumId w:val="30"/>
   </w:num>
-  <w:num w:numId="21" w16cid:durableId="1063069338">
+  <w:num w:numId="21" w16cid:durableId="1466701245">
     <w:abstractNumId w:val="11"/>
   </w:num>
-  <w:num w:numId="22" w16cid:durableId="986710617">
+  <w:num w:numId="22" w16cid:durableId="217864048">
     <w:abstractNumId w:val="23"/>
   </w:num>
-  <w:num w:numId="23" w16cid:durableId="2089882090">
+  <w:num w:numId="23" w16cid:durableId="967273312">
     <w:abstractNumId w:val="28"/>
   </w:num>
-  <w:num w:numId="24" w16cid:durableId="1524517579">
+  <w:num w:numId="24" w16cid:durableId="279186022">
     <w:abstractNumId w:val="0"/>
   </w:num>
-  <w:num w:numId="25" w16cid:durableId="2120104596">
+  <w:num w:numId="25" w16cid:durableId="1613706618">
     <w:abstractNumId w:val="4"/>
   </w:num>
-  <w:num w:numId="26" w16cid:durableId="1003818777">
+  <w:num w:numId="26" w16cid:durableId="56243272">
     <w:abstractNumId w:val="33"/>
   </w:num>
-  <w:num w:numId="27" w16cid:durableId="389349824">
+  <w:num w:numId="27" w16cid:durableId="1650792572">
     <w:abstractNumId w:val="21"/>
   </w:num>
-  <w:num w:numId="28" w16cid:durableId="1346126172">
+  <w:num w:numId="28" w16cid:durableId="1745879224">
     <w:abstractNumId w:val="9"/>
   </w:num>
-  <w:num w:numId="29" w16cid:durableId="951791376">
+  <w:num w:numId="29" w16cid:durableId="626283236">
     <w:abstractNumId w:val="15"/>
   </w:num>
-  <w:num w:numId="30" w16cid:durableId="249583729">
+  <w:num w:numId="30" w16cid:durableId="316346903">
     <w:abstractNumId w:val="13"/>
   </w:num>
-  <w:num w:numId="31" w16cid:durableId="2022852059">
+  <w:num w:numId="31" w16cid:durableId="680201416">
     <w:abstractNumId w:val="17"/>
   </w:num>
-  <w:num w:numId="32" w16cid:durableId="1383402907">
+  <w:num w:numId="32" w16cid:durableId="1442266462">
     <w:abstractNumId w:val="10"/>
   </w:num>
-  <w:num w:numId="33" w16cid:durableId="1623994458">
+  <w:num w:numId="33" w16cid:durableId="1493253067">
     <w:abstractNumId w:val="18"/>
   </w:num>
-  <w:num w:numId="34" w16cid:durableId="1703745020">
+  <w:num w:numId="34" w16cid:durableId="127280850">
     <w:abstractNumId w:val="12"/>
   </w:num>
-  <w:num w:numId="35" w16cid:durableId="1618441739">
+  <w:num w:numId="35" w16cid:durableId="847254425">
     <w:abstractNumId w:val="24"/>
   </w:num>
-  <w:num w:numId="36" w16cid:durableId="2013726638">
+  <w:num w:numId="36" w16cid:durableId="1595163898">
     <w:abstractNumId w:val="34"/>
   </w:num>
-  <w:num w:numId="37" w16cid:durableId="1130513410">
+  <w:num w:numId="37" w16cid:durableId="2092774872">
     <w:abstractNumId w:val="7"/>
   </w:num>
   <w:numIdMacAtCleanup w:val="17"/>
@@ -18417,7 +21130,7 @@
   <w:style w:type="paragraph" w:default="1" w:styleId="a">
     <w:name w:val="Normal"/>
     <w:qFormat/>
-    <w:rsid w:val="00666714"/>
+    <w:rsid w:val="00976B79"/>
     <w:pPr>
       <w:suppressAutoHyphens/>
       <w:spacing w:line="256" w:lineRule="auto"/>

</xml_diff>

<commit_message>
fix use case diagram in report
</commit_message>
<xml_diff>
--- a/ТПО/Лаб3/Ястребов-Амирханов_Карандашева_ТПО_3.docx
+++ b/ТПО/Лаб3/Ястребов-Амирханов_Карандашева_ТПО_3.docx
@@ -1,6 +1,6 @@
 
 <file path=word/document.xml><?xml version="1.0" encoding="utf-8"?>
-<w:document xmlns:wpc="http://schemas.microsoft.com/office/word/2010/wordprocessingCanvas" xmlns:cx="http://schemas.microsoft.com/office/drawing/2014/chartex" xmlns:cx1="http://schemas.microsoft.com/office/drawing/2015/9/8/chartex" xmlns:cx2="http://schemas.microsoft.com/office/drawing/2015/10/21/chartex" xmlns:cx3="http://schemas.microsoft.com/office/drawing/2016/5/9/chartex" xmlns:cx4="http://schemas.microsoft.com/office/drawing/2016/5/10/chartex" xmlns:cx5="http://schemas.microsoft.com/office/drawing/2016/5/11/chartex" xmlns:cx6="http://schemas.microsoft.com/office/drawing/2016/5/12/chartex" xmlns:cx7="http://schemas.microsoft.com/office/drawing/2016/5/13/chartex" xmlns:cx8="http://schemas.microsoft.com/office/drawing/2016/5/14/chartex" xmlns:mc="http://schemas.openxmlformats.org/markup-compatibility/2006" xmlns:aink="http://schemas.microsoft.com/office/drawing/2016/ink" xmlns:am3d="http://schemas.microsoft.com/office/drawing/2017/model3d" xmlns:o="urn:schemas-microsoft-com:office:office" xmlns:oel="http://schemas.microsoft.com/office/2019/extlst" xmlns:r="http://schemas.openxmlformats.org/officeDocument/2006/relationships" xmlns:m="http://schemas.openxmlformats.org/officeDocument/2006/math" xmlns:v="urn:schemas-microsoft-com:vml" xmlns:wp14="http://schemas.microsoft.com/office/word/2010/wordprocessingDrawing" xmlns:wp="http://schemas.openxmlformats.org/drawingml/2006/wordprocessingDrawing" xmlns:w10="urn:schemas-microsoft-com:office:word" xmlns:w="http://schemas.openxmlformats.org/wordprocessingml/2006/main" xmlns:w14="http://schemas.microsoft.com/office/word/2010/wordml" xmlns:w15="http://schemas.microsoft.com/office/word/2012/wordml" xmlns:w16cex="http://schemas.microsoft.com/office/word/2018/wordml/cex" xmlns:w16cid="http://schemas.microsoft.com/office/word/2016/wordml/cid" xmlns:w16="http://schemas.microsoft.com/office/word/2018/wordml" xmlns:w16sdtdh="http://schemas.microsoft.com/office/word/2020/wordml/sdtdatahash" xmlns:w16se="http://schemas.microsoft.com/office/word/2015/wordml/symex" xmlns:wpg="http://schemas.microsoft.com/office/word/2010/wordprocessingGroup" xmlns:wpi="http://schemas.microsoft.com/office/word/2010/wordprocessingInk" xmlns:wne="http://schemas.microsoft.com/office/word/2006/wordml" xmlns:wps="http://schemas.microsoft.com/office/word/2010/wordprocessingShape" mc:Ignorable="w14 w15 w16se w16cid w16 w16cex w16sdtdh wp14">
+<w:document xmlns:wpc="http://schemas.microsoft.com/office/word/2010/wordprocessingCanvas" xmlns:cx="http://schemas.microsoft.com/office/drawing/2014/chartex" xmlns:cx1="http://schemas.microsoft.com/office/drawing/2015/9/8/chartex" xmlns:cx2="http://schemas.microsoft.com/office/drawing/2015/10/21/chartex" xmlns:cx3="http://schemas.microsoft.com/office/drawing/2016/5/9/chartex" xmlns:cx4="http://schemas.microsoft.com/office/drawing/2016/5/10/chartex" xmlns:cx5="http://schemas.microsoft.com/office/drawing/2016/5/11/chartex" xmlns:cx6="http://schemas.microsoft.com/office/drawing/2016/5/12/chartex" xmlns:cx7="http://schemas.microsoft.com/office/drawing/2016/5/13/chartex" xmlns:cx8="http://schemas.microsoft.com/office/drawing/2016/5/14/chartex" xmlns:mc="http://schemas.openxmlformats.org/markup-compatibility/2006" xmlns:aink="http://schemas.microsoft.com/office/drawing/2016/ink" xmlns:am3d="http://schemas.microsoft.com/office/drawing/2017/model3d" xmlns:o="urn:schemas-microsoft-com:office:office" xmlns:r="http://schemas.openxmlformats.org/officeDocument/2006/relationships" xmlns:m="http://schemas.openxmlformats.org/officeDocument/2006/math" xmlns:v="urn:schemas-microsoft-com:vml" xmlns:wp14="http://schemas.microsoft.com/office/word/2010/wordprocessingDrawing" xmlns:wp="http://schemas.openxmlformats.org/drawingml/2006/wordprocessingDrawing" xmlns:w10="urn:schemas-microsoft-com:office:word" xmlns:w="http://schemas.openxmlformats.org/wordprocessingml/2006/main" xmlns:w14="http://schemas.microsoft.com/office/word/2010/wordml" xmlns:w15="http://schemas.microsoft.com/office/word/2012/wordml" xmlns:w16cex="http://schemas.microsoft.com/office/word/2018/wordml/cex" xmlns:w16cid="http://schemas.microsoft.com/office/word/2016/wordml/cid" xmlns:w16="http://schemas.microsoft.com/office/word/2018/wordml" xmlns:w16sdtdh="http://schemas.microsoft.com/office/word/2020/wordml/sdtdatahash" xmlns:w16se="http://schemas.microsoft.com/office/word/2015/wordml/symex" xmlns:wpg="http://schemas.microsoft.com/office/word/2010/wordprocessingGroup" xmlns:wpi="http://schemas.microsoft.com/office/word/2010/wordprocessingInk" xmlns:wne="http://schemas.microsoft.com/office/word/2006/wordml" xmlns:wps="http://schemas.microsoft.com/office/word/2010/wordprocessingShape" mc:Ignorable="w14 w15 w16se w16cid w16 w16cex w16sdtdh wp14">
   <w:body>
     <w:p>
       <w:pPr>
@@ -2765,14 +2765,12 @@
           <w:lang w:val="ru-RU"/>
         </w:rPr>
       </w:pPr>
-      <w:proofErr w:type="spellStart"/>
       <w:r>
         <w:rPr>
           <w:rStyle w:val="whitespace-normal"/>
         </w:rPr>
         <w:t>Pikabu</w:t>
       </w:r>
-      <w:proofErr w:type="spellEnd"/>
       <w:r>
         <w:rPr>
           <w:rStyle w:val="whitespace-normal"/>
@@ -3961,12 +3959,13 @@
       <w:r>
         <w:rPr>
           <w:noProof/>
+          <w:lang w:val="ru-RU"/>
         </w:rPr>
         <w:drawing>
-          <wp:inline distT="0" distB="0" distL="0" distR="0" wp14:anchorId="79E7C808" wp14:editId="27D3BDDF">
-            <wp:extent cx="4829175" cy="8302278"/>
-            <wp:effectExtent l="0" t="0" r="0" b="3810"/>
-            <wp:docPr id="1" name="Рисунок 1"/>
+          <wp:inline distT="0" distB="0" distL="0" distR="0" wp14:anchorId="6841C0E2" wp14:editId="1FDD4C1B">
+            <wp:extent cx="5581650" cy="8300663"/>
+            <wp:effectExtent l="0" t="0" r="0" b="5715"/>
+            <wp:docPr id="33" name="Рисунок 33"/>
             <wp:cNvGraphicFramePr>
               <a:graphicFrameLocks xmlns:a="http://schemas.openxmlformats.org/drawingml/2006/main" noChangeAspect="1"/>
             </wp:cNvGraphicFramePr>
@@ -3974,11 +3973,17 @@
               <a:graphicData uri="http://schemas.openxmlformats.org/drawingml/2006/picture">
                 <pic:pic xmlns:pic="http://schemas.openxmlformats.org/drawingml/2006/picture">
                   <pic:nvPicPr>
-                    <pic:cNvPr id="1" name=""/>
+                    <pic:cNvPr id="33" name="Рисунок 33"/>
                     <pic:cNvPicPr/>
                   </pic:nvPicPr>
                   <pic:blipFill>
-                    <a:blip r:embed="rId10"/>
+                    <a:blip r:embed="rId10">
+                      <a:extLst>
+                        <a:ext uri="{28A0092B-C50C-407E-A947-70E740481C1C}">
+                          <a14:useLocalDpi xmlns:a14="http://schemas.microsoft.com/office/drawing/2010/main" val="0"/>
+                        </a:ext>
+                      </a:extLst>
+                    </a:blip>
                     <a:stretch>
                       <a:fillRect/>
                     </a:stretch>
@@ -3986,7 +3991,7 @@
                   <pic:spPr>
                     <a:xfrm>
                       <a:off x="0" y="0"/>
-                      <a:ext cx="4844024" cy="8327807"/>
+                      <a:ext cx="5600298" cy="8328395"/>
                     </a:xfrm>
                     <a:prstGeom prst="rect">
                       <a:avLst/>
@@ -4541,7 +4546,21 @@
         <w:rPr>
           <w:lang w:val="ru-RU"/>
         </w:rPr>
-        <w:t>Поставить дизлайк (</w:t>
+        <w:t xml:space="preserve">Поставить </w:t>
+      </w:r>
+      <w:proofErr w:type="spellStart"/>
+      <w:r>
+        <w:rPr>
+          <w:lang w:val="ru-RU"/>
+        </w:rPr>
+        <w:t>дизлайк</w:t>
+      </w:r>
+      <w:proofErr w:type="spellEnd"/>
+      <w:r>
+        <w:rPr>
+          <w:lang w:val="ru-RU"/>
+        </w:rPr>
+        <w:t xml:space="preserve"> (</w:t>
       </w:r>
       <w:proofErr w:type="spellStart"/>
       <w:r>
@@ -4606,7 +4625,21 @@
         <w:rPr>
           <w:lang w:val="ru-RU"/>
         </w:rPr>
-        <w:t>Убрать лайк/дизлайк (</w:t>
+        <w:t>Убрать лайк/</w:t>
+      </w:r>
+      <w:proofErr w:type="spellStart"/>
+      <w:r>
+        <w:rPr>
+          <w:lang w:val="ru-RU"/>
+        </w:rPr>
+        <w:t>дизлайк</w:t>
+      </w:r>
+      <w:proofErr w:type="spellEnd"/>
+      <w:r>
+        <w:rPr>
+          <w:lang w:val="ru-RU"/>
+        </w:rPr>
+        <w:t xml:space="preserve"> (</w:t>
       </w:r>
       <w:proofErr w:type="spellStart"/>
       <w:r>
@@ -9614,7 +9647,6 @@
                 <w:szCs w:val="24"/>
                 <w:lang w:val="ru-RU"/>
               </w:rPr>
-              <w:lastRenderedPageBreak/>
               <w:t>TC-11</w:t>
             </w:r>
           </w:p>
@@ -10707,7 +10739,6 @@
               </w:rPr>
               <w:t>://</w:t>
             </w:r>
-            <w:proofErr w:type="spellStart"/>
             <w:r>
               <w:rPr>
                 <w:rFonts w:eastAsia="Times New Roman" w:cs="Times New Roman"/>
@@ -10715,7 +10746,6 @@
               </w:rPr>
               <w:t>pikabu</w:t>
             </w:r>
-            <w:proofErr w:type="spellEnd"/>
             <w:r>
               <w:rPr>
                 <w:rFonts w:eastAsia="Times New Roman" w:cs="Times New Roman"/>
@@ -12328,7 +12358,6 @@
               </w:rPr>
               <w:t> </w:t>
             </w:r>
-            <w:proofErr w:type="spellStart"/>
             <w:r>
               <w:rPr>
                 <w:rFonts w:eastAsia="Times New Roman" w:cs="Times New Roman"/>
@@ -12343,7 +12372,6 @@
               </w:rPr>
               <w:t>ikabu</w:t>
             </w:r>
-            <w:proofErr w:type="spellEnd"/>
             <w:r>
               <w:rPr>
                 <w:rFonts w:eastAsia="Times New Roman" w:cs="Times New Roman"/>
@@ -13223,7 +13251,6 @@
                 <w:szCs w:val="24"/>
                 <w:lang w:val="ru-RU"/>
               </w:rPr>
-              <w:lastRenderedPageBreak/>
               <w:t>TC-1</w:t>
             </w:r>
             <w:r>
@@ -13424,7 +13451,6 @@
               </w:rPr>
               <w:t> </w:t>
             </w:r>
-            <w:proofErr w:type="spellStart"/>
             <w:r>
               <w:rPr>
                 <w:rFonts w:eastAsia="Times New Roman" w:cs="Times New Roman"/>
@@ -13439,7 +13465,6 @@
               </w:rPr>
               <w:t>ikabu</w:t>
             </w:r>
-            <w:proofErr w:type="spellEnd"/>
             <w:r>
               <w:rPr>
                 <w:rFonts w:eastAsia="Times New Roman" w:cs="Times New Roman"/>
@@ -13915,6 +13940,9 @@
     </w:p>
     <w:p>
       <w:r>
+        <w:rPr>
+          <w:noProof/>
+        </w:rPr>
         <w:drawing>
           <wp:inline distT="0" distB="0" distL="0" distR="0" wp14:anchorId="1B52A662" wp14:editId="0589FE61">
             <wp:extent cx="6120130" cy="2490470"/>
@@ -13954,6 +13982,9 @@
     </w:p>
     <w:p>
       <w:r>
+        <w:rPr>
+          <w:noProof/>
+        </w:rPr>
         <w:drawing>
           <wp:inline distT="0" distB="0" distL="0" distR="0" wp14:anchorId="4A324109" wp14:editId="1F004072">
             <wp:extent cx="6120130" cy="2546350"/>
@@ -14005,6 +14036,9 @@
     </w:p>
     <w:p>
       <w:r>
+        <w:rPr>
+          <w:noProof/>
+        </w:rPr>
         <w:drawing>
           <wp:inline distT="0" distB="0" distL="0" distR="0" wp14:anchorId="16C74E94" wp14:editId="266F9644">
             <wp:extent cx="6120130" cy="2560320"/>
@@ -14044,6 +14078,9 @@
     </w:p>
     <w:p>
       <w:r>
+        <w:rPr>
+          <w:noProof/>
+        </w:rPr>
         <w:drawing>
           <wp:inline distT="0" distB="0" distL="0" distR="0" wp14:anchorId="4FF28181" wp14:editId="7D086664">
             <wp:extent cx="6120130" cy="2393315"/>
@@ -14738,6 +14775,9 @@
         </w:rPr>
       </w:pPr>
       <w:r>
+        <w:rPr>
+          <w:noProof/>
+        </w:rPr>
         <w:drawing>
           <wp:inline distT="0" distB="0" distL="0" distR="0" wp14:anchorId="09A0596C" wp14:editId="00C1E4FF">
             <wp:extent cx="6120130" cy="2510155"/>
@@ -14783,6 +14823,7 @@
       </w:pPr>
       <w:r>
         <w:rPr>
+          <w:noProof/>
           <w:lang w:val="ru-RU"/>
         </w:rPr>
         <w:lastRenderedPageBreak/>
@@ -15178,6 +15219,7 @@
       </w:pPr>
       <w:r>
         <w:rPr>
+          <w:noProof/>
           <w:lang w:val="ru-RU"/>
         </w:rPr>
         <w:drawing>
@@ -15224,6 +15266,9 @@
     </w:p>
     <w:p>
       <w:r>
+        <w:rPr>
+          <w:noProof/>
+        </w:rPr>
         <w:drawing>
           <wp:inline distT="0" distB="0" distL="0" distR="0" wp14:anchorId="61ABD675" wp14:editId="3008A165">
             <wp:extent cx="6120130" cy="2510155"/>
@@ -15263,6 +15308,9 @@
     </w:p>
     <w:p>
       <w:r>
+        <w:rPr>
+          <w:noProof/>
+        </w:rPr>
         <w:lastRenderedPageBreak/>
         <w:drawing>
           <wp:inline distT="0" distB="0" distL="0" distR="0" wp14:anchorId="53615914" wp14:editId="1D7E6ECB">
@@ -15924,7 +15972,7 @@
 </file>
 
 <file path=word/endnotes.xml><?xml version="1.0" encoding="utf-8"?>
-<w:endnotes xmlns:wpc="http://schemas.microsoft.com/office/word/2010/wordprocessingCanvas" xmlns:cx="http://schemas.microsoft.com/office/drawing/2014/chartex" xmlns:cx1="http://schemas.microsoft.com/office/drawing/2015/9/8/chartex" xmlns:cx2="http://schemas.microsoft.com/office/drawing/2015/10/21/chartex" xmlns:cx3="http://schemas.microsoft.com/office/drawing/2016/5/9/chartex" xmlns:cx4="http://schemas.microsoft.com/office/drawing/2016/5/10/chartex" xmlns:cx5="http://schemas.microsoft.com/office/drawing/2016/5/11/chartex" xmlns:cx6="http://schemas.microsoft.com/office/drawing/2016/5/12/chartex" xmlns:cx7="http://schemas.microsoft.com/office/drawing/2016/5/13/chartex" xmlns:cx8="http://schemas.microsoft.com/office/drawing/2016/5/14/chartex" xmlns:mc="http://schemas.openxmlformats.org/markup-compatibility/2006" xmlns:aink="http://schemas.microsoft.com/office/drawing/2016/ink" xmlns:am3d="http://schemas.microsoft.com/office/drawing/2017/model3d" xmlns:o="urn:schemas-microsoft-com:office:office" xmlns:oel="http://schemas.microsoft.com/office/2019/extlst" xmlns:r="http://schemas.openxmlformats.org/officeDocument/2006/relationships" xmlns:m="http://schemas.openxmlformats.org/officeDocument/2006/math" xmlns:v="urn:schemas-microsoft-com:vml" xmlns:wp14="http://schemas.microsoft.com/office/word/2010/wordprocessingDrawing" xmlns:wp="http://schemas.openxmlformats.org/drawingml/2006/wordprocessingDrawing" xmlns:w10="urn:schemas-microsoft-com:office:word" xmlns:w="http://schemas.openxmlformats.org/wordprocessingml/2006/main" xmlns:w14="http://schemas.microsoft.com/office/word/2010/wordml" xmlns:w15="http://schemas.microsoft.com/office/word/2012/wordml" xmlns:w16cex="http://schemas.microsoft.com/office/word/2018/wordml/cex" xmlns:w16cid="http://schemas.microsoft.com/office/word/2016/wordml/cid" xmlns:w16="http://schemas.microsoft.com/office/word/2018/wordml" xmlns:w16sdtdh="http://schemas.microsoft.com/office/word/2020/wordml/sdtdatahash" xmlns:w16se="http://schemas.microsoft.com/office/word/2015/wordml/symex" xmlns:wpg="http://schemas.microsoft.com/office/word/2010/wordprocessingGroup" xmlns:wpi="http://schemas.microsoft.com/office/word/2010/wordprocessingInk" xmlns:wne="http://schemas.microsoft.com/office/word/2006/wordml" xmlns:wps="http://schemas.microsoft.com/office/word/2010/wordprocessingShape" mc:Ignorable="w14 w15 w16se w16cid w16 w16cex w16sdtdh wp14">
+<w:endnotes xmlns:wpc="http://schemas.microsoft.com/office/word/2010/wordprocessingCanvas" xmlns:cx="http://schemas.microsoft.com/office/drawing/2014/chartex" xmlns:cx1="http://schemas.microsoft.com/office/drawing/2015/9/8/chartex" xmlns:cx2="http://schemas.microsoft.com/office/drawing/2015/10/21/chartex" xmlns:cx3="http://schemas.microsoft.com/office/drawing/2016/5/9/chartex" xmlns:cx4="http://schemas.microsoft.com/office/drawing/2016/5/10/chartex" xmlns:cx5="http://schemas.microsoft.com/office/drawing/2016/5/11/chartex" xmlns:cx6="http://schemas.microsoft.com/office/drawing/2016/5/12/chartex" xmlns:cx7="http://schemas.microsoft.com/office/drawing/2016/5/13/chartex" xmlns:cx8="http://schemas.microsoft.com/office/drawing/2016/5/14/chartex" xmlns:mc="http://schemas.openxmlformats.org/markup-compatibility/2006" xmlns:aink="http://schemas.microsoft.com/office/drawing/2016/ink" xmlns:am3d="http://schemas.microsoft.com/office/drawing/2017/model3d" xmlns:o="urn:schemas-microsoft-com:office:office" xmlns:r="http://schemas.openxmlformats.org/officeDocument/2006/relationships" xmlns:m="http://schemas.openxmlformats.org/officeDocument/2006/math" xmlns:v="urn:schemas-microsoft-com:vml" xmlns:wp14="http://schemas.microsoft.com/office/word/2010/wordprocessingDrawing" xmlns:wp="http://schemas.openxmlformats.org/drawingml/2006/wordprocessingDrawing" xmlns:w10="urn:schemas-microsoft-com:office:word" xmlns:w="http://schemas.openxmlformats.org/wordprocessingml/2006/main" xmlns:w14="http://schemas.microsoft.com/office/word/2010/wordml" xmlns:w15="http://schemas.microsoft.com/office/word/2012/wordml" xmlns:w16cex="http://schemas.microsoft.com/office/word/2018/wordml/cex" xmlns:w16cid="http://schemas.microsoft.com/office/word/2016/wordml/cid" xmlns:w16="http://schemas.microsoft.com/office/word/2018/wordml" xmlns:w16sdtdh="http://schemas.microsoft.com/office/word/2020/wordml/sdtdatahash" xmlns:w16se="http://schemas.microsoft.com/office/word/2015/wordml/symex" xmlns:wpg="http://schemas.microsoft.com/office/word/2010/wordprocessingGroup" xmlns:wpi="http://schemas.microsoft.com/office/word/2010/wordprocessingInk" xmlns:wne="http://schemas.microsoft.com/office/word/2006/wordml" xmlns:wps="http://schemas.microsoft.com/office/word/2010/wordprocessingShape" mc:Ignorable="w14 w15 w16se w16cid w16 w16cex w16sdtdh wp14">
   <w:endnote w:type="separator" w:id="-1">
     <w:p>
       <w:pPr>
@@ -15949,7 +15997,7 @@
 </file>
 
 <file path=word/footnotes.xml><?xml version="1.0" encoding="utf-8"?>
-<w:footnotes xmlns:wpc="http://schemas.microsoft.com/office/word/2010/wordprocessingCanvas" xmlns:cx="http://schemas.microsoft.com/office/drawing/2014/chartex" xmlns:cx1="http://schemas.microsoft.com/office/drawing/2015/9/8/chartex" xmlns:cx2="http://schemas.microsoft.com/office/drawing/2015/10/21/chartex" xmlns:cx3="http://schemas.microsoft.com/office/drawing/2016/5/9/chartex" xmlns:cx4="http://schemas.microsoft.com/office/drawing/2016/5/10/chartex" xmlns:cx5="http://schemas.microsoft.com/office/drawing/2016/5/11/chartex" xmlns:cx6="http://schemas.microsoft.com/office/drawing/2016/5/12/chartex" xmlns:cx7="http://schemas.microsoft.com/office/drawing/2016/5/13/chartex" xmlns:cx8="http://schemas.microsoft.com/office/drawing/2016/5/14/chartex" xmlns:mc="http://schemas.openxmlformats.org/markup-compatibility/2006" xmlns:aink="http://schemas.microsoft.com/office/drawing/2016/ink" xmlns:am3d="http://schemas.microsoft.com/office/drawing/2017/model3d" xmlns:o="urn:schemas-microsoft-com:office:office" xmlns:oel="http://schemas.microsoft.com/office/2019/extlst" xmlns:r="http://schemas.openxmlformats.org/officeDocument/2006/relationships" xmlns:m="http://schemas.openxmlformats.org/officeDocument/2006/math" xmlns:v="urn:schemas-microsoft-com:vml" xmlns:wp14="http://schemas.microsoft.com/office/word/2010/wordprocessingDrawing" xmlns:wp="http://schemas.openxmlformats.org/drawingml/2006/wordprocessingDrawing" xmlns:w10="urn:schemas-microsoft-com:office:word" xmlns:w="http://schemas.openxmlformats.org/wordprocessingml/2006/main" xmlns:w14="http://schemas.microsoft.com/office/word/2010/wordml" xmlns:w15="http://schemas.microsoft.com/office/word/2012/wordml" xmlns:w16cex="http://schemas.microsoft.com/office/word/2018/wordml/cex" xmlns:w16cid="http://schemas.microsoft.com/office/word/2016/wordml/cid" xmlns:w16="http://schemas.microsoft.com/office/word/2018/wordml" xmlns:w16sdtdh="http://schemas.microsoft.com/office/word/2020/wordml/sdtdatahash" xmlns:w16se="http://schemas.microsoft.com/office/word/2015/wordml/symex" xmlns:wpg="http://schemas.microsoft.com/office/word/2010/wordprocessingGroup" xmlns:wpi="http://schemas.microsoft.com/office/word/2010/wordprocessingInk" xmlns:wne="http://schemas.microsoft.com/office/word/2006/wordml" xmlns:wps="http://schemas.microsoft.com/office/word/2010/wordprocessingShape" mc:Ignorable="w14 w15 w16se w16cid w16 w16cex w16sdtdh wp14">
+<w:footnotes xmlns:wpc="http://schemas.microsoft.com/office/word/2010/wordprocessingCanvas" xmlns:cx="http://schemas.microsoft.com/office/drawing/2014/chartex" xmlns:cx1="http://schemas.microsoft.com/office/drawing/2015/9/8/chartex" xmlns:cx2="http://schemas.microsoft.com/office/drawing/2015/10/21/chartex" xmlns:cx3="http://schemas.microsoft.com/office/drawing/2016/5/9/chartex" xmlns:cx4="http://schemas.microsoft.com/office/drawing/2016/5/10/chartex" xmlns:cx5="http://schemas.microsoft.com/office/drawing/2016/5/11/chartex" xmlns:cx6="http://schemas.microsoft.com/office/drawing/2016/5/12/chartex" xmlns:cx7="http://schemas.microsoft.com/office/drawing/2016/5/13/chartex" xmlns:cx8="http://schemas.microsoft.com/office/drawing/2016/5/14/chartex" xmlns:mc="http://schemas.openxmlformats.org/markup-compatibility/2006" xmlns:aink="http://schemas.microsoft.com/office/drawing/2016/ink" xmlns:am3d="http://schemas.microsoft.com/office/drawing/2017/model3d" xmlns:o="urn:schemas-microsoft-com:office:office" xmlns:r="http://schemas.openxmlformats.org/officeDocument/2006/relationships" xmlns:m="http://schemas.openxmlformats.org/officeDocument/2006/math" xmlns:v="urn:schemas-microsoft-com:vml" xmlns:wp14="http://schemas.microsoft.com/office/word/2010/wordprocessingDrawing" xmlns:wp="http://schemas.openxmlformats.org/drawingml/2006/wordprocessingDrawing" xmlns:w10="urn:schemas-microsoft-com:office:word" xmlns:w="http://schemas.openxmlformats.org/wordprocessingml/2006/main" xmlns:w14="http://schemas.microsoft.com/office/word/2010/wordml" xmlns:w15="http://schemas.microsoft.com/office/word/2012/wordml" xmlns:w16cex="http://schemas.microsoft.com/office/word/2018/wordml/cex" xmlns:w16cid="http://schemas.microsoft.com/office/word/2016/wordml/cid" xmlns:w16="http://schemas.microsoft.com/office/word/2018/wordml" xmlns:w16sdtdh="http://schemas.microsoft.com/office/word/2020/wordml/sdtdatahash" xmlns:w16se="http://schemas.microsoft.com/office/word/2015/wordml/symex" xmlns:wpg="http://schemas.microsoft.com/office/word/2010/wordprocessingGroup" xmlns:wpi="http://schemas.microsoft.com/office/word/2010/wordprocessingInk" xmlns:wne="http://schemas.microsoft.com/office/word/2006/wordml" xmlns:wps="http://schemas.microsoft.com/office/word/2010/wordprocessingShape" mc:Ignorable="w14 w15 w16se w16cid w16 w16cex w16sdtdh wp14">
   <w:footnote w:type="separator" w:id="-1">
     <w:p>
       <w:pPr>
@@ -15974,7 +16022,7 @@
 </file>
 
 <file path=word/numbering.xml><?xml version="1.0" encoding="utf-8"?>
-<w:numbering xmlns:wpc="http://schemas.microsoft.com/office/word/2010/wordprocessingCanvas" xmlns:cx="http://schemas.microsoft.com/office/drawing/2014/chartex" xmlns:cx1="http://schemas.microsoft.com/office/drawing/2015/9/8/chartex" xmlns:cx2="http://schemas.microsoft.com/office/drawing/2015/10/21/chartex" xmlns:cx3="http://schemas.microsoft.com/office/drawing/2016/5/9/chartex" xmlns:cx4="http://schemas.microsoft.com/office/drawing/2016/5/10/chartex" xmlns:cx5="http://schemas.microsoft.com/office/drawing/2016/5/11/chartex" xmlns:cx6="http://schemas.microsoft.com/office/drawing/2016/5/12/chartex" xmlns:cx7="http://schemas.microsoft.com/office/drawing/2016/5/13/chartex" xmlns:cx8="http://schemas.microsoft.com/office/drawing/2016/5/14/chartex" xmlns:mc="http://schemas.openxmlformats.org/markup-compatibility/2006" xmlns:aink="http://schemas.microsoft.com/office/drawing/2016/ink" xmlns:am3d="http://schemas.microsoft.com/office/drawing/2017/model3d" xmlns:o="urn:schemas-microsoft-com:office:office" xmlns:oel="http://schemas.microsoft.com/office/2019/extlst" xmlns:r="http://schemas.openxmlformats.org/officeDocument/2006/relationships" xmlns:m="http://schemas.openxmlformats.org/officeDocument/2006/math" xmlns:v="urn:schemas-microsoft-com:vml" xmlns:wp14="http://schemas.microsoft.com/office/word/2010/wordprocessingDrawing" xmlns:wp="http://schemas.openxmlformats.org/drawingml/2006/wordprocessingDrawing" xmlns:w10="urn:schemas-microsoft-com:office:word" xmlns:w="http://schemas.openxmlformats.org/wordprocessingml/2006/main" xmlns:w14="http://schemas.microsoft.com/office/word/2010/wordml" xmlns:w15="http://schemas.microsoft.com/office/word/2012/wordml" xmlns:w16cex="http://schemas.microsoft.com/office/word/2018/wordml/cex" xmlns:w16cid="http://schemas.microsoft.com/office/word/2016/wordml/cid" xmlns:w16="http://schemas.microsoft.com/office/word/2018/wordml" xmlns:w16sdtdh="http://schemas.microsoft.com/office/word/2020/wordml/sdtdatahash" xmlns:w16se="http://schemas.microsoft.com/office/word/2015/wordml/symex" xmlns:wpg="http://schemas.microsoft.com/office/word/2010/wordprocessingGroup" xmlns:wpi="http://schemas.microsoft.com/office/word/2010/wordprocessingInk" xmlns:wne="http://schemas.microsoft.com/office/word/2006/wordml" xmlns:wps="http://schemas.microsoft.com/office/word/2010/wordprocessingShape" mc:Ignorable="w14 w15 w16se w16cid w16 w16cex w16sdtdh wp14">
+<w:numbering xmlns:wpc="http://schemas.microsoft.com/office/word/2010/wordprocessingCanvas" xmlns:cx="http://schemas.microsoft.com/office/drawing/2014/chartex" xmlns:cx1="http://schemas.microsoft.com/office/drawing/2015/9/8/chartex" xmlns:cx2="http://schemas.microsoft.com/office/drawing/2015/10/21/chartex" xmlns:cx3="http://schemas.microsoft.com/office/drawing/2016/5/9/chartex" xmlns:cx4="http://schemas.microsoft.com/office/drawing/2016/5/10/chartex" xmlns:cx5="http://schemas.microsoft.com/office/drawing/2016/5/11/chartex" xmlns:cx6="http://schemas.microsoft.com/office/drawing/2016/5/12/chartex" xmlns:cx7="http://schemas.microsoft.com/office/drawing/2016/5/13/chartex" xmlns:cx8="http://schemas.microsoft.com/office/drawing/2016/5/14/chartex" xmlns:mc="http://schemas.openxmlformats.org/markup-compatibility/2006" xmlns:aink="http://schemas.microsoft.com/office/drawing/2016/ink" xmlns:am3d="http://schemas.microsoft.com/office/drawing/2017/model3d" xmlns:o="urn:schemas-microsoft-com:office:office" xmlns:r="http://schemas.openxmlformats.org/officeDocument/2006/relationships" xmlns:m="http://schemas.openxmlformats.org/officeDocument/2006/math" xmlns:v="urn:schemas-microsoft-com:vml" xmlns:wp14="http://schemas.microsoft.com/office/word/2010/wordprocessingDrawing" xmlns:wp="http://schemas.openxmlformats.org/drawingml/2006/wordprocessingDrawing" xmlns:w10="urn:schemas-microsoft-com:office:word" xmlns:w="http://schemas.openxmlformats.org/wordprocessingml/2006/main" xmlns:w14="http://schemas.microsoft.com/office/word/2010/wordml" xmlns:w15="http://schemas.microsoft.com/office/word/2012/wordml" xmlns:w16cex="http://schemas.microsoft.com/office/word/2018/wordml/cex" xmlns:w16cid="http://schemas.microsoft.com/office/word/2016/wordml/cid" xmlns:w16="http://schemas.microsoft.com/office/word/2018/wordml" xmlns:w16sdtdh="http://schemas.microsoft.com/office/word/2020/wordml/sdtdatahash" xmlns:w16se="http://schemas.microsoft.com/office/word/2015/wordml/symex" xmlns:wpg="http://schemas.microsoft.com/office/word/2010/wordprocessingGroup" xmlns:wpi="http://schemas.microsoft.com/office/word/2010/wordprocessingInk" xmlns:wne="http://schemas.microsoft.com/office/word/2006/wordml" xmlns:wps="http://schemas.microsoft.com/office/word/2010/wordprocessingShape" mc:Ignorable="w14 w15 w16se w16cid w16 w16cex w16sdtdh wp14">
   <w:abstractNum w:abstractNumId="0" w15:restartNumberingAfterBreak="0">
     <w:nsid w:val="00380597"/>
     <w:multiLevelType w:val="hybridMultilevel"/>
@@ -20617,115 +20665,115 @@
       </w:rPr>
     </w:lvl>
   </w:abstractNum>
-  <w:num w:numId="1" w16cid:durableId="1370649420">
+  <w:num w:numId="1">
     <w:abstractNumId w:val="35"/>
   </w:num>
-  <w:num w:numId="2" w16cid:durableId="1468468338">
+  <w:num w:numId="2">
     <w:abstractNumId w:val="32"/>
   </w:num>
-  <w:num w:numId="3" w16cid:durableId="892161195">
+  <w:num w:numId="3">
     <w:abstractNumId w:val="27"/>
   </w:num>
-  <w:num w:numId="4" w16cid:durableId="71633267">
+  <w:num w:numId="4">
     <w:abstractNumId w:val="29"/>
   </w:num>
-  <w:num w:numId="5" w16cid:durableId="1461266186">
+  <w:num w:numId="5">
     <w:abstractNumId w:val="19"/>
   </w:num>
-  <w:num w:numId="6" w16cid:durableId="932058023">
+  <w:num w:numId="6">
     <w:abstractNumId w:val="22"/>
   </w:num>
-  <w:num w:numId="7" w16cid:durableId="765081955">
+  <w:num w:numId="7">
     <w:abstractNumId w:val="26"/>
   </w:num>
-  <w:num w:numId="8" w16cid:durableId="1384479789">
+  <w:num w:numId="8">
     <w:abstractNumId w:val="3"/>
   </w:num>
-  <w:num w:numId="9" w16cid:durableId="1736317952">
+  <w:num w:numId="9">
     <w:abstractNumId w:val="20"/>
   </w:num>
-  <w:num w:numId="10" w16cid:durableId="1854877845">
+  <w:num w:numId="10">
     <w:abstractNumId w:val="16"/>
   </w:num>
-  <w:num w:numId="11" w16cid:durableId="1302223281">
+  <w:num w:numId="11">
     <w:abstractNumId w:val="1"/>
   </w:num>
-  <w:num w:numId="12" w16cid:durableId="662005879">
+  <w:num w:numId="12">
     <w:abstractNumId w:val="14"/>
   </w:num>
-  <w:num w:numId="13" w16cid:durableId="1524203035">
+  <w:num w:numId="13">
     <w:abstractNumId w:val="6"/>
   </w:num>
-  <w:num w:numId="14" w16cid:durableId="1219516294">
+  <w:num w:numId="14">
     <w:abstractNumId w:val="31"/>
   </w:num>
-  <w:num w:numId="15" w16cid:durableId="570894611">
+  <w:num w:numId="15">
     <w:abstractNumId w:val="8"/>
   </w:num>
-  <w:num w:numId="16" w16cid:durableId="1162115943">
+  <w:num w:numId="16">
     <w:abstractNumId w:val="25"/>
   </w:num>
-  <w:num w:numId="17" w16cid:durableId="294988150">
+  <w:num w:numId="17">
     <w:abstractNumId w:val="36"/>
   </w:num>
-  <w:num w:numId="18" w16cid:durableId="929238260">
+  <w:num w:numId="18">
     <w:abstractNumId w:val="5"/>
   </w:num>
-  <w:num w:numId="19" w16cid:durableId="890264277">
+  <w:num w:numId="19">
     <w:abstractNumId w:val="2"/>
   </w:num>
-  <w:num w:numId="20" w16cid:durableId="26225609">
+  <w:num w:numId="20">
     <w:abstractNumId w:val="30"/>
   </w:num>
-  <w:num w:numId="21" w16cid:durableId="1466701245">
+  <w:num w:numId="21">
     <w:abstractNumId w:val="11"/>
   </w:num>
-  <w:num w:numId="22" w16cid:durableId="217864048">
+  <w:num w:numId="22">
     <w:abstractNumId w:val="23"/>
   </w:num>
-  <w:num w:numId="23" w16cid:durableId="967273312">
+  <w:num w:numId="23">
     <w:abstractNumId w:val="28"/>
   </w:num>
-  <w:num w:numId="24" w16cid:durableId="279186022">
+  <w:num w:numId="24">
     <w:abstractNumId w:val="0"/>
   </w:num>
-  <w:num w:numId="25" w16cid:durableId="1613706618">
+  <w:num w:numId="25">
     <w:abstractNumId w:val="4"/>
   </w:num>
-  <w:num w:numId="26" w16cid:durableId="56243272">
+  <w:num w:numId="26">
     <w:abstractNumId w:val="33"/>
   </w:num>
-  <w:num w:numId="27" w16cid:durableId="1650792572">
+  <w:num w:numId="27">
     <w:abstractNumId w:val="21"/>
   </w:num>
-  <w:num w:numId="28" w16cid:durableId="1745879224">
+  <w:num w:numId="28">
     <w:abstractNumId w:val="9"/>
   </w:num>
-  <w:num w:numId="29" w16cid:durableId="626283236">
+  <w:num w:numId="29">
     <w:abstractNumId w:val="15"/>
   </w:num>
-  <w:num w:numId="30" w16cid:durableId="316346903">
+  <w:num w:numId="30">
     <w:abstractNumId w:val="13"/>
   </w:num>
-  <w:num w:numId="31" w16cid:durableId="680201416">
+  <w:num w:numId="31">
     <w:abstractNumId w:val="17"/>
   </w:num>
-  <w:num w:numId="32" w16cid:durableId="1442266462">
+  <w:num w:numId="32">
     <w:abstractNumId w:val="10"/>
   </w:num>
-  <w:num w:numId="33" w16cid:durableId="1493253067">
+  <w:num w:numId="33">
     <w:abstractNumId w:val="18"/>
   </w:num>
-  <w:num w:numId="34" w16cid:durableId="127280850">
+  <w:num w:numId="34">
     <w:abstractNumId w:val="12"/>
   </w:num>
-  <w:num w:numId="35" w16cid:durableId="847254425">
+  <w:num w:numId="35">
     <w:abstractNumId w:val="24"/>
   </w:num>
-  <w:num w:numId="36" w16cid:durableId="1595163898">
+  <w:num w:numId="36">
     <w:abstractNumId w:val="34"/>
   </w:num>
-  <w:num w:numId="37" w16cid:durableId="2092774872">
+  <w:num w:numId="37">
     <w:abstractNumId w:val="7"/>
   </w:num>
   <w:numIdMacAtCleanup w:val="17"/>
@@ -21211,6 +21259,7 @@
   <w:style w:type="character" w:default="1" w:styleId="a0">
     <w:name w:val="Default Paragraph Font"/>
     <w:uiPriority w:val="1"/>
+    <w:semiHidden/>
     <w:unhideWhenUsed/>
   </w:style>
   <w:style w:type="table" w:default="1" w:styleId="a1">

</xml_diff>